<commit_message>
Actualización de infome de trabajo XDATA y DCL
</commit_message>
<xml_diff>
--- a/AutoCAD/DatosExtendidos/InformeDatosExtendidos.docx
+++ b/AutoCAD/DatosExtendidos/InformeDatosExtendidos.docx
@@ -1,6 +1,6 @@
 
 <file path=word/document.xml><?xml version="1.0" encoding="utf-8"?>
-<w:document xmlns:wpc="http://schemas.microsoft.com/office/word/2010/wordprocessingCanvas" xmlns:cx="http://schemas.microsoft.com/office/drawing/2014/chartex" xmlns:cx1="http://schemas.microsoft.com/office/drawing/2015/9/8/chartex" xmlns:cx2="http://schemas.microsoft.com/office/drawing/2015/10/21/chartex" xmlns:cx3="http://schemas.microsoft.com/office/drawing/2016/5/9/chartex" xmlns:cx4="http://schemas.microsoft.com/office/drawing/2016/5/10/chartex" xmlns:cx5="http://schemas.microsoft.com/office/drawing/2016/5/11/chartex" xmlns:cx6="http://schemas.microsoft.com/office/drawing/2016/5/12/chartex" xmlns:cx7="http://schemas.microsoft.com/office/drawing/2016/5/13/chartex" xmlns:cx8="http://schemas.microsoft.com/office/drawing/2016/5/14/chartex" xmlns:mc="http://schemas.openxmlformats.org/markup-compatibility/2006" xmlns:aink="http://schemas.microsoft.com/office/drawing/2016/ink" xmlns:am3d="http://schemas.microsoft.com/office/drawing/2017/model3d" xmlns:o="urn:schemas-microsoft-com:office:office" xmlns:oel="http://schemas.microsoft.com/office/2019/extlst" xmlns:r="http://schemas.openxmlformats.org/officeDocument/2006/relationships" xmlns:m="http://schemas.openxmlformats.org/officeDocument/2006/math" xmlns:v="urn:schemas-microsoft-com:vml" xmlns:wp14="http://schemas.microsoft.com/office/word/2010/wordprocessingDrawing" xmlns:wp="http://schemas.openxmlformats.org/drawingml/2006/wordprocessingDrawing" xmlns:w10="urn:schemas-microsoft-com:office:word" xmlns:w="http://schemas.openxmlformats.org/wordprocessingml/2006/main" xmlns:w14="http://schemas.microsoft.com/office/word/2010/wordml" xmlns:w15="http://schemas.microsoft.com/office/word/2012/wordml" xmlns:w16cex="http://schemas.microsoft.com/office/word/2018/wordml/cex" xmlns:w16cid="http://schemas.microsoft.com/office/word/2016/wordml/cid" xmlns:w16="http://schemas.microsoft.com/office/word/2018/wordml" xmlns:w16du="http://schemas.microsoft.com/office/word/2023/wordml/word16du" xmlns:w16sdtdh="http://schemas.microsoft.com/office/word/2020/wordml/sdtdatahash" xmlns:w16se="http://schemas.microsoft.com/office/word/2015/wordml/symex" xmlns:wpg="http://schemas.microsoft.com/office/word/2010/wordprocessingGroup" xmlns:wpi="http://schemas.microsoft.com/office/word/2010/wordprocessingInk" xmlns:wne="http://schemas.microsoft.com/office/word/2006/wordml" xmlns:wps="http://schemas.microsoft.com/office/word/2010/wordprocessingShape" mc:Ignorable="w14 w15 w16se w16cid w16 w16cex w16sdtdh w16du wp14">
+<w:document xmlns:wpc="http://schemas.microsoft.com/office/word/2010/wordprocessingCanvas" xmlns:cx="http://schemas.microsoft.com/office/drawing/2014/chartex" xmlns:cx1="http://schemas.microsoft.com/office/drawing/2015/9/8/chartex" xmlns:cx2="http://schemas.microsoft.com/office/drawing/2015/10/21/chartex" xmlns:cx3="http://schemas.microsoft.com/office/drawing/2016/5/9/chartex" xmlns:cx4="http://schemas.microsoft.com/office/drawing/2016/5/10/chartex" xmlns:cx5="http://schemas.microsoft.com/office/drawing/2016/5/11/chartex" xmlns:cx6="http://schemas.microsoft.com/office/drawing/2016/5/12/chartex" xmlns:cx7="http://schemas.microsoft.com/office/drawing/2016/5/13/chartex" xmlns:cx8="http://schemas.microsoft.com/office/drawing/2016/5/14/chartex" xmlns:mc="http://schemas.openxmlformats.org/markup-compatibility/2006" xmlns:aink="http://schemas.microsoft.com/office/drawing/2016/ink" xmlns:am3d="http://schemas.microsoft.com/office/drawing/2017/model3d" xmlns:o="urn:schemas-microsoft-com:office:office" xmlns:r="http://schemas.openxmlformats.org/officeDocument/2006/relationships" xmlns:m="http://schemas.openxmlformats.org/officeDocument/2006/math" xmlns:v="urn:schemas-microsoft-com:vml" xmlns:wp14="http://schemas.microsoft.com/office/word/2010/wordprocessingDrawing" xmlns:wp="http://schemas.openxmlformats.org/drawingml/2006/wordprocessingDrawing" xmlns:w10="urn:schemas-microsoft-com:office:word" xmlns:w="http://schemas.openxmlformats.org/wordprocessingml/2006/main" xmlns:w14="http://schemas.microsoft.com/office/word/2010/wordml" xmlns:w15="http://schemas.microsoft.com/office/word/2012/wordml" xmlns:w16cex="http://schemas.microsoft.com/office/word/2018/wordml/cex" xmlns:w16cid="http://schemas.microsoft.com/office/word/2016/wordml/cid" xmlns:w16="http://schemas.microsoft.com/office/word/2018/wordml" xmlns:w16sdtdh="http://schemas.microsoft.com/office/word/2020/wordml/sdtdatahash" xmlns:w16se="http://schemas.microsoft.com/office/word/2015/wordml/symex" xmlns:wpg="http://schemas.microsoft.com/office/word/2010/wordprocessingGroup" xmlns:wpi="http://schemas.microsoft.com/office/word/2010/wordprocessingInk" xmlns:wne="http://schemas.microsoft.com/office/word/2006/wordml" xmlns:wps="http://schemas.microsoft.com/office/word/2010/wordprocessingShape" mc:Ignorable="w14 w15 w16se w16cid w16 w16cex w16sdtdh wp14">
   <w:body>
     <w:p>
       <w:pPr>
@@ -297,10 +297,12 @@
           <w:sz w:val="28"/>
           <w:szCs w:val="28"/>
         </w:rPr>
-        <w:t xml:space="preserve">Alejandro </w:t>
-      </w:r>
-      <w:proofErr w:type="spellStart"/>
-      <w:r>
+        <w:t>Alejandro Jimenez Zabala</w:t>
+      </w:r>
+    </w:p>
+    <w:p>
+      <w:pPr>
+        <w:jc w:val="center"/>
         <w:rPr>
           <w:rFonts w:ascii="Times New Roman" w:hAnsi="Times New Roman" w:cs="Times New Roman"/>
           <w:b/>
@@ -308,10 +310,11 @@
           <w:sz w:val="28"/>
           <w:szCs w:val="28"/>
         </w:rPr>
-        <w:t>Jimenez</w:t>
-      </w:r>
-      <w:proofErr w:type="spellEnd"/>
-      <w:r>
+      </w:pPr>
+    </w:p>
+    <w:p>
+      <w:pPr>
+        <w:jc w:val="center"/>
         <w:rPr>
           <w:rFonts w:ascii="Times New Roman" w:hAnsi="Times New Roman" w:cs="Times New Roman"/>
           <w:b/>
@@ -319,8 +322,7 @@
           <w:sz w:val="28"/>
           <w:szCs w:val="28"/>
         </w:rPr>
-        <w:t xml:space="preserve"> Zabala</w:t>
-      </w:r>
+      </w:pPr>
     </w:p>
     <w:p>
       <w:pPr>
@@ -333,10 +335,7 @@
           <w:szCs w:val="28"/>
         </w:rPr>
       </w:pPr>
-    </w:p>
-    <w:p>
-      <w:pPr>
-        <w:jc w:val="center"/>
+      <w:r>
         <w:rPr>
           <w:rFonts w:ascii="Times New Roman" w:hAnsi="Times New Roman" w:cs="Times New Roman"/>
           <w:b/>
@@ -344,7 +343,8 @@
           <w:sz w:val="28"/>
           <w:szCs w:val="28"/>
         </w:rPr>
-      </w:pPr>
+        <w:t>Asignatura: Computación gráfica</w:t>
+      </w:r>
     </w:p>
     <w:p>
       <w:pPr>
@@ -365,12 +365,10 @@
           <w:sz w:val="28"/>
           <w:szCs w:val="28"/>
         </w:rPr>
-        <w:t>Asignatura: Computación gráfica</w:t>
-      </w:r>
-    </w:p>
-    <w:p>
-      <w:pPr>
-        <w:jc w:val="center"/>
+        <w:t xml:space="preserve">Docente: Miguel </w:t>
+      </w:r>
+      <w:proofErr w:type="spellStart"/>
+      <w:r>
         <w:rPr>
           <w:rFonts w:ascii="Times New Roman" w:hAnsi="Times New Roman" w:cs="Times New Roman"/>
           <w:b/>
@@ -378,7 +376,9 @@
           <w:sz w:val="28"/>
           <w:szCs w:val="28"/>
         </w:rPr>
-      </w:pPr>
+        <w:t>Angel</w:t>
+      </w:r>
+      <w:proofErr w:type="spellEnd"/>
       <w:r>
         <w:rPr>
           <w:rFonts w:ascii="Times New Roman" w:hAnsi="Times New Roman" w:cs="Times New Roman"/>
@@ -387,10 +387,11 @@
           <w:sz w:val="28"/>
           <w:szCs w:val="28"/>
         </w:rPr>
-        <w:t xml:space="preserve">Docente: Miguel </w:t>
-      </w:r>
-      <w:proofErr w:type="spellStart"/>
-      <w:r>
+        <w:t xml:space="preserve"> Baquero Cortes</w:t>
+      </w:r>
+    </w:p>
+    <w:p>
+      <w:pPr>
         <w:rPr>
           <w:rFonts w:ascii="Times New Roman" w:hAnsi="Times New Roman" w:cs="Times New Roman"/>
           <w:b/>
@@ -398,10 +399,11 @@
           <w:sz w:val="28"/>
           <w:szCs w:val="28"/>
         </w:rPr>
-        <w:t>Angel</w:t>
-      </w:r>
-      <w:proofErr w:type="spellEnd"/>
-      <w:r>
+      </w:pPr>
+    </w:p>
+    <w:p>
+      <w:pPr>
+        <w:jc w:val="center"/>
         <w:rPr>
           <w:rFonts w:ascii="Times New Roman" w:hAnsi="Times New Roman" w:cs="Times New Roman"/>
           <w:b/>
@@ -409,11 +411,11 @@
           <w:sz w:val="28"/>
           <w:szCs w:val="28"/>
         </w:rPr>
-        <w:t xml:space="preserve"> Baquero Cortes</w:t>
-      </w:r>
-    </w:p>
-    <w:p>
-      <w:pPr>
+      </w:pPr>
+    </w:p>
+    <w:p>
+      <w:pPr>
+        <w:jc w:val="center"/>
         <w:rPr>
           <w:rFonts w:ascii="Times New Roman" w:hAnsi="Times New Roman" w:cs="Times New Roman"/>
           <w:b/>
@@ -422,10 +424,7 @@
           <w:szCs w:val="28"/>
         </w:rPr>
       </w:pPr>
-    </w:p>
-    <w:p>
-      <w:pPr>
-        <w:jc w:val="center"/>
+      <w:r>
         <w:rPr>
           <w:rFonts w:ascii="Times New Roman" w:hAnsi="Times New Roman" w:cs="Times New Roman"/>
           <w:b/>
@@ -433,7 +432,8 @@
           <w:sz w:val="28"/>
           <w:szCs w:val="28"/>
         </w:rPr>
-      </w:pPr>
+        <w:t>Bogotá D.C.</w:t>
+      </w:r>
     </w:p>
     <w:p>
       <w:pPr>
@@ -454,35 +454,19 @@
           <w:sz w:val="28"/>
           <w:szCs w:val="28"/>
         </w:rPr>
-        <w:t>Bogotá D.C.</w:t>
-      </w:r>
-    </w:p>
-    <w:p>
-      <w:pPr>
-        <w:jc w:val="center"/>
-        <w:rPr>
-          <w:rFonts w:ascii="Times New Roman" w:hAnsi="Times New Roman" w:cs="Times New Roman"/>
-          <w:b/>
-          <w:bCs/>
-          <w:sz w:val="28"/>
-          <w:szCs w:val="28"/>
-        </w:rPr>
-      </w:pPr>
-      <w:r>
-        <w:rPr>
-          <w:rFonts w:ascii="Times New Roman" w:hAnsi="Times New Roman" w:cs="Times New Roman"/>
-          <w:b/>
-          <w:bCs/>
-          <w:sz w:val="28"/>
-          <w:szCs w:val="28"/>
-        </w:rPr>
         <w:t>2026-1</w:t>
       </w:r>
     </w:p>
     <w:sdt>
       <w:sdtPr>
         <w:rPr>
-          <w:lang w:val="es-ES"/>
+          <w:rFonts w:asciiTheme="minorHAnsi" w:eastAsiaTheme="minorHAnsi" w:hAnsiTheme="minorHAnsi" w:cstheme="minorBidi"/>
+          <w:color w:val="auto"/>
+          <w:kern w:val="2"/>
+          <w:sz w:val="22"/>
+          <w:szCs w:val="22"/>
+          <w:lang w:val="es-ES" w:eastAsia="en-US"/>
+          <w14:ligatures w14:val="standardContextual"/>
         </w:rPr>
         <w:id w:val="628743159"/>
         <w:docPartObj>
@@ -492,15 +476,8 @@
       </w:sdtPr>
       <w:sdtEndPr>
         <w:rPr>
-          <w:rFonts w:asciiTheme="minorHAnsi" w:eastAsiaTheme="minorHAnsi" w:hAnsiTheme="minorHAnsi" w:cstheme="minorBidi"/>
           <w:b/>
           <w:bCs/>
-          <w:color w:val="auto"/>
-          <w:kern w:val="2"/>
-          <w:sz w:val="22"/>
-          <w:szCs w:val="22"/>
-          <w:lang w:eastAsia="en-US"/>
-          <w14:ligatures w14:val="standardContextual"/>
         </w:rPr>
       </w:sdtEndPr>
       <w:sdtContent>
@@ -524,7 +501,9 @@
             <w:rPr>
               <w:rFonts w:eastAsiaTheme="minorEastAsia"/>
               <w:noProof/>
-              <w:lang w:eastAsia="es-CO"/>
+              <w:kern w:val="0"/>
+              <w:lang w:val="en-US"/>
+              <w14:ligatures w14:val="none"/>
             </w:rPr>
           </w:pPr>
           <w:r>
@@ -536,7 +515,7 @@
           <w:r>
             <w:fldChar w:fldCharType="separate"/>
           </w:r>
-          <w:hyperlink w:anchor="_Toc230345661" w:history="1">
+          <w:hyperlink w:anchor="_Toc230609817" w:history="1">
             <w:r>
               <w:rPr>
                 <w:rStyle w:val="Hipervnculo"/>
@@ -564,7 +543,7 @@
                 <w:noProof/>
                 <w:webHidden/>
               </w:rPr>
-              <w:instrText xml:space="preserve"> PAGEREF _Toc230345661 \h </w:instrText>
+              <w:instrText xml:space="preserve"> PAGEREF _Toc230609817 \h </w:instrText>
             </w:r>
             <w:r>
               <w:rPr>
@@ -604,17 +583,19 @@
             <w:rPr>
               <w:rFonts w:eastAsiaTheme="minorEastAsia"/>
               <w:noProof/>
-              <w:lang w:eastAsia="es-CO"/>
+              <w:kern w:val="0"/>
+              <w:lang w:val="en-US"/>
+              <w14:ligatures w14:val="none"/>
             </w:rPr>
           </w:pPr>
-          <w:hyperlink w:anchor="_Toc230345662" w:history="1">
+          <w:hyperlink w:anchor="_Toc230609818" w:history="1">
             <w:r>
               <w:rPr>
                 <w:rStyle w:val="Hipervnculo"/>
                 <w:noProof/>
                 <w:lang w:val="es-US"/>
               </w:rPr>
-              <w:t>Desarrollo de los datos extendidos</w:t>
+              <w:t>Creación de espacio de trabajo</w:t>
             </w:r>
             <w:r>
               <w:rPr>
@@ -635,7 +616,7 @@
                 <w:noProof/>
                 <w:webHidden/>
               </w:rPr>
-              <w:instrText xml:space="preserve"> PAGEREF _Toc230345662 \h </w:instrText>
+              <w:instrText xml:space="preserve"> PAGEREF _Toc230609818 \h </w:instrText>
             </w:r>
             <w:r>
               <w:rPr>
@@ -675,17 +656,19 @@
             <w:rPr>
               <w:rFonts w:eastAsiaTheme="minorEastAsia"/>
               <w:noProof/>
-              <w:lang w:eastAsia="es-CO"/>
+              <w:kern w:val="0"/>
+              <w:lang w:val="en-US"/>
+              <w14:ligatures w14:val="none"/>
             </w:rPr>
           </w:pPr>
-          <w:hyperlink w:anchor="_Toc230345663" w:history="1">
+          <w:hyperlink w:anchor="_Toc230609819" w:history="1">
             <w:r>
               <w:rPr>
                 <w:rStyle w:val="Hipervnculo"/>
                 <w:noProof/>
                 <w:lang w:val="es-US"/>
               </w:rPr>
-              <w:t>Desarrollo de la caja de dialogo</w:t>
+              <w:t>Desarrollo de los datos extendidos</w:t>
             </w:r>
             <w:r>
               <w:rPr>
@@ -706,7 +689,7 @@
                 <w:noProof/>
                 <w:webHidden/>
               </w:rPr>
-              <w:instrText xml:space="preserve"> PAGEREF _Toc230345663 \h </w:instrText>
+              <w:instrText xml:space="preserve"> PAGEREF _Toc230609819 \h </w:instrText>
             </w:r>
             <w:r>
               <w:rPr>
@@ -727,6 +710,152 @@
                 <w:webHidden/>
               </w:rPr>
               <w:t>5</w:t>
+            </w:r>
+            <w:r>
+              <w:rPr>
+                <w:noProof/>
+                <w:webHidden/>
+              </w:rPr>
+              <w:fldChar w:fldCharType="end"/>
+            </w:r>
+          </w:hyperlink>
+        </w:p>
+        <w:p>
+          <w:pPr>
+            <w:pStyle w:val="TDC2"/>
+            <w:tabs>
+              <w:tab w:val="right" w:leader="dot" w:pos="8828"/>
+            </w:tabs>
+            <w:rPr>
+              <w:rFonts w:eastAsiaTheme="minorEastAsia"/>
+              <w:noProof/>
+              <w:kern w:val="0"/>
+              <w:lang w:val="en-US"/>
+              <w14:ligatures w14:val="none"/>
+            </w:rPr>
+          </w:pPr>
+          <w:hyperlink w:anchor="_Toc230609820" w:history="1">
+            <w:r>
+              <w:rPr>
+                <w:rStyle w:val="Hipervnculo"/>
+                <w:noProof/>
+                <w:lang w:val="es-US"/>
+              </w:rPr>
+              <w:t>Comando directo</w:t>
+            </w:r>
+            <w:r>
+              <w:rPr>
+                <w:noProof/>
+                <w:webHidden/>
+              </w:rPr>
+              <w:tab/>
+            </w:r>
+            <w:r>
+              <w:rPr>
+                <w:noProof/>
+                <w:webHidden/>
+              </w:rPr>
+              <w:fldChar w:fldCharType="begin"/>
+            </w:r>
+            <w:r>
+              <w:rPr>
+                <w:noProof/>
+                <w:webHidden/>
+              </w:rPr>
+              <w:instrText xml:space="preserve"> PAGEREF _Toc230609820 \h </w:instrText>
+            </w:r>
+            <w:r>
+              <w:rPr>
+                <w:noProof/>
+                <w:webHidden/>
+              </w:rPr>
+            </w:r>
+            <w:r>
+              <w:rPr>
+                <w:noProof/>
+                <w:webHidden/>
+              </w:rPr>
+              <w:fldChar w:fldCharType="separate"/>
+            </w:r>
+            <w:r>
+              <w:rPr>
+                <w:noProof/>
+                <w:webHidden/>
+              </w:rPr>
+              <w:t>5</w:t>
+            </w:r>
+            <w:r>
+              <w:rPr>
+                <w:noProof/>
+                <w:webHidden/>
+              </w:rPr>
+              <w:fldChar w:fldCharType="end"/>
+            </w:r>
+          </w:hyperlink>
+        </w:p>
+        <w:p>
+          <w:pPr>
+            <w:pStyle w:val="TDC2"/>
+            <w:tabs>
+              <w:tab w:val="right" w:leader="dot" w:pos="8828"/>
+            </w:tabs>
+            <w:rPr>
+              <w:rFonts w:eastAsiaTheme="minorEastAsia"/>
+              <w:noProof/>
+              <w:kern w:val="0"/>
+              <w:lang w:val="en-US"/>
+              <w14:ligatures w14:val="none"/>
+            </w:rPr>
+          </w:pPr>
+          <w:hyperlink w:anchor="_Toc230609821" w:history="1">
+            <w:r>
+              <w:rPr>
+                <w:rStyle w:val="Hipervnculo"/>
+                <w:noProof/>
+                <w:lang w:val="es-US"/>
+              </w:rPr>
+              <w:t>Botón de datos extendidos en barra de herramientas</w:t>
+            </w:r>
+            <w:r>
+              <w:rPr>
+                <w:noProof/>
+                <w:webHidden/>
+              </w:rPr>
+              <w:tab/>
+            </w:r>
+            <w:r>
+              <w:rPr>
+                <w:noProof/>
+                <w:webHidden/>
+              </w:rPr>
+              <w:fldChar w:fldCharType="begin"/>
+            </w:r>
+            <w:r>
+              <w:rPr>
+                <w:noProof/>
+                <w:webHidden/>
+              </w:rPr>
+              <w:instrText xml:space="preserve"> PAGEREF _Toc230609821 \h </w:instrText>
+            </w:r>
+            <w:r>
+              <w:rPr>
+                <w:noProof/>
+                <w:webHidden/>
+              </w:rPr>
+            </w:r>
+            <w:r>
+              <w:rPr>
+                <w:noProof/>
+                <w:webHidden/>
+              </w:rPr>
+              <w:fldChar w:fldCharType="separate"/>
+            </w:r>
+            <w:r>
+              <w:rPr>
+                <w:noProof/>
+                <w:webHidden/>
+              </w:rPr>
+              <w:t>7</w:t>
             </w:r>
             <w:r>
               <w:rPr>
@@ -746,17 +875,19 @@
             <w:rPr>
               <w:rFonts w:eastAsiaTheme="minorEastAsia"/>
               <w:noProof/>
-              <w:lang w:eastAsia="es-CO"/>
+              <w:kern w:val="0"/>
+              <w:lang w:val="en-US"/>
+              <w14:ligatures w14:val="none"/>
             </w:rPr>
           </w:pPr>
-          <w:hyperlink w:anchor="_Toc230345664" w:history="1">
+          <w:hyperlink w:anchor="_Toc230609822" w:history="1">
             <w:r>
               <w:rPr>
                 <w:rStyle w:val="Hipervnculo"/>
                 <w:noProof/>
                 <w:lang w:val="es-US"/>
               </w:rPr>
-              <w:t>Ejecución del programa</w:t>
+              <w:t>Desarrollo de la caja de dialogo</w:t>
             </w:r>
             <w:r>
               <w:rPr>
@@ -777,7 +908,7 @@
                 <w:noProof/>
                 <w:webHidden/>
               </w:rPr>
-              <w:instrText xml:space="preserve"> PAGEREF _Toc230345664 \h </w:instrText>
+              <w:instrText xml:space="preserve"> PAGEREF _Toc230609822 \h </w:instrText>
             </w:r>
             <w:r>
               <w:rPr>
@@ -797,7 +928,80 @@
                 <w:noProof/>
                 <w:webHidden/>
               </w:rPr>
-              <w:t>6</w:t>
+              <w:t>8</w:t>
+            </w:r>
+            <w:r>
+              <w:rPr>
+                <w:noProof/>
+                <w:webHidden/>
+              </w:rPr>
+              <w:fldChar w:fldCharType="end"/>
+            </w:r>
+          </w:hyperlink>
+        </w:p>
+        <w:p>
+          <w:pPr>
+            <w:pStyle w:val="TDC2"/>
+            <w:tabs>
+              <w:tab w:val="right" w:leader="dot" w:pos="8828"/>
+            </w:tabs>
+            <w:rPr>
+              <w:rFonts w:eastAsiaTheme="minorEastAsia"/>
+              <w:noProof/>
+              <w:kern w:val="0"/>
+              <w:lang w:val="en-US"/>
+              <w14:ligatures w14:val="none"/>
+            </w:rPr>
+          </w:pPr>
+          <w:hyperlink w:anchor="_Toc230609823" w:history="1">
+            <w:r>
+              <w:rPr>
+                <w:rStyle w:val="Hipervnculo"/>
+                <w:noProof/>
+                <w:lang w:val="es-US"/>
+              </w:rPr>
+              <w:t>Código DCL</w:t>
+            </w:r>
+            <w:r>
+              <w:rPr>
+                <w:noProof/>
+                <w:webHidden/>
+              </w:rPr>
+              <w:tab/>
+            </w:r>
+            <w:r>
+              <w:rPr>
+                <w:noProof/>
+                <w:webHidden/>
+              </w:rPr>
+              <w:fldChar w:fldCharType="begin"/>
+            </w:r>
+            <w:r>
+              <w:rPr>
+                <w:noProof/>
+                <w:webHidden/>
+              </w:rPr>
+              <w:instrText xml:space="preserve"> PAGEREF _Toc230609823 \h </w:instrText>
+            </w:r>
+            <w:r>
+              <w:rPr>
+                <w:noProof/>
+                <w:webHidden/>
+              </w:rPr>
+            </w:r>
+            <w:r>
+              <w:rPr>
+                <w:noProof/>
+                <w:webHidden/>
+              </w:rPr>
+              <w:fldChar w:fldCharType="separate"/>
+            </w:r>
+            <w:r>
+              <w:rPr>
+                <w:noProof/>
+                <w:webHidden/>
+              </w:rPr>
+              <w:t>8</w:t>
             </w:r>
             <w:r>
               <w:rPr>
@@ -817,17 +1021,19 @@
             <w:rPr>
               <w:rFonts w:eastAsiaTheme="minorEastAsia"/>
               <w:noProof/>
-              <w:lang w:eastAsia="es-CO"/>
+              <w:kern w:val="0"/>
+              <w:lang w:val="en-US"/>
+              <w14:ligatures w14:val="none"/>
             </w:rPr>
           </w:pPr>
-          <w:hyperlink w:anchor="_Toc230345665" w:history="1">
+          <w:hyperlink w:anchor="_Toc230609824" w:history="1">
             <w:r>
               <w:rPr>
                 <w:rStyle w:val="Hipervnculo"/>
                 <w:noProof/>
                 <w:lang w:val="es-US"/>
               </w:rPr>
-              <w:t>Muestra y análisis de resultados</w:t>
+              <w:t>Desarrollo de código LISP</w:t>
             </w:r>
             <w:r>
               <w:rPr>
@@ -848,7 +1054,7 @@
                 <w:noProof/>
                 <w:webHidden/>
               </w:rPr>
-              <w:instrText xml:space="preserve"> PAGEREF _Toc230345665 \h </w:instrText>
+              <w:instrText xml:space="preserve"> PAGEREF _Toc230609824 \h </w:instrText>
             </w:r>
             <w:r>
               <w:rPr>
@@ -868,7 +1074,226 @@
                 <w:noProof/>
                 <w:webHidden/>
               </w:rPr>
-              <w:t>7</w:t>
+              <w:t>10</w:t>
+            </w:r>
+            <w:r>
+              <w:rPr>
+                <w:noProof/>
+                <w:webHidden/>
+              </w:rPr>
+              <w:fldChar w:fldCharType="end"/>
+            </w:r>
+          </w:hyperlink>
+        </w:p>
+        <w:p>
+          <w:pPr>
+            <w:pStyle w:val="TDC2"/>
+            <w:tabs>
+              <w:tab w:val="right" w:leader="dot" w:pos="8828"/>
+            </w:tabs>
+            <w:rPr>
+              <w:rFonts w:eastAsiaTheme="minorEastAsia"/>
+              <w:noProof/>
+              <w:kern w:val="0"/>
+              <w:lang w:val="en-US"/>
+              <w14:ligatures w14:val="none"/>
+            </w:rPr>
+          </w:pPr>
+          <w:hyperlink w:anchor="_Toc230609825" w:history="1">
+            <w:r>
+              <w:rPr>
+                <w:rStyle w:val="Hipervnculo"/>
+                <w:noProof/>
+                <w:lang w:val="es-US"/>
+              </w:rPr>
+              <w:t>Función auxiliar</w:t>
+            </w:r>
+            <w:r>
+              <w:rPr>
+                <w:noProof/>
+                <w:webHidden/>
+              </w:rPr>
+              <w:tab/>
+            </w:r>
+            <w:r>
+              <w:rPr>
+                <w:noProof/>
+                <w:webHidden/>
+              </w:rPr>
+              <w:fldChar w:fldCharType="begin"/>
+            </w:r>
+            <w:r>
+              <w:rPr>
+                <w:noProof/>
+                <w:webHidden/>
+              </w:rPr>
+              <w:instrText xml:space="preserve"> PAGEREF _Toc230609825 \h </w:instrText>
+            </w:r>
+            <w:r>
+              <w:rPr>
+                <w:noProof/>
+                <w:webHidden/>
+              </w:rPr>
+            </w:r>
+            <w:r>
+              <w:rPr>
+                <w:noProof/>
+                <w:webHidden/>
+              </w:rPr>
+              <w:fldChar w:fldCharType="separate"/>
+            </w:r>
+            <w:r>
+              <w:rPr>
+                <w:noProof/>
+                <w:webHidden/>
+              </w:rPr>
+              <w:t>10</w:t>
+            </w:r>
+            <w:r>
+              <w:rPr>
+                <w:noProof/>
+                <w:webHidden/>
+              </w:rPr>
+              <w:fldChar w:fldCharType="end"/>
+            </w:r>
+          </w:hyperlink>
+        </w:p>
+        <w:p>
+          <w:pPr>
+            <w:pStyle w:val="TDC2"/>
+            <w:tabs>
+              <w:tab w:val="right" w:leader="dot" w:pos="8828"/>
+            </w:tabs>
+            <w:rPr>
+              <w:rFonts w:eastAsiaTheme="minorEastAsia"/>
+              <w:noProof/>
+              <w:kern w:val="0"/>
+              <w:lang w:val="en-US"/>
+              <w14:ligatures w14:val="none"/>
+            </w:rPr>
+          </w:pPr>
+          <w:hyperlink w:anchor="_Toc230609826" w:history="1">
+            <w:r>
+              <w:rPr>
+                <w:rStyle w:val="Hipervnculo"/>
+                <w:noProof/>
+                <w:lang w:val="es-US"/>
+              </w:rPr>
+              <w:t>Editar datos</w:t>
+            </w:r>
+            <w:r>
+              <w:rPr>
+                <w:noProof/>
+                <w:webHidden/>
+              </w:rPr>
+              <w:tab/>
+            </w:r>
+            <w:r>
+              <w:rPr>
+                <w:noProof/>
+                <w:webHidden/>
+              </w:rPr>
+              <w:fldChar w:fldCharType="begin"/>
+            </w:r>
+            <w:r>
+              <w:rPr>
+                <w:noProof/>
+                <w:webHidden/>
+              </w:rPr>
+              <w:instrText xml:space="preserve"> PAGEREF _Toc230609826 \h </w:instrText>
+            </w:r>
+            <w:r>
+              <w:rPr>
+                <w:noProof/>
+                <w:webHidden/>
+              </w:rPr>
+            </w:r>
+            <w:r>
+              <w:rPr>
+                <w:noProof/>
+                <w:webHidden/>
+              </w:rPr>
+              <w:fldChar w:fldCharType="separate"/>
+            </w:r>
+            <w:r>
+              <w:rPr>
+                <w:noProof/>
+                <w:webHidden/>
+              </w:rPr>
+              <w:t>10</w:t>
+            </w:r>
+            <w:r>
+              <w:rPr>
+                <w:noProof/>
+                <w:webHidden/>
+              </w:rPr>
+              <w:fldChar w:fldCharType="end"/>
+            </w:r>
+          </w:hyperlink>
+        </w:p>
+        <w:p>
+          <w:pPr>
+            <w:pStyle w:val="TDC2"/>
+            <w:tabs>
+              <w:tab w:val="right" w:leader="dot" w:pos="8828"/>
+            </w:tabs>
+            <w:rPr>
+              <w:rFonts w:eastAsiaTheme="minorEastAsia"/>
+              <w:noProof/>
+              <w:kern w:val="0"/>
+              <w:lang w:val="en-US"/>
+              <w14:ligatures w14:val="none"/>
+            </w:rPr>
+          </w:pPr>
+          <w:hyperlink w:anchor="_Toc230609827" w:history="1">
+            <w:r>
+              <w:rPr>
+                <w:rStyle w:val="Hipervnculo"/>
+                <w:noProof/>
+                <w:lang w:val="es-US"/>
+              </w:rPr>
+              <w:t>Calcular consumo</w:t>
+            </w:r>
+            <w:r>
+              <w:rPr>
+                <w:noProof/>
+                <w:webHidden/>
+              </w:rPr>
+              <w:tab/>
+            </w:r>
+            <w:r>
+              <w:rPr>
+                <w:noProof/>
+                <w:webHidden/>
+              </w:rPr>
+              <w:fldChar w:fldCharType="begin"/>
+            </w:r>
+            <w:r>
+              <w:rPr>
+                <w:noProof/>
+                <w:webHidden/>
+              </w:rPr>
+              <w:instrText xml:space="preserve"> PAGEREF _Toc230609827 \h </w:instrText>
+            </w:r>
+            <w:r>
+              <w:rPr>
+                <w:noProof/>
+                <w:webHidden/>
+              </w:rPr>
+            </w:r>
+            <w:r>
+              <w:rPr>
+                <w:noProof/>
+                <w:webHidden/>
+              </w:rPr>
+              <w:fldChar w:fldCharType="separate"/>
+            </w:r>
+            <w:r>
+              <w:rPr>
+                <w:noProof/>
+                <w:webHidden/>
+              </w:rPr>
+              <w:t>10</w:t>
             </w:r>
             <w:r>
               <w:rPr>
@@ -888,17 +1313,19 @@
             <w:rPr>
               <w:rFonts w:eastAsiaTheme="minorEastAsia"/>
               <w:noProof/>
-              <w:lang w:eastAsia="es-CO"/>
+              <w:kern w:val="0"/>
+              <w:lang w:val="en-US"/>
+              <w14:ligatures w14:val="none"/>
             </w:rPr>
           </w:pPr>
-          <w:hyperlink w:anchor="_Toc230345666" w:history="1">
+          <w:hyperlink w:anchor="_Toc230609828" w:history="1">
             <w:r>
               <w:rPr>
                 <w:rStyle w:val="Hipervnculo"/>
                 <w:noProof/>
                 <w:lang w:val="es-US"/>
               </w:rPr>
-              <w:t>Conclusiones</w:t>
+              <w:t>Ejecución del programa</w:t>
             </w:r>
             <w:r>
               <w:rPr>
@@ -919,7 +1346,7 @@
                 <w:noProof/>
                 <w:webHidden/>
               </w:rPr>
-              <w:instrText xml:space="preserve"> PAGEREF _Toc230345666 \h </w:instrText>
+              <w:instrText xml:space="preserve"> PAGEREF _Toc230609828 \h </w:instrText>
             </w:r>
             <w:r>
               <w:rPr>
@@ -939,7 +1366,7 @@
                 <w:noProof/>
                 <w:webHidden/>
               </w:rPr>
-              <w:t>8</w:t>
+              <w:t>11</w:t>
             </w:r>
             <w:r>
               <w:rPr>
@@ -959,16 +1386,164 @@
             <w:rPr>
               <w:rFonts w:eastAsiaTheme="minorEastAsia"/>
               <w:noProof/>
-              <w:lang w:eastAsia="es-CO"/>
+              <w:kern w:val="0"/>
+              <w:lang w:val="en-US"/>
+              <w14:ligatures w14:val="none"/>
             </w:rPr>
           </w:pPr>
-          <w:hyperlink w:anchor="_Toc230345667" w:history="1">
+          <w:hyperlink w:anchor="_Toc230609829" w:history="1">
             <w:r>
               <w:rPr>
                 <w:rStyle w:val="Hipervnculo"/>
                 <w:noProof/>
                 <w:lang w:val="es-US"/>
               </w:rPr>
+              <w:t>Muestra y análisis de resultados</w:t>
+            </w:r>
+            <w:r>
+              <w:rPr>
+                <w:noProof/>
+                <w:webHidden/>
+              </w:rPr>
+              <w:tab/>
+            </w:r>
+            <w:r>
+              <w:rPr>
+                <w:noProof/>
+                <w:webHidden/>
+              </w:rPr>
+              <w:fldChar w:fldCharType="begin"/>
+            </w:r>
+            <w:r>
+              <w:rPr>
+                <w:noProof/>
+                <w:webHidden/>
+              </w:rPr>
+              <w:instrText xml:space="preserve"> PAGEREF _Toc230609829 \h </w:instrText>
+            </w:r>
+            <w:r>
+              <w:rPr>
+                <w:noProof/>
+                <w:webHidden/>
+              </w:rPr>
+            </w:r>
+            <w:r>
+              <w:rPr>
+                <w:noProof/>
+                <w:webHidden/>
+              </w:rPr>
+              <w:fldChar w:fldCharType="separate"/>
+            </w:r>
+            <w:r>
+              <w:rPr>
+                <w:noProof/>
+                <w:webHidden/>
+              </w:rPr>
+              <w:t>12</w:t>
+            </w:r>
+            <w:r>
+              <w:rPr>
+                <w:noProof/>
+                <w:webHidden/>
+              </w:rPr>
+              <w:fldChar w:fldCharType="end"/>
+            </w:r>
+          </w:hyperlink>
+        </w:p>
+        <w:p>
+          <w:pPr>
+            <w:pStyle w:val="TDC1"/>
+            <w:tabs>
+              <w:tab w:val="right" w:leader="dot" w:pos="8828"/>
+            </w:tabs>
+            <w:rPr>
+              <w:rFonts w:eastAsiaTheme="minorEastAsia"/>
+              <w:noProof/>
+              <w:kern w:val="0"/>
+              <w:lang w:val="en-US"/>
+              <w14:ligatures w14:val="none"/>
+            </w:rPr>
+          </w:pPr>
+          <w:hyperlink w:anchor="_Toc230609830" w:history="1">
+            <w:r>
+              <w:rPr>
+                <w:rStyle w:val="Hipervnculo"/>
+                <w:noProof/>
+                <w:lang w:val="es-US"/>
+              </w:rPr>
+              <w:t>Conclusiones</w:t>
+            </w:r>
+            <w:r>
+              <w:rPr>
+                <w:noProof/>
+                <w:webHidden/>
+              </w:rPr>
+              <w:tab/>
+            </w:r>
+            <w:r>
+              <w:rPr>
+                <w:noProof/>
+                <w:webHidden/>
+              </w:rPr>
+              <w:fldChar w:fldCharType="begin"/>
+            </w:r>
+            <w:r>
+              <w:rPr>
+                <w:noProof/>
+                <w:webHidden/>
+              </w:rPr>
+              <w:instrText xml:space="preserve"> PAGEREF _Toc230609830 \h </w:instrText>
+            </w:r>
+            <w:r>
+              <w:rPr>
+                <w:noProof/>
+                <w:webHidden/>
+              </w:rPr>
+            </w:r>
+            <w:r>
+              <w:rPr>
+                <w:noProof/>
+                <w:webHidden/>
+              </w:rPr>
+              <w:fldChar w:fldCharType="separate"/>
+            </w:r>
+            <w:r>
+              <w:rPr>
+                <w:noProof/>
+                <w:webHidden/>
+              </w:rPr>
+              <w:t>13</w:t>
+            </w:r>
+            <w:r>
+              <w:rPr>
+                <w:noProof/>
+                <w:webHidden/>
+              </w:rPr>
+              <w:fldChar w:fldCharType="end"/>
+            </w:r>
+          </w:hyperlink>
+        </w:p>
+        <w:p>
+          <w:pPr>
+            <w:pStyle w:val="TDC1"/>
+            <w:tabs>
+              <w:tab w:val="right" w:leader="dot" w:pos="8828"/>
+            </w:tabs>
+            <w:rPr>
+              <w:rFonts w:eastAsiaTheme="minorEastAsia"/>
+              <w:noProof/>
+              <w:kern w:val="0"/>
+              <w:lang w:val="en-US"/>
+              <w14:ligatures w14:val="none"/>
+            </w:rPr>
+          </w:pPr>
+          <w:hyperlink w:anchor="_Toc230609831" w:history="1">
+            <w:r>
+              <w:rPr>
+                <w:rStyle w:val="Hipervnculo"/>
+                <w:noProof/>
+                <w:lang w:val="es-US"/>
+              </w:rPr>
               <w:t>Bibliografía</w:t>
             </w:r>
             <w:r>
@@ -990,7 +1565,7 @@
                 <w:noProof/>
                 <w:webHidden/>
               </w:rPr>
-              <w:instrText xml:space="preserve"> PAGEREF _Toc230345667 \h </w:instrText>
+              <w:instrText xml:space="preserve"> PAGEREF _Toc230609831 \h </w:instrText>
             </w:r>
             <w:r>
               <w:rPr>
@@ -1010,7 +1585,7 @@
                 <w:noProof/>
                 <w:webHidden/>
               </w:rPr>
-              <w:t>9</w:t>
+              <w:t>14</w:t>
             </w:r>
             <w:r>
               <w:rPr>
@@ -1060,7 +1635,7 @@
           <w:lang w:val="es-US"/>
         </w:rPr>
       </w:pPr>
-      <w:bookmarkStart w:id="0" w:name="_Toc230345661"/>
+      <w:bookmarkStart w:id="0" w:name="_Toc230609817"/>
       <w:r>
         <w:rPr>
           <w:lang w:val="es-US"/>
@@ -1236,6 +1811,7 @@
           <w:lang w:val="es-US"/>
         </w:rPr>
       </w:pPr>
+      <w:bookmarkStart w:id="1" w:name="_Toc230609818"/>
       <w:r>
         <w:rPr>
           <w:lang w:val="es-US"/>
@@ -1243,6 +1819,7 @@
         <w:lastRenderedPageBreak/>
         <w:t>Creación de espacio de trabajo</w:t>
       </w:r>
+      <w:bookmarkEnd w:id="1"/>
     </w:p>
     <w:p>
       <w:pPr>
@@ -1266,6 +1843,7 @@
       </w:pPr>
       <w:r>
         <w:rPr>
+          <w:noProof/>
           <w:lang w:val="es-US"/>
         </w:rPr>
         <w:drawing>
@@ -1366,6 +1944,7 @@
       </w:pPr>
       <w:r>
         <w:rPr>
+          <w:noProof/>
           <w:lang w:val="es-US"/>
         </w:rPr>
         <w:drawing>
@@ -1412,7 +1991,7 @@
           <w:lang w:val="es-US"/>
         </w:rPr>
       </w:pPr>
-      <w:bookmarkStart w:id="1" w:name="_Toc230345662"/>
+      <w:bookmarkStart w:id="2" w:name="_Toc230609819"/>
       <w:r>
         <w:rPr>
           <w:lang w:val="es-US"/>
@@ -1420,7 +1999,7 @@
         <w:lastRenderedPageBreak/>
         <w:t>Desarrollo de los datos extendidos</w:t>
       </w:r>
-      <w:bookmarkEnd w:id="1"/>
+      <w:bookmarkEnd w:id="2"/>
     </w:p>
     <w:p>
       <w:pPr>
@@ -1448,12 +2027,14 @@
           <w:lang w:val="es-US"/>
         </w:rPr>
       </w:pPr>
+      <w:bookmarkStart w:id="3" w:name="_Toc230609820"/>
       <w:r>
         <w:rPr>
           <w:lang w:val="es-US"/>
         </w:rPr>
         <w:t>Comando directo</w:t>
       </w:r>
+      <w:bookmarkEnd w:id="3"/>
     </w:p>
     <w:p>
       <w:pPr>
@@ -1496,6 +2077,7 @@
       </w:pPr>
       <w:r>
         <w:rPr>
+          <w:noProof/>
           <w:lang w:val="es-US"/>
         </w:rPr>
         <w:drawing>
@@ -1590,6 +2172,7 @@
       </w:pPr>
       <w:r>
         <w:rPr>
+          <w:noProof/>
           <w:lang w:val="es-US"/>
         </w:rPr>
         <w:drawing>
@@ -1657,6 +2240,7 @@
       </w:pPr>
       <w:r>
         <w:rPr>
+          <w:noProof/>
           <w:lang w:val="es-US"/>
         </w:rPr>
         <w:drawing>
@@ -1724,6 +2308,7 @@
       </w:pPr>
       <w:r>
         <w:rPr>
+          <w:noProof/>
           <w:lang w:val="es-US"/>
         </w:rPr>
         <w:lastRenderedPageBreak/>
@@ -1834,6 +2419,7 @@
       </w:pPr>
       <w:r>
         <w:rPr>
+          <w:noProof/>
           <w:lang w:val="es-US"/>
         </w:rPr>
         <w:drawing>
@@ -1895,6 +2481,7 @@
       </w:pPr>
       <w:r>
         <w:rPr>
+          <w:noProof/>
           <w:lang w:val="es-US"/>
         </w:rPr>
         <w:drawing>
@@ -1955,12 +2542,14 @@
           <w:lang w:val="es-US"/>
         </w:rPr>
       </w:pPr>
+      <w:bookmarkStart w:id="4" w:name="_Toc230609821"/>
       <w:r>
         <w:rPr>
           <w:lang w:val="es-US"/>
         </w:rPr>
         <w:t>Botón de datos extendidos en barra de herramientas</w:t>
       </w:r>
+      <w:bookmarkEnd w:id="4"/>
     </w:p>
     <w:p>
       <w:pPr>
@@ -1984,6 +2573,7 @@
       </w:pPr>
       <w:r>
         <w:rPr>
+          <w:noProof/>
           <w:lang w:val="es-US"/>
         </w:rPr>
         <w:drawing>
@@ -2125,7 +2715,7 @@
           <w:lang w:val="es-US"/>
         </w:rPr>
       </w:pPr>
-      <w:bookmarkStart w:id="2" w:name="_Toc230345663"/>
+      <w:bookmarkStart w:id="5" w:name="_Toc230609822"/>
       <w:r>
         <w:rPr>
           <w:lang w:val="es-US"/>
@@ -2133,7 +2723,7 @@
         <w:lastRenderedPageBreak/>
         <w:t>Desarrollo de la caja de dialogo</w:t>
       </w:r>
-      <w:bookmarkEnd w:id="2"/>
+      <w:bookmarkEnd w:id="5"/>
     </w:p>
     <w:p>
       <w:pPr>
@@ -2164,7 +2754,745 @@
         <w:rPr>
           <w:lang w:val="es-US"/>
         </w:rPr>
-        <w:t>Como primera medida creamos el cuadro de dialogo de forma que se muestren los datos del objeto (si tiene) y las opciones de crear nuevos datos o modificarlos. Quedo como se ve en la imagen:</w:t>
+        <w:t xml:space="preserve">Recurrimos a enlazar el uso de datos extendidos, con cuadros de diálogo, desarrollando un script en LISP que tomara la selección de un objeto, y con el apoyo de un cuadro de diálogo, se le diera un identificador al objeto, y un valor de consumo en vatios (W); lo que posteriormente será usado para calcular el consumo mensual de un apartamento; al guardar los valores definidos en el cuadro de diálogo, estos quedarían definidos como “STRINGS” </w:t>
+      </w:r>
+      <w:r>
+        <w:rPr>
+          <w:lang w:val="es-US"/>
+        </w:rPr>
+        <w:t>en los datos extendidos (XDATA) del objeto.</w:t>
+      </w:r>
+    </w:p>
+    <w:p>
+      <w:pPr>
+        <w:rPr>
+          <w:lang w:val="es-US"/>
+        </w:rPr>
+      </w:pPr>
+    </w:p>
+    <w:p>
+      <w:pPr>
+        <w:pStyle w:val="Ttulo2"/>
+        <w:rPr>
+          <w:lang w:val="es-US"/>
+        </w:rPr>
+      </w:pPr>
+      <w:bookmarkStart w:id="6" w:name="_Toc230609823"/>
+      <w:r>
+        <w:rPr>
+          <w:lang w:val="es-US"/>
+        </w:rPr>
+        <w:t>Código DCL</w:t>
+      </w:r>
+      <w:bookmarkEnd w:id="6"/>
+    </w:p>
+    <w:p>
+      <w:pPr>
+        <w:rPr>
+          <w:lang w:val="es-US"/>
+        </w:rPr>
+      </w:pPr>
+      <w:proofErr w:type="spellStart"/>
+      <w:r>
+        <w:rPr>
+          <w:lang w:val="es-US"/>
+        </w:rPr>
+        <w:t>gestion_</w:t>
+      </w:r>
+      <w:proofErr w:type="gramStart"/>
+      <w:r>
+        <w:rPr>
+          <w:lang w:val="es-US"/>
+        </w:rPr>
+        <w:t>datos</w:t>
+      </w:r>
+      <w:proofErr w:type="spellEnd"/>
+      <w:r>
+        <w:rPr>
+          <w:lang w:val="es-US"/>
+        </w:rPr>
+        <w:t xml:space="preserve"> :</w:t>
+      </w:r>
+      <w:proofErr w:type="gramEnd"/>
+      <w:r>
+        <w:rPr>
+          <w:lang w:val="es-US"/>
+        </w:rPr>
+        <w:t xml:space="preserve"> </w:t>
+      </w:r>
+      <w:proofErr w:type="spellStart"/>
+      <w:r>
+        <w:rPr>
+          <w:lang w:val="es-US"/>
+        </w:rPr>
+        <w:t>dialog</w:t>
+      </w:r>
+      <w:proofErr w:type="spellEnd"/>
+      <w:r>
+        <w:rPr>
+          <w:lang w:val="es-US"/>
+        </w:rPr>
+        <w:t xml:space="preserve"> {</w:t>
+      </w:r>
+    </w:p>
+    <w:p>
+      <w:pPr>
+        <w:rPr>
+          <w:lang w:val="es-US"/>
+        </w:rPr>
+      </w:pPr>
+      <w:r>
+        <w:rPr>
+          <w:lang w:val="es-US"/>
+        </w:rPr>
+        <w:t xml:space="preserve">  </w:t>
+      </w:r>
+      <w:proofErr w:type="spellStart"/>
+      <w:r>
+        <w:rPr>
+          <w:lang w:val="es-US"/>
+        </w:rPr>
+        <w:t>label</w:t>
+      </w:r>
+      <w:proofErr w:type="spellEnd"/>
+      <w:r>
+        <w:rPr>
+          <w:lang w:val="es-US"/>
+        </w:rPr>
+        <w:t xml:space="preserve"> = "Control de Activos - Datos Extendidos";</w:t>
+      </w:r>
+    </w:p>
+    <w:p>
+      <w:pPr>
+        <w:rPr>
+          <w:lang w:val="es-US"/>
+        </w:rPr>
+      </w:pPr>
+      <w:r>
+        <w:rPr>
+          <w:lang w:val="es-US"/>
+        </w:rPr>
+        <w:t xml:space="preserve">  </w:t>
+      </w:r>
+    </w:p>
+    <w:p>
+      <w:pPr>
+        <w:rPr>
+          <w:lang w:val="es-US"/>
+        </w:rPr>
+      </w:pPr>
+      <w:r>
+        <w:rPr>
+          <w:lang w:val="es-US"/>
+        </w:rPr>
+        <w:t xml:space="preserve">  // Contenedor principal</w:t>
+      </w:r>
+    </w:p>
+    <w:p>
+      <w:pPr>
+        <w:rPr>
+          <w:lang w:val="es-US"/>
+        </w:rPr>
+      </w:pPr>
+      <w:r>
+        <w:rPr>
+          <w:lang w:val="es-US"/>
+        </w:rPr>
+        <w:t xml:space="preserve">  : </w:t>
+      </w:r>
+      <w:proofErr w:type="spellStart"/>
+      <w:r>
+        <w:rPr>
+          <w:lang w:val="es-US"/>
+        </w:rPr>
+        <w:t>boxed_column</w:t>
+      </w:r>
+      <w:proofErr w:type="spellEnd"/>
+      <w:r>
+        <w:rPr>
+          <w:lang w:val="es-US"/>
+        </w:rPr>
+        <w:t xml:space="preserve"> {</w:t>
+      </w:r>
+    </w:p>
+    <w:p>
+      <w:pPr>
+        <w:rPr>
+          <w:lang w:val="es-US"/>
+        </w:rPr>
+      </w:pPr>
+      <w:r>
+        <w:rPr>
+          <w:lang w:val="es-US"/>
+        </w:rPr>
+        <w:t xml:space="preserve">    </w:t>
+      </w:r>
+      <w:proofErr w:type="spellStart"/>
+      <w:r>
+        <w:rPr>
+          <w:lang w:val="es-US"/>
+        </w:rPr>
+        <w:t>label</w:t>
+      </w:r>
+      <w:proofErr w:type="spellEnd"/>
+      <w:r>
+        <w:rPr>
+          <w:lang w:val="es-US"/>
+        </w:rPr>
+        <w:t xml:space="preserve"> = "</w:t>
+      </w:r>
+      <w:proofErr w:type="spellStart"/>
+      <w:r>
+        <w:rPr>
+          <w:lang w:val="es-US"/>
+        </w:rPr>
+        <w:t>Informacion</w:t>
+      </w:r>
+      <w:proofErr w:type="spellEnd"/>
+      <w:r>
+        <w:rPr>
+          <w:lang w:val="es-US"/>
+        </w:rPr>
+        <w:t xml:space="preserve"> del Objeto";</w:t>
+      </w:r>
+    </w:p>
+    <w:p>
+      <w:pPr>
+        <w:rPr>
+          <w:lang w:val="es-US"/>
+        </w:rPr>
+      </w:pPr>
+      <w:r>
+        <w:rPr>
+          <w:lang w:val="es-US"/>
+        </w:rPr>
+        <w:t xml:space="preserve">    </w:t>
+      </w:r>
+    </w:p>
+    <w:p>
+      <w:pPr>
+        <w:rPr>
+          <w:lang w:val="en-US"/>
+        </w:rPr>
+      </w:pPr>
+      <w:r>
+        <w:rPr>
+          <w:lang w:val="es-US"/>
+        </w:rPr>
+        <w:t xml:space="preserve">    </w:t>
+      </w:r>
+      <w:r>
+        <w:rPr>
+          <w:lang w:val="en-US"/>
+        </w:rPr>
+        <w:t xml:space="preserve">: </w:t>
+      </w:r>
+      <w:proofErr w:type="spellStart"/>
+      <w:r>
+        <w:rPr>
+          <w:lang w:val="en-US"/>
+        </w:rPr>
+        <w:t>edit_box</w:t>
+      </w:r>
+      <w:proofErr w:type="spellEnd"/>
+      <w:r>
+        <w:rPr>
+          <w:lang w:val="en-US"/>
+        </w:rPr>
+        <w:t xml:space="preserve"> { </w:t>
+      </w:r>
+    </w:p>
+    <w:p>
+      <w:pPr>
+        <w:rPr>
+          <w:lang w:val="en-US"/>
+        </w:rPr>
+      </w:pPr>
+      <w:r>
+        <w:rPr>
+          <w:lang w:val="en-US"/>
+        </w:rPr>
+        <w:t xml:space="preserve">      label = "ID </w:t>
+      </w:r>
+      <w:proofErr w:type="spellStart"/>
+      <w:r>
+        <w:rPr>
+          <w:lang w:val="en-US"/>
+        </w:rPr>
+        <w:t>Equipo</w:t>
+      </w:r>
+      <w:proofErr w:type="spellEnd"/>
+      <w:r>
+        <w:rPr>
+          <w:lang w:val="en-US"/>
+        </w:rPr>
+        <w:t xml:space="preserve">:"; </w:t>
+      </w:r>
+    </w:p>
+    <w:p>
+      <w:pPr>
+        <w:rPr>
+          <w:lang w:val="en-US"/>
+        </w:rPr>
+      </w:pPr>
+      <w:r>
+        <w:rPr>
+          <w:lang w:val="en-US"/>
+        </w:rPr>
+        <w:t xml:space="preserve">      key = "</w:t>
+      </w:r>
+      <w:proofErr w:type="spellStart"/>
+      <w:r>
+        <w:rPr>
+          <w:lang w:val="en-US"/>
+        </w:rPr>
+        <w:t>id_equipo</w:t>
+      </w:r>
+      <w:proofErr w:type="spellEnd"/>
+      <w:r>
+        <w:rPr>
+          <w:lang w:val="en-US"/>
+        </w:rPr>
+        <w:t xml:space="preserve">"; </w:t>
+      </w:r>
+    </w:p>
+    <w:p>
+      <w:pPr>
+        <w:rPr>
+          <w:lang w:val="en-US"/>
+        </w:rPr>
+      </w:pPr>
+      <w:r>
+        <w:rPr>
+          <w:lang w:val="en-US"/>
+        </w:rPr>
+        <w:t xml:space="preserve">      </w:t>
+      </w:r>
+      <w:proofErr w:type="spellStart"/>
+      <w:r>
+        <w:rPr>
+          <w:lang w:val="en-US"/>
+        </w:rPr>
+        <w:t>edit_width</w:t>
+      </w:r>
+      <w:proofErr w:type="spellEnd"/>
+      <w:r>
+        <w:rPr>
+          <w:lang w:val="en-US"/>
+        </w:rPr>
+        <w:t xml:space="preserve"> = 20; </w:t>
+      </w:r>
+    </w:p>
+    <w:p>
+      <w:pPr>
+        <w:rPr>
+          <w:lang w:val="en-US"/>
+        </w:rPr>
+      </w:pPr>
+      <w:r>
+        <w:rPr>
+          <w:lang w:val="en-US"/>
+        </w:rPr>
+        <w:t xml:space="preserve">    }</w:t>
+      </w:r>
+    </w:p>
+    <w:p>
+      <w:pPr>
+        <w:rPr>
+          <w:lang w:val="en-US"/>
+        </w:rPr>
+      </w:pPr>
+      <w:r>
+        <w:rPr>
+          <w:lang w:val="en-US"/>
+        </w:rPr>
+        <w:t xml:space="preserve">    </w:t>
+      </w:r>
+    </w:p>
+    <w:p>
+      <w:pPr>
+        <w:rPr>
+          <w:lang w:val="en-US"/>
+        </w:rPr>
+      </w:pPr>
+      <w:r>
+        <w:rPr>
+          <w:lang w:val="en-US"/>
+        </w:rPr>
+        <w:t xml:space="preserve">    : </w:t>
+      </w:r>
+      <w:proofErr w:type="spellStart"/>
+      <w:r>
+        <w:rPr>
+          <w:lang w:val="en-US"/>
+        </w:rPr>
+        <w:t>edit_box</w:t>
+      </w:r>
+      <w:proofErr w:type="spellEnd"/>
+      <w:r>
+        <w:rPr>
+          <w:lang w:val="en-US"/>
+        </w:rPr>
+        <w:t xml:space="preserve"> { </w:t>
+      </w:r>
+    </w:p>
+    <w:p>
+      <w:pPr>
+        <w:rPr>
+          <w:lang w:val="en-US"/>
+        </w:rPr>
+      </w:pPr>
+      <w:r>
+        <w:rPr>
+          <w:lang w:val="en-US"/>
+        </w:rPr>
+        <w:t xml:space="preserve">      label = "</w:t>
+      </w:r>
+      <w:proofErr w:type="spellStart"/>
+      <w:r>
+        <w:rPr>
+          <w:lang w:val="en-US"/>
+        </w:rPr>
+        <w:t>Potencia</w:t>
+      </w:r>
+      <w:proofErr w:type="spellEnd"/>
+      <w:r>
+        <w:rPr>
+          <w:lang w:val="en-US"/>
+        </w:rPr>
+        <w:t xml:space="preserve"> (W):"; </w:t>
+      </w:r>
+    </w:p>
+    <w:p>
+      <w:pPr>
+        <w:rPr>
+          <w:lang w:val="es-US"/>
+        </w:rPr>
+      </w:pPr>
+      <w:r>
+        <w:rPr>
+          <w:lang w:val="en-US"/>
+        </w:rPr>
+        <w:t xml:space="preserve">      </w:t>
+      </w:r>
+      <w:proofErr w:type="spellStart"/>
+      <w:r>
+        <w:rPr>
+          <w:lang w:val="es-US"/>
+        </w:rPr>
+        <w:t>key</w:t>
+      </w:r>
+      <w:proofErr w:type="spellEnd"/>
+      <w:r>
+        <w:rPr>
+          <w:lang w:val="es-US"/>
+        </w:rPr>
+        <w:t xml:space="preserve"> = "potencia"; </w:t>
+      </w:r>
+    </w:p>
+    <w:p>
+      <w:pPr>
+        <w:rPr>
+          <w:lang w:val="es-US"/>
+        </w:rPr>
+      </w:pPr>
+      <w:r>
+        <w:rPr>
+          <w:lang w:val="es-US"/>
+        </w:rPr>
+        <w:t xml:space="preserve">      </w:t>
+      </w:r>
+      <w:proofErr w:type="spellStart"/>
+      <w:r>
+        <w:rPr>
+          <w:lang w:val="es-US"/>
+        </w:rPr>
+        <w:t>edit_width</w:t>
+      </w:r>
+      <w:proofErr w:type="spellEnd"/>
+      <w:r>
+        <w:rPr>
+          <w:lang w:val="es-US"/>
+        </w:rPr>
+        <w:t xml:space="preserve"> = 20; </w:t>
+      </w:r>
+    </w:p>
+    <w:p>
+      <w:pPr>
+        <w:rPr>
+          <w:lang w:val="es-US"/>
+        </w:rPr>
+      </w:pPr>
+      <w:r>
+        <w:rPr>
+          <w:lang w:val="es-US"/>
+        </w:rPr>
+        <w:t xml:space="preserve">    }</w:t>
+      </w:r>
+    </w:p>
+    <w:p>
+      <w:pPr>
+        <w:rPr>
+          <w:lang w:val="es-US"/>
+        </w:rPr>
+      </w:pPr>
+      <w:r>
+        <w:rPr>
+          <w:lang w:val="es-US"/>
+        </w:rPr>
+        <w:t xml:space="preserve">  }</w:t>
+      </w:r>
+    </w:p>
+    <w:p>
+      <w:pPr>
+        <w:rPr>
+          <w:lang w:val="es-US"/>
+        </w:rPr>
+      </w:pPr>
+    </w:p>
+    <w:p>
+      <w:pPr>
+        <w:rPr>
+          <w:lang w:val="en-US"/>
+        </w:rPr>
+      </w:pPr>
+      <w:r>
+        <w:rPr>
+          <w:lang w:val="es-US"/>
+        </w:rPr>
+        <w:lastRenderedPageBreak/>
+        <w:t xml:space="preserve">  </w:t>
+      </w:r>
+      <w:r>
+        <w:rPr>
+          <w:lang w:val="en-US"/>
+        </w:rPr>
+        <w:t>: row {</w:t>
+      </w:r>
+    </w:p>
+    <w:p>
+      <w:pPr>
+        <w:rPr>
+          <w:lang w:val="en-US"/>
+        </w:rPr>
+      </w:pPr>
+      <w:r>
+        <w:rPr>
+          <w:lang w:val="en-US"/>
+        </w:rPr>
+        <w:t xml:space="preserve">    alignment = centered;</w:t>
+      </w:r>
+    </w:p>
+    <w:p>
+      <w:pPr>
+        <w:rPr>
+          <w:lang w:val="en-US"/>
+        </w:rPr>
+      </w:pPr>
+      <w:r>
+        <w:rPr>
+          <w:lang w:val="en-US"/>
+        </w:rPr>
+        <w:t xml:space="preserve">    : button { </w:t>
+      </w:r>
+    </w:p>
+    <w:p>
+      <w:pPr>
+        <w:rPr>
+          <w:lang w:val="en-US"/>
+        </w:rPr>
+      </w:pPr>
+      <w:r>
+        <w:rPr>
+          <w:lang w:val="en-US"/>
+        </w:rPr>
+        <w:t xml:space="preserve">      label = "</w:t>
+      </w:r>
+      <w:proofErr w:type="spellStart"/>
+      <w:r>
+        <w:rPr>
+          <w:lang w:val="en-US"/>
+        </w:rPr>
+        <w:t>Guardar</w:t>
+      </w:r>
+      <w:proofErr w:type="spellEnd"/>
+      <w:r>
+        <w:rPr>
+          <w:lang w:val="en-US"/>
+        </w:rPr>
+        <w:t xml:space="preserve">"; </w:t>
+      </w:r>
+    </w:p>
+    <w:p>
+      <w:pPr>
+        <w:rPr>
+          <w:lang w:val="en-US"/>
+        </w:rPr>
+      </w:pPr>
+      <w:r>
+        <w:rPr>
+          <w:lang w:val="en-US"/>
+        </w:rPr>
+        <w:t xml:space="preserve">      key = "accept"; </w:t>
+      </w:r>
+    </w:p>
+    <w:p>
+      <w:pPr>
+        <w:rPr>
+          <w:lang w:val="en-US"/>
+        </w:rPr>
+      </w:pPr>
+      <w:r>
+        <w:rPr>
+          <w:lang w:val="en-US"/>
+        </w:rPr>
+        <w:t xml:space="preserve">      </w:t>
+      </w:r>
+      <w:proofErr w:type="spellStart"/>
+      <w:r>
+        <w:rPr>
+          <w:lang w:val="en-US"/>
+        </w:rPr>
+        <w:t>is_default</w:t>
+      </w:r>
+      <w:proofErr w:type="spellEnd"/>
+      <w:r>
+        <w:rPr>
+          <w:lang w:val="en-US"/>
+        </w:rPr>
+        <w:t xml:space="preserve"> = true; </w:t>
+      </w:r>
+    </w:p>
+    <w:p>
+      <w:pPr>
+        <w:rPr>
+          <w:lang w:val="en-US"/>
+        </w:rPr>
+      </w:pPr>
+      <w:r>
+        <w:rPr>
+          <w:lang w:val="en-US"/>
+        </w:rPr>
+        <w:t xml:space="preserve">    }</w:t>
+      </w:r>
+    </w:p>
+    <w:p>
+      <w:pPr>
+        <w:rPr>
+          <w:lang w:val="en-US"/>
+        </w:rPr>
+      </w:pPr>
+      <w:r>
+        <w:rPr>
+          <w:lang w:val="en-US"/>
+        </w:rPr>
+        <w:t xml:space="preserve">    : button { </w:t>
+      </w:r>
+    </w:p>
+    <w:p>
+      <w:pPr>
+        <w:rPr>
+          <w:lang w:val="en-US"/>
+        </w:rPr>
+      </w:pPr>
+      <w:r>
+        <w:rPr>
+          <w:lang w:val="en-US"/>
+        </w:rPr>
+        <w:t xml:space="preserve">      label = "</w:t>
+      </w:r>
+      <w:proofErr w:type="spellStart"/>
+      <w:r>
+        <w:rPr>
+          <w:lang w:val="en-US"/>
+        </w:rPr>
+        <w:t>Cancelar</w:t>
+      </w:r>
+      <w:proofErr w:type="spellEnd"/>
+      <w:r>
+        <w:rPr>
+          <w:lang w:val="en-US"/>
+        </w:rPr>
+        <w:t xml:space="preserve">"; </w:t>
+      </w:r>
+    </w:p>
+    <w:p>
+      <w:pPr>
+        <w:rPr>
+          <w:lang w:val="en-US"/>
+        </w:rPr>
+      </w:pPr>
+      <w:r>
+        <w:rPr>
+          <w:lang w:val="en-US"/>
+        </w:rPr>
+        <w:t xml:space="preserve">      key = "cancel"; </w:t>
+      </w:r>
+    </w:p>
+    <w:p>
+      <w:pPr>
+        <w:rPr>
+          <w:lang w:val="es-US"/>
+        </w:rPr>
+      </w:pPr>
+      <w:r>
+        <w:rPr>
+          <w:lang w:val="en-US"/>
+        </w:rPr>
+        <w:t xml:space="preserve">      </w:t>
+      </w:r>
+      <w:proofErr w:type="spellStart"/>
+      <w:r>
+        <w:rPr>
+          <w:lang w:val="es-US"/>
+        </w:rPr>
+        <w:t>is_cancel</w:t>
+      </w:r>
+      <w:proofErr w:type="spellEnd"/>
+      <w:r>
+        <w:rPr>
+          <w:lang w:val="es-US"/>
+        </w:rPr>
+        <w:t xml:space="preserve"> = true; </w:t>
+      </w:r>
+    </w:p>
+    <w:p>
+      <w:pPr>
+        <w:rPr>
+          <w:lang w:val="es-US"/>
+        </w:rPr>
+      </w:pPr>
+      <w:r>
+        <w:rPr>
+          <w:lang w:val="es-US"/>
+        </w:rPr>
+        <w:t xml:space="preserve">    }</w:t>
+      </w:r>
+    </w:p>
+    <w:p>
+      <w:pPr>
+        <w:rPr>
+          <w:lang w:val="es-US"/>
+        </w:rPr>
+      </w:pPr>
+      <w:r>
+        <w:rPr>
+          <w:lang w:val="es-US"/>
+        </w:rPr>
+        <w:t xml:space="preserve">  }</w:t>
+      </w:r>
+    </w:p>
+    <w:p>
+      <w:pPr>
+        <w:rPr>
+          <w:lang w:val="es-US"/>
+        </w:rPr>
+      </w:pPr>
+      <w:r>
+        <w:rPr>
+          <w:lang w:val="es-US"/>
+        </w:rPr>
+        <w:t>}</w:t>
       </w:r>
     </w:p>
     <w:p>
@@ -2198,7 +3526,151 @@
           <w:lang w:val="es-US"/>
         </w:rPr>
       </w:pPr>
-      <w:bookmarkStart w:id="3" w:name="_Toc230345664"/>
+      <w:bookmarkStart w:id="7" w:name="_Toc230609824"/>
+      <w:r>
+        <w:rPr>
+          <w:lang w:val="es-US"/>
+        </w:rPr>
+        <w:lastRenderedPageBreak/>
+        <w:t>Desarrollo de código LISP</w:t>
+      </w:r>
+      <w:bookmarkEnd w:id="7"/>
+    </w:p>
+    <w:p>
+      <w:pPr>
+        <w:rPr>
+          <w:lang w:val="es-US"/>
+        </w:rPr>
+      </w:pPr>
+    </w:p>
+    <w:p>
+      <w:pPr>
+        <w:rPr>
+          <w:lang w:val="es-US"/>
+        </w:rPr>
+      </w:pPr>
+      <w:r>
+        <w:rPr>
+          <w:lang w:val="es-US"/>
+        </w:rPr>
+        <w:t xml:space="preserve">Definimos </w:t>
+      </w:r>
+      <w:r>
+        <w:rPr>
+          <w:lang w:val="es-US"/>
+        </w:rPr>
+        <w:t>3</w:t>
+      </w:r>
+      <w:r>
+        <w:rPr>
+          <w:lang w:val="es-US"/>
+        </w:rPr>
+        <w:t xml:space="preserve"> funciones </w:t>
+      </w:r>
+      <w:r>
+        <w:rPr>
+          <w:lang w:val="es-US"/>
+        </w:rPr>
+        <w:t xml:space="preserve">principalmente </w:t>
+      </w:r>
+      <w:r>
+        <w:rPr>
+          <w:lang w:val="es-US"/>
+        </w:rPr>
+        <w:t>para cumplir con los objetivos de la tarea</w:t>
+      </w:r>
+      <w:r>
+        <w:rPr>
+          <w:lang w:val="es-US"/>
+        </w:rPr>
+        <w:t>, 1 auxiliar, y dos funciones para ejecutar como comandos.</w:t>
+      </w:r>
+    </w:p>
+    <w:p>
+      <w:pPr>
+        <w:rPr>
+          <w:lang w:val="es-US"/>
+        </w:rPr>
+      </w:pPr>
+    </w:p>
+    <w:p>
+      <w:pPr>
+        <w:pStyle w:val="Ttulo2"/>
+        <w:rPr>
+          <w:lang w:val="es-US"/>
+        </w:rPr>
+      </w:pPr>
+      <w:bookmarkStart w:id="8" w:name="_Toc230609825"/>
+      <w:r>
+        <w:rPr>
+          <w:lang w:val="es-US"/>
+        </w:rPr>
+        <w:t>Función auxiliar</w:t>
+      </w:r>
+      <w:bookmarkEnd w:id="8"/>
+    </w:p>
+    <w:p>
+      <w:pPr>
+        <w:rPr>
+          <w:lang w:val="es-US"/>
+        </w:rPr>
+      </w:pPr>
+    </w:p>
+    <w:p>
+      <w:pPr>
+        <w:pStyle w:val="Ttulo2"/>
+        <w:rPr>
+          <w:lang w:val="es-US"/>
+        </w:rPr>
+      </w:pPr>
+      <w:bookmarkStart w:id="9" w:name="_Toc230609826"/>
+      <w:r>
+        <w:rPr>
+          <w:lang w:val="es-US"/>
+        </w:rPr>
+        <w:t>Editar datos</w:t>
+      </w:r>
+      <w:bookmarkEnd w:id="9"/>
+    </w:p>
+    <w:p>
+      <w:pPr>
+        <w:rPr>
+          <w:lang w:val="es-US"/>
+        </w:rPr>
+      </w:pPr>
+    </w:p>
+    <w:p>
+      <w:pPr>
+        <w:pStyle w:val="Ttulo2"/>
+        <w:rPr>
+          <w:sz w:val="32"/>
+          <w:szCs w:val="32"/>
+          <w:lang w:val="es-US"/>
+        </w:rPr>
+      </w:pPr>
+      <w:bookmarkStart w:id="10" w:name="_Toc230609827"/>
+      <w:r>
+        <w:rPr>
+          <w:lang w:val="es-US"/>
+        </w:rPr>
+        <w:t>Calcular consumo</w:t>
+      </w:r>
+      <w:bookmarkEnd w:id="10"/>
+      <w:r>
+        <w:rPr>
+          <w:lang w:val="es-US"/>
+        </w:rPr>
+        <w:br w:type="page"/>
+      </w:r>
+    </w:p>
+    <w:p>
+      <w:pPr>
+        <w:pStyle w:val="Ttulo1"/>
+        <w:rPr>
+          <w:lang w:val="es-US"/>
+        </w:rPr>
+      </w:pPr>
+      <w:bookmarkStart w:id="11" w:name="_Toc230609828"/>
       <w:r>
         <w:rPr>
           <w:lang w:val="es-US"/>
@@ -2206,7 +3678,7 @@
         <w:lastRenderedPageBreak/>
         <w:t>Ejecución del programa</w:t>
       </w:r>
-      <w:bookmarkEnd w:id="3"/>
+      <w:bookmarkEnd w:id="11"/>
     </w:p>
     <w:p>
       <w:pPr>
@@ -2232,7 +3704,7 @@
           <w:lang w:val="es-US"/>
         </w:rPr>
       </w:pPr>
-      <w:bookmarkStart w:id="4" w:name="_Toc230345665"/>
+      <w:bookmarkStart w:id="12" w:name="_Toc230609829"/>
       <w:r>
         <w:rPr>
           <w:lang w:val="es-US"/>
@@ -2240,7 +3712,7 @@
         <w:lastRenderedPageBreak/>
         <w:t>Muestra y análisis de resultados</w:t>
       </w:r>
-      <w:bookmarkEnd w:id="4"/>
+      <w:bookmarkEnd w:id="12"/>
     </w:p>
     <w:p>
       <w:pPr>
@@ -2266,7 +3738,7 @@
           <w:lang w:val="es-US"/>
         </w:rPr>
       </w:pPr>
-      <w:bookmarkStart w:id="5" w:name="_Toc230345666"/>
+      <w:bookmarkStart w:id="13" w:name="_Toc230609830"/>
       <w:r>
         <w:rPr>
           <w:lang w:val="es-US"/>
@@ -2274,7 +3746,7 @@
         <w:lastRenderedPageBreak/>
         <w:t>Conclusiones</w:t>
       </w:r>
-      <w:bookmarkEnd w:id="5"/>
+      <w:bookmarkEnd w:id="13"/>
     </w:p>
     <w:p>
       <w:pPr>
@@ -2300,7 +3772,7 @@
           <w:lang w:val="es-US"/>
         </w:rPr>
       </w:pPr>
-      <w:bookmarkStart w:id="6" w:name="_Toc230345667"/>
+      <w:bookmarkStart w:id="14" w:name="_Toc230609831"/>
       <w:r>
         <w:rPr>
           <w:lang w:val="es-US"/>
@@ -2308,7 +3780,7 @@
         <w:lastRenderedPageBreak/>
         <w:t>Bibliografía</w:t>
       </w:r>
-      <w:bookmarkEnd w:id="6"/>
+      <w:bookmarkEnd w:id="14"/>
     </w:p>
     <w:p>
       <w:pPr>
@@ -2328,7 +3800,7 @@
 </file>
 
 <file path=word/numbering.xml><?xml version="1.0" encoding="utf-8"?>
-<w:numbering xmlns:wpc="http://schemas.microsoft.com/office/word/2010/wordprocessingCanvas" xmlns:cx="http://schemas.microsoft.com/office/drawing/2014/chartex" xmlns:cx1="http://schemas.microsoft.com/office/drawing/2015/9/8/chartex" xmlns:cx2="http://schemas.microsoft.com/office/drawing/2015/10/21/chartex" xmlns:cx3="http://schemas.microsoft.com/office/drawing/2016/5/9/chartex" xmlns:cx4="http://schemas.microsoft.com/office/drawing/2016/5/10/chartex" xmlns:cx5="http://schemas.microsoft.com/office/drawing/2016/5/11/chartex" xmlns:cx6="http://schemas.microsoft.com/office/drawing/2016/5/12/chartex" xmlns:cx7="http://schemas.microsoft.com/office/drawing/2016/5/13/chartex" xmlns:cx8="http://schemas.microsoft.com/office/drawing/2016/5/14/chartex" xmlns:mc="http://schemas.openxmlformats.org/markup-compatibility/2006" xmlns:aink="http://schemas.microsoft.com/office/drawing/2016/ink" xmlns:am3d="http://schemas.microsoft.com/office/drawing/2017/model3d" xmlns:o="urn:schemas-microsoft-com:office:office" xmlns:oel="http://schemas.microsoft.com/office/2019/extlst" xmlns:r="http://schemas.openxmlformats.org/officeDocument/2006/relationships" xmlns:m="http://schemas.openxmlformats.org/officeDocument/2006/math" xmlns:v="urn:schemas-microsoft-com:vml" xmlns:wp14="http://schemas.microsoft.com/office/word/2010/wordprocessingDrawing" xmlns:wp="http://schemas.openxmlformats.org/drawingml/2006/wordprocessingDrawing" xmlns:w10="urn:schemas-microsoft-com:office:word" xmlns:w="http://schemas.openxmlformats.org/wordprocessingml/2006/main" xmlns:w14="http://schemas.microsoft.com/office/word/2010/wordml" xmlns:w15="http://schemas.microsoft.com/office/word/2012/wordml" xmlns:w16cex="http://schemas.microsoft.com/office/word/2018/wordml/cex" xmlns:w16cid="http://schemas.microsoft.com/office/word/2016/wordml/cid" xmlns:w16="http://schemas.microsoft.com/office/word/2018/wordml" xmlns:w16du="http://schemas.microsoft.com/office/word/2023/wordml/word16du" xmlns:w16sdtdh="http://schemas.microsoft.com/office/word/2020/wordml/sdtdatahash" xmlns:w16se="http://schemas.microsoft.com/office/word/2015/wordml/symex" xmlns:wpg="http://schemas.microsoft.com/office/word/2010/wordprocessingGroup" xmlns:wpi="http://schemas.microsoft.com/office/word/2010/wordprocessingInk" xmlns:wne="http://schemas.microsoft.com/office/word/2006/wordml" xmlns:wps="http://schemas.microsoft.com/office/word/2010/wordprocessingShape" mc:Ignorable="w14 w15 w16se w16cid w16 w16cex w16sdtdh w16du wp14">
+<w:numbering xmlns:wpc="http://schemas.microsoft.com/office/word/2010/wordprocessingCanvas" xmlns:cx="http://schemas.microsoft.com/office/drawing/2014/chartex" xmlns:cx1="http://schemas.microsoft.com/office/drawing/2015/9/8/chartex" xmlns:cx2="http://schemas.microsoft.com/office/drawing/2015/10/21/chartex" xmlns:cx3="http://schemas.microsoft.com/office/drawing/2016/5/9/chartex" xmlns:cx4="http://schemas.microsoft.com/office/drawing/2016/5/10/chartex" xmlns:cx5="http://schemas.microsoft.com/office/drawing/2016/5/11/chartex" xmlns:cx6="http://schemas.microsoft.com/office/drawing/2016/5/12/chartex" xmlns:cx7="http://schemas.microsoft.com/office/drawing/2016/5/13/chartex" xmlns:cx8="http://schemas.microsoft.com/office/drawing/2016/5/14/chartex" xmlns:mc="http://schemas.openxmlformats.org/markup-compatibility/2006" xmlns:aink="http://schemas.microsoft.com/office/drawing/2016/ink" xmlns:am3d="http://schemas.microsoft.com/office/drawing/2017/model3d" xmlns:o="urn:schemas-microsoft-com:office:office" xmlns:r="http://schemas.openxmlformats.org/officeDocument/2006/relationships" xmlns:m="http://schemas.openxmlformats.org/officeDocument/2006/math" xmlns:v="urn:schemas-microsoft-com:vml" xmlns:wp14="http://schemas.microsoft.com/office/word/2010/wordprocessingDrawing" xmlns:wp="http://schemas.openxmlformats.org/drawingml/2006/wordprocessingDrawing" xmlns:w10="urn:schemas-microsoft-com:office:word" xmlns:w="http://schemas.openxmlformats.org/wordprocessingml/2006/main" xmlns:w14="http://schemas.microsoft.com/office/word/2010/wordml" xmlns:w15="http://schemas.microsoft.com/office/word/2012/wordml" xmlns:w16cex="http://schemas.microsoft.com/office/word/2018/wordml/cex" xmlns:w16cid="http://schemas.microsoft.com/office/word/2016/wordml/cid" xmlns:w16="http://schemas.microsoft.com/office/word/2018/wordml" xmlns:w16sdtdh="http://schemas.microsoft.com/office/word/2020/wordml/sdtdatahash" xmlns:w16se="http://schemas.microsoft.com/office/word/2015/wordml/symex" xmlns:wpg="http://schemas.microsoft.com/office/word/2010/wordprocessingGroup" xmlns:wpi="http://schemas.microsoft.com/office/word/2010/wordprocessingInk" xmlns:wne="http://schemas.microsoft.com/office/word/2006/wordml" xmlns:wps="http://schemas.microsoft.com/office/word/2010/wordprocessingShape" mc:Ignorable="w14 w15 w16se w16cid w16 w16cex w16sdtdh wp14">
   <w:abstractNum w:abstractNumId="0" w15:restartNumberingAfterBreak="0">
     <w:nsid w:val="39163857"/>
     <w:multiLevelType w:val="hybridMultilevel"/>
@@ -2622,20 +4094,20 @@
       </w:rPr>
     </w:lvl>
   </w:abstractNum>
-  <w:num w:numId="1" w16cid:durableId="613366169">
+  <w:num w:numId="1">
     <w:abstractNumId w:val="0"/>
   </w:num>
-  <w:num w:numId="2" w16cid:durableId="1424228848">
+  <w:num w:numId="2">
     <w:abstractNumId w:val="2"/>
   </w:num>
-  <w:num w:numId="3" w16cid:durableId="501120949">
+  <w:num w:numId="3">
     <w:abstractNumId w:val="1"/>
   </w:num>
 </w:numbering>
 </file>
 
 <file path=word/styles.xml><?xml version="1.0" encoding="utf-8"?>
-<w:styles xmlns:mc="http://schemas.openxmlformats.org/markup-compatibility/2006" xmlns:r="http://schemas.openxmlformats.org/officeDocument/2006/relationships" xmlns:w="http://schemas.openxmlformats.org/wordprocessingml/2006/main" xmlns:w14="http://schemas.microsoft.com/office/word/2010/wordml" xmlns:w15="http://schemas.microsoft.com/office/word/2012/wordml" xmlns:w16cex="http://schemas.microsoft.com/office/word/2018/wordml/cex" xmlns:w16cid="http://schemas.microsoft.com/office/word/2016/wordml/cid" xmlns:w16="http://schemas.microsoft.com/office/word/2018/wordml" xmlns:w16du="http://schemas.microsoft.com/office/word/2023/wordml/word16du" xmlns:w16sdtdh="http://schemas.microsoft.com/office/word/2020/wordml/sdtdatahash" xmlns:w16se="http://schemas.microsoft.com/office/word/2015/wordml/symex" mc:Ignorable="w14 w15 w16se w16cid w16 w16cex w16sdtdh w16du">
+<w:styles xmlns:mc="http://schemas.openxmlformats.org/markup-compatibility/2006" xmlns:r="http://schemas.openxmlformats.org/officeDocument/2006/relationships" xmlns:w="http://schemas.openxmlformats.org/wordprocessingml/2006/main" xmlns:w14="http://schemas.microsoft.com/office/word/2010/wordml" xmlns:w15="http://schemas.microsoft.com/office/word/2012/wordml" xmlns:w16cex="http://schemas.microsoft.com/office/word/2018/wordml/cex" xmlns:w16cid="http://schemas.microsoft.com/office/word/2016/wordml/cid" xmlns:w16="http://schemas.microsoft.com/office/word/2018/wordml" xmlns:w16sdtdh="http://schemas.microsoft.com/office/word/2020/wordml/sdtdatahash" xmlns:w16se="http://schemas.microsoft.com/office/word/2015/wordml/symex" mc:Ignorable="w14 w15 w16se w16cid w16 w16cex w16sdtdh">
   <w:docDefaults>
     <w:rPrDefault>
       <w:rPr>
@@ -3082,6 +4554,7 @@
   <w:style w:type="character" w:default="1" w:styleId="Fuentedeprrafopredeter">
     <w:name w:val="Default Paragraph Font"/>
     <w:uiPriority w:val="1"/>
+    <w:semiHidden/>
     <w:unhideWhenUsed/>
   </w:style>
   <w:style w:type="table" w:default="1" w:styleId="Tablanormal">
@@ -3181,6 +4654,19 @@
       <w:color w:val="467886" w:themeColor="hyperlink"/>
       <w:u w:val="single"/>
     </w:rPr>
+  </w:style>
+  <w:style w:type="paragraph" w:styleId="TDC2">
+    <w:name w:val="toc 2"/>
+    <w:basedOn w:val="Normal"/>
+    <w:next w:val="Normal"/>
+    <w:autoRedefine/>
+    <w:uiPriority w:val="39"/>
+    <w:unhideWhenUsed/>
+    <w:rsid w:val="00902ABA"/>
+    <w:pPr>
+      <w:spacing w:after="100"/>
+      <w:ind w:left="220"/>
+    </w:pPr>
   </w:style>
 </w:styles>
 </file>

</xml_diff>

<commit_message>
Agregada seccion de ejecucion del programa con pantallazos a informe
</commit_message>
<xml_diff>
--- a/AutoCAD/DatosExtendidos/InformeDatosExtendidos.docx
+++ b/AutoCAD/DatosExtendidos/InformeDatosExtendidos.docx
@@ -1,6 +1,6 @@
 
 <file path=word/document.xml><?xml version="1.0" encoding="utf-8"?>
-<w:document xmlns:wpc="http://schemas.microsoft.com/office/word/2010/wordprocessingCanvas" xmlns:cx="http://schemas.microsoft.com/office/drawing/2014/chartex" xmlns:cx1="http://schemas.microsoft.com/office/drawing/2015/9/8/chartex" xmlns:cx2="http://schemas.microsoft.com/office/drawing/2015/10/21/chartex" xmlns:cx3="http://schemas.microsoft.com/office/drawing/2016/5/9/chartex" xmlns:cx4="http://schemas.microsoft.com/office/drawing/2016/5/10/chartex" xmlns:cx5="http://schemas.microsoft.com/office/drawing/2016/5/11/chartex" xmlns:cx6="http://schemas.microsoft.com/office/drawing/2016/5/12/chartex" xmlns:cx7="http://schemas.microsoft.com/office/drawing/2016/5/13/chartex" xmlns:cx8="http://schemas.microsoft.com/office/drawing/2016/5/14/chartex" xmlns:mc="http://schemas.openxmlformats.org/markup-compatibility/2006" xmlns:aink="http://schemas.microsoft.com/office/drawing/2016/ink" xmlns:am3d="http://schemas.microsoft.com/office/drawing/2017/model3d" xmlns:o="urn:schemas-microsoft-com:office:office" xmlns:oel="http://schemas.microsoft.com/office/2019/extlst" xmlns:r="http://schemas.openxmlformats.org/officeDocument/2006/relationships" xmlns:m="http://schemas.openxmlformats.org/officeDocument/2006/math" xmlns:v="urn:schemas-microsoft-com:vml" xmlns:wp14="http://schemas.microsoft.com/office/word/2010/wordprocessingDrawing" xmlns:wp="http://schemas.openxmlformats.org/drawingml/2006/wordprocessingDrawing" xmlns:w10="urn:schemas-microsoft-com:office:word" xmlns:w="http://schemas.openxmlformats.org/wordprocessingml/2006/main" xmlns:w14="http://schemas.microsoft.com/office/word/2010/wordml" xmlns:w15="http://schemas.microsoft.com/office/word/2012/wordml" xmlns:w16cex="http://schemas.microsoft.com/office/word/2018/wordml/cex" xmlns:w16cid="http://schemas.microsoft.com/office/word/2016/wordml/cid" xmlns:w16="http://schemas.microsoft.com/office/word/2018/wordml" xmlns:w16du="http://schemas.microsoft.com/office/word/2023/wordml/word16du" xmlns:w16sdtdh="http://schemas.microsoft.com/office/word/2020/wordml/sdtdatahash" xmlns:w16sdtfl="http://schemas.microsoft.com/office/word/2024/wordml/sdtformatlock" xmlns:w16se="http://schemas.microsoft.com/office/word/2015/wordml/symex" xmlns:wpg="http://schemas.microsoft.com/office/word/2010/wordprocessingGroup" xmlns:wpi="http://schemas.microsoft.com/office/word/2010/wordprocessingInk" xmlns:wne="http://schemas.microsoft.com/office/word/2006/wordml" xmlns:wps="http://schemas.microsoft.com/office/word/2010/wordprocessingShape" mc:Ignorable="w14 w15 w16se w16cid w16 w16cex w16sdtdh w16sdtfl w16du wp14">
+<w:document xmlns:wpc="http://schemas.microsoft.com/office/word/2010/wordprocessingCanvas" xmlns:cx="http://schemas.microsoft.com/office/drawing/2014/chartex" xmlns:cx1="http://schemas.microsoft.com/office/drawing/2015/9/8/chartex" xmlns:cx2="http://schemas.microsoft.com/office/drawing/2015/10/21/chartex" xmlns:cx3="http://schemas.microsoft.com/office/drawing/2016/5/9/chartex" xmlns:cx4="http://schemas.microsoft.com/office/drawing/2016/5/10/chartex" xmlns:cx5="http://schemas.microsoft.com/office/drawing/2016/5/11/chartex" xmlns:cx6="http://schemas.microsoft.com/office/drawing/2016/5/12/chartex" xmlns:cx7="http://schemas.microsoft.com/office/drawing/2016/5/13/chartex" xmlns:cx8="http://schemas.microsoft.com/office/drawing/2016/5/14/chartex" xmlns:mc="http://schemas.openxmlformats.org/markup-compatibility/2006" xmlns:aink="http://schemas.microsoft.com/office/drawing/2016/ink" xmlns:am3d="http://schemas.microsoft.com/office/drawing/2017/model3d" xmlns:o="urn:schemas-microsoft-com:office:office" xmlns:r="http://schemas.openxmlformats.org/officeDocument/2006/relationships" xmlns:m="http://schemas.openxmlformats.org/officeDocument/2006/math" xmlns:v="urn:schemas-microsoft-com:vml" xmlns:wp14="http://schemas.microsoft.com/office/word/2010/wordprocessingDrawing" xmlns:wp="http://schemas.openxmlformats.org/drawingml/2006/wordprocessingDrawing" xmlns:w10="urn:schemas-microsoft-com:office:word" xmlns:w="http://schemas.openxmlformats.org/wordprocessingml/2006/main" xmlns:w14="http://schemas.microsoft.com/office/word/2010/wordml" xmlns:w15="http://schemas.microsoft.com/office/word/2012/wordml" xmlns:w16cex="http://schemas.microsoft.com/office/word/2018/wordml/cex" xmlns:w16cid="http://schemas.microsoft.com/office/word/2016/wordml/cid" xmlns:w16="http://schemas.microsoft.com/office/word/2018/wordml" xmlns:w16sdtdh="http://schemas.microsoft.com/office/word/2020/wordml/sdtdatahash" xmlns:w16se="http://schemas.microsoft.com/office/word/2015/wordml/symex" xmlns:wpg="http://schemas.microsoft.com/office/word/2010/wordprocessingGroup" xmlns:wpi="http://schemas.microsoft.com/office/word/2010/wordprocessingInk" xmlns:wne="http://schemas.microsoft.com/office/word/2006/wordml" xmlns:wps="http://schemas.microsoft.com/office/word/2010/wordprocessingShape" mc:Ignorable="w14 w15 w16se w16cid w16 w16cex w16sdtdh wp14">
   <w:body>
     <w:p>
       <w:pPr>
@@ -532,7 +532,7 @@
               <w:tab w:val="right" w:leader="dot" w:pos="8828"/>
             </w:tabs>
             <w:rPr>
-              <w:rFonts w:ascii="Times New Roman" w:eastAsiaTheme="minorEastAsia" w:hAnsi="Times New Roman" w:cs="Times New Roman"/>
+              <w:rFonts w:eastAsiaTheme="minorEastAsia"/>
               <w:noProof/>
               <w:kern w:val="0"/>
               <w:lang w:val="en-US"/>
@@ -557,7 +557,7 @@
             </w:rPr>
             <w:fldChar w:fldCharType="separate"/>
           </w:r>
-          <w:hyperlink w:anchor="_Toc230609817" w:history="1">
+          <w:hyperlink w:anchor="_Toc231040756" w:history="1">
             <w:r>
               <w:rPr>
                 <w:rStyle w:val="Hipervnculo"/>
@@ -569,7 +569,6 @@
             </w:r>
             <w:r>
               <w:rPr>
-                <w:rFonts w:ascii="Times New Roman" w:hAnsi="Times New Roman" w:cs="Times New Roman"/>
                 <w:noProof/>
                 <w:webHidden/>
               </w:rPr>
@@ -577,7 +576,6 @@
             </w:r>
             <w:r>
               <w:rPr>
-                <w:rFonts w:ascii="Times New Roman" w:hAnsi="Times New Roman" w:cs="Times New Roman"/>
                 <w:noProof/>
                 <w:webHidden/>
               </w:rPr>
@@ -585,22 +583,19 @@
             </w:r>
             <w:r>
               <w:rPr>
-                <w:rFonts w:ascii="Times New Roman" w:hAnsi="Times New Roman" w:cs="Times New Roman"/>
-                <w:noProof/>
-                <w:webHidden/>
-              </w:rPr>
-              <w:instrText xml:space="preserve"> PAGEREF _Toc230609817 \h </w:instrText>
-            </w:r>
-            <w:r>
-              <w:rPr>
-                <w:rFonts w:ascii="Times New Roman" w:hAnsi="Times New Roman" w:cs="Times New Roman"/>
-                <w:noProof/>
-                <w:webHidden/>
-              </w:rPr>
-            </w:r>
-            <w:r>
-              <w:rPr>
-                <w:rFonts w:ascii="Times New Roman" w:hAnsi="Times New Roman" w:cs="Times New Roman"/>
+                <w:noProof/>
+                <w:webHidden/>
+              </w:rPr>
+              <w:instrText xml:space="preserve"> PAGEREF _Toc231040756 \h </w:instrText>
+            </w:r>
+            <w:r>
+              <w:rPr>
+                <w:noProof/>
+                <w:webHidden/>
+              </w:rPr>
+            </w:r>
+            <w:r>
+              <w:rPr>
                 <w:noProof/>
                 <w:webHidden/>
               </w:rPr>
@@ -608,7 +603,6 @@
             </w:r>
             <w:r>
               <w:rPr>
-                <w:rFonts w:ascii="Times New Roman" w:hAnsi="Times New Roman" w:cs="Times New Roman"/>
                 <w:noProof/>
                 <w:webHidden/>
               </w:rPr>
@@ -616,7 +610,6 @@
             </w:r>
             <w:r>
               <w:rPr>
-                <w:rFonts w:ascii="Times New Roman" w:hAnsi="Times New Roman" w:cs="Times New Roman"/>
                 <w:noProof/>
                 <w:webHidden/>
               </w:rPr>
@@ -631,14 +624,14 @@
               <w:tab w:val="right" w:leader="dot" w:pos="8828"/>
             </w:tabs>
             <w:rPr>
-              <w:rFonts w:ascii="Times New Roman" w:eastAsiaTheme="minorEastAsia" w:hAnsi="Times New Roman" w:cs="Times New Roman"/>
+              <w:rFonts w:eastAsiaTheme="minorEastAsia"/>
               <w:noProof/>
               <w:kern w:val="0"/>
               <w:lang w:val="en-US"/>
               <w14:ligatures w14:val="none"/>
             </w:rPr>
           </w:pPr>
-          <w:hyperlink w:anchor="_Toc230609818" w:history="1">
+          <w:hyperlink w:anchor="_Toc231040757" w:history="1">
             <w:r>
               <w:rPr>
                 <w:rStyle w:val="Hipervnculo"/>
@@ -650,7 +643,6 @@
             </w:r>
             <w:r>
               <w:rPr>
-                <w:rFonts w:ascii="Times New Roman" w:hAnsi="Times New Roman" w:cs="Times New Roman"/>
                 <w:noProof/>
                 <w:webHidden/>
               </w:rPr>
@@ -658,7 +650,6 @@
             </w:r>
             <w:r>
               <w:rPr>
-                <w:rFonts w:ascii="Times New Roman" w:hAnsi="Times New Roman" w:cs="Times New Roman"/>
                 <w:noProof/>
                 <w:webHidden/>
               </w:rPr>
@@ -666,22 +657,19 @@
             </w:r>
             <w:r>
               <w:rPr>
-                <w:rFonts w:ascii="Times New Roman" w:hAnsi="Times New Roman" w:cs="Times New Roman"/>
-                <w:noProof/>
-                <w:webHidden/>
-              </w:rPr>
-              <w:instrText xml:space="preserve"> PAGEREF _Toc230609818 \h </w:instrText>
-            </w:r>
-            <w:r>
-              <w:rPr>
-                <w:rFonts w:ascii="Times New Roman" w:hAnsi="Times New Roman" w:cs="Times New Roman"/>
-                <w:noProof/>
-                <w:webHidden/>
-              </w:rPr>
-            </w:r>
-            <w:r>
-              <w:rPr>
-                <w:rFonts w:ascii="Times New Roman" w:hAnsi="Times New Roman" w:cs="Times New Roman"/>
+                <w:noProof/>
+                <w:webHidden/>
+              </w:rPr>
+              <w:instrText xml:space="preserve"> PAGEREF _Toc231040757 \h </w:instrText>
+            </w:r>
+            <w:r>
+              <w:rPr>
+                <w:noProof/>
+                <w:webHidden/>
+              </w:rPr>
+            </w:r>
+            <w:r>
+              <w:rPr>
                 <w:noProof/>
                 <w:webHidden/>
               </w:rPr>
@@ -689,7 +677,6 @@
             </w:r>
             <w:r>
               <w:rPr>
-                <w:rFonts w:ascii="Times New Roman" w:hAnsi="Times New Roman" w:cs="Times New Roman"/>
                 <w:noProof/>
                 <w:webHidden/>
               </w:rPr>
@@ -697,7 +684,6 @@
             </w:r>
             <w:r>
               <w:rPr>
-                <w:rFonts w:ascii="Times New Roman" w:hAnsi="Times New Roman" w:cs="Times New Roman"/>
                 <w:noProof/>
                 <w:webHidden/>
               </w:rPr>
@@ -712,14 +698,14 @@
               <w:tab w:val="right" w:leader="dot" w:pos="8828"/>
             </w:tabs>
             <w:rPr>
-              <w:rFonts w:ascii="Times New Roman" w:eastAsiaTheme="minorEastAsia" w:hAnsi="Times New Roman" w:cs="Times New Roman"/>
+              <w:rFonts w:eastAsiaTheme="minorEastAsia"/>
               <w:noProof/>
               <w:kern w:val="0"/>
               <w:lang w:val="en-US"/>
               <w14:ligatures w14:val="none"/>
             </w:rPr>
           </w:pPr>
-          <w:hyperlink w:anchor="_Toc230609819" w:history="1">
+          <w:hyperlink w:anchor="_Toc231040758" w:history="1">
             <w:r>
               <w:rPr>
                 <w:rStyle w:val="Hipervnculo"/>
@@ -731,7 +717,6 @@
             </w:r>
             <w:r>
               <w:rPr>
-                <w:rFonts w:ascii="Times New Roman" w:hAnsi="Times New Roman" w:cs="Times New Roman"/>
                 <w:noProof/>
                 <w:webHidden/>
               </w:rPr>
@@ -739,7 +724,6 @@
             </w:r>
             <w:r>
               <w:rPr>
-                <w:rFonts w:ascii="Times New Roman" w:hAnsi="Times New Roman" w:cs="Times New Roman"/>
                 <w:noProof/>
                 <w:webHidden/>
               </w:rPr>
@@ -747,22 +731,19 @@
             </w:r>
             <w:r>
               <w:rPr>
-                <w:rFonts w:ascii="Times New Roman" w:hAnsi="Times New Roman" w:cs="Times New Roman"/>
-                <w:noProof/>
-                <w:webHidden/>
-              </w:rPr>
-              <w:instrText xml:space="preserve"> PAGEREF _Toc230609819 \h </w:instrText>
-            </w:r>
-            <w:r>
-              <w:rPr>
-                <w:rFonts w:ascii="Times New Roman" w:hAnsi="Times New Roman" w:cs="Times New Roman"/>
-                <w:noProof/>
-                <w:webHidden/>
-              </w:rPr>
-            </w:r>
-            <w:r>
-              <w:rPr>
-                <w:rFonts w:ascii="Times New Roman" w:hAnsi="Times New Roman" w:cs="Times New Roman"/>
+                <w:noProof/>
+                <w:webHidden/>
+              </w:rPr>
+              <w:instrText xml:space="preserve"> PAGEREF _Toc231040758 \h </w:instrText>
+            </w:r>
+            <w:r>
+              <w:rPr>
+                <w:noProof/>
+                <w:webHidden/>
+              </w:rPr>
+            </w:r>
+            <w:r>
+              <w:rPr>
                 <w:noProof/>
                 <w:webHidden/>
               </w:rPr>
@@ -770,7 +751,6 @@
             </w:r>
             <w:r>
               <w:rPr>
-                <w:rFonts w:ascii="Times New Roman" w:hAnsi="Times New Roman" w:cs="Times New Roman"/>
                 <w:noProof/>
                 <w:webHidden/>
               </w:rPr>
@@ -778,7 +758,6 @@
             </w:r>
             <w:r>
               <w:rPr>
-                <w:rFonts w:ascii="Times New Roman" w:hAnsi="Times New Roman" w:cs="Times New Roman"/>
                 <w:noProof/>
                 <w:webHidden/>
               </w:rPr>
@@ -793,14 +772,14 @@
               <w:tab w:val="right" w:leader="dot" w:pos="8828"/>
             </w:tabs>
             <w:rPr>
-              <w:rFonts w:ascii="Times New Roman" w:eastAsiaTheme="minorEastAsia" w:hAnsi="Times New Roman" w:cs="Times New Roman"/>
+              <w:rFonts w:eastAsiaTheme="minorEastAsia"/>
               <w:noProof/>
               <w:kern w:val="0"/>
               <w:lang w:val="en-US"/>
               <w14:ligatures w14:val="none"/>
             </w:rPr>
           </w:pPr>
-          <w:hyperlink w:anchor="_Toc230609820" w:history="1">
+          <w:hyperlink w:anchor="_Toc231040759" w:history="1">
             <w:r>
               <w:rPr>
                 <w:rStyle w:val="Hipervnculo"/>
@@ -812,7 +791,6 @@
             </w:r>
             <w:r>
               <w:rPr>
-                <w:rFonts w:ascii="Times New Roman" w:hAnsi="Times New Roman" w:cs="Times New Roman"/>
                 <w:noProof/>
                 <w:webHidden/>
               </w:rPr>
@@ -820,7 +798,6 @@
             </w:r>
             <w:r>
               <w:rPr>
-                <w:rFonts w:ascii="Times New Roman" w:hAnsi="Times New Roman" w:cs="Times New Roman"/>
                 <w:noProof/>
                 <w:webHidden/>
               </w:rPr>
@@ -828,22 +805,19 @@
             </w:r>
             <w:r>
               <w:rPr>
-                <w:rFonts w:ascii="Times New Roman" w:hAnsi="Times New Roman" w:cs="Times New Roman"/>
-                <w:noProof/>
-                <w:webHidden/>
-              </w:rPr>
-              <w:instrText xml:space="preserve"> PAGEREF _Toc230609820 \h </w:instrText>
-            </w:r>
-            <w:r>
-              <w:rPr>
-                <w:rFonts w:ascii="Times New Roman" w:hAnsi="Times New Roman" w:cs="Times New Roman"/>
-                <w:noProof/>
-                <w:webHidden/>
-              </w:rPr>
-            </w:r>
-            <w:r>
-              <w:rPr>
-                <w:rFonts w:ascii="Times New Roman" w:hAnsi="Times New Roman" w:cs="Times New Roman"/>
+                <w:noProof/>
+                <w:webHidden/>
+              </w:rPr>
+              <w:instrText xml:space="preserve"> PAGEREF _Toc231040759 \h </w:instrText>
+            </w:r>
+            <w:r>
+              <w:rPr>
+                <w:noProof/>
+                <w:webHidden/>
+              </w:rPr>
+            </w:r>
+            <w:r>
+              <w:rPr>
                 <w:noProof/>
                 <w:webHidden/>
               </w:rPr>
@@ -851,7 +825,6 @@
             </w:r>
             <w:r>
               <w:rPr>
-                <w:rFonts w:ascii="Times New Roman" w:hAnsi="Times New Roman" w:cs="Times New Roman"/>
                 <w:noProof/>
                 <w:webHidden/>
               </w:rPr>
@@ -859,7 +832,6 @@
             </w:r>
             <w:r>
               <w:rPr>
-                <w:rFonts w:ascii="Times New Roman" w:hAnsi="Times New Roman" w:cs="Times New Roman"/>
                 <w:noProof/>
                 <w:webHidden/>
               </w:rPr>
@@ -874,14 +846,14 @@
               <w:tab w:val="right" w:leader="dot" w:pos="8828"/>
             </w:tabs>
             <w:rPr>
-              <w:rFonts w:ascii="Times New Roman" w:eastAsiaTheme="minorEastAsia" w:hAnsi="Times New Roman" w:cs="Times New Roman"/>
+              <w:rFonts w:eastAsiaTheme="minorEastAsia"/>
               <w:noProof/>
               <w:kern w:val="0"/>
               <w:lang w:val="en-US"/>
               <w14:ligatures w14:val="none"/>
             </w:rPr>
           </w:pPr>
-          <w:hyperlink w:anchor="_Toc230609821" w:history="1">
+          <w:hyperlink w:anchor="_Toc231040760" w:history="1">
             <w:r>
               <w:rPr>
                 <w:rStyle w:val="Hipervnculo"/>
@@ -893,7 +865,6 @@
             </w:r>
             <w:r>
               <w:rPr>
-                <w:rFonts w:ascii="Times New Roman" w:hAnsi="Times New Roman" w:cs="Times New Roman"/>
                 <w:noProof/>
                 <w:webHidden/>
               </w:rPr>
@@ -901,7 +872,6 @@
             </w:r>
             <w:r>
               <w:rPr>
-                <w:rFonts w:ascii="Times New Roman" w:hAnsi="Times New Roman" w:cs="Times New Roman"/>
                 <w:noProof/>
                 <w:webHidden/>
               </w:rPr>
@@ -909,22 +879,19 @@
             </w:r>
             <w:r>
               <w:rPr>
-                <w:rFonts w:ascii="Times New Roman" w:hAnsi="Times New Roman" w:cs="Times New Roman"/>
-                <w:noProof/>
-                <w:webHidden/>
-              </w:rPr>
-              <w:instrText xml:space="preserve"> PAGEREF _Toc230609821 \h </w:instrText>
-            </w:r>
-            <w:r>
-              <w:rPr>
-                <w:rFonts w:ascii="Times New Roman" w:hAnsi="Times New Roman" w:cs="Times New Roman"/>
-                <w:noProof/>
-                <w:webHidden/>
-              </w:rPr>
-            </w:r>
-            <w:r>
-              <w:rPr>
-                <w:rFonts w:ascii="Times New Roman" w:hAnsi="Times New Roman" w:cs="Times New Roman"/>
+                <w:noProof/>
+                <w:webHidden/>
+              </w:rPr>
+              <w:instrText xml:space="preserve"> PAGEREF _Toc231040760 \h </w:instrText>
+            </w:r>
+            <w:r>
+              <w:rPr>
+                <w:noProof/>
+                <w:webHidden/>
+              </w:rPr>
+            </w:r>
+            <w:r>
+              <w:rPr>
                 <w:noProof/>
                 <w:webHidden/>
               </w:rPr>
@@ -932,7 +899,6 @@
             </w:r>
             <w:r>
               <w:rPr>
-                <w:rFonts w:ascii="Times New Roman" w:hAnsi="Times New Roman" w:cs="Times New Roman"/>
                 <w:noProof/>
                 <w:webHidden/>
               </w:rPr>
@@ -940,7 +906,6 @@
             </w:r>
             <w:r>
               <w:rPr>
-                <w:rFonts w:ascii="Times New Roman" w:hAnsi="Times New Roman" w:cs="Times New Roman"/>
                 <w:noProof/>
                 <w:webHidden/>
               </w:rPr>
@@ -955,14 +920,14 @@
               <w:tab w:val="right" w:leader="dot" w:pos="8828"/>
             </w:tabs>
             <w:rPr>
-              <w:rFonts w:ascii="Times New Roman" w:eastAsiaTheme="minorEastAsia" w:hAnsi="Times New Roman" w:cs="Times New Roman"/>
+              <w:rFonts w:eastAsiaTheme="minorEastAsia"/>
               <w:noProof/>
               <w:kern w:val="0"/>
               <w:lang w:val="en-US"/>
               <w14:ligatures w14:val="none"/>
             </w:rPr>
           </w:pPr>
-          <w:hyperlink w:anchor="_Toc230609822" w:history="1">
+          <w:hyperlink w:anchor="_Toc231040761" w:history="1">
             <w:r>
               <w:rPr>
                 <w:rStyle w:val="Hipervnculo"/>
@@ -974,7 +939,6 @@
             </w:r>
             <w:r>
               <w:rPr>
-                <w:rFonts w:ascii="Times New Roman" w:hAnsi="Times New Roman" w:cs="Times New Roman"/>
                 <w:noProof/>
                 <w:webHidden/>
               </w:rPr>
@@ -982,7 +946,6 @@
             </w:r>
             <w:r>
               <w:rPr>
-                <w:rFonts w:ascii="Times New Roman" w:hAnsi="Times New Roman" w:cs="Times New Roman"/>
                 <w:noProof/>
                 <w:webHidden/>
               </w:rPr>
@@ -990,22 +953,19 @@
             </w:r>
             <w:r>
               <w:rPr>
-                <w:rFonts w:ascii="Times New Roman" w:hAnsi="Times New Roman" w:cs="Times New Roman"/>
-                <w:noProof/>
-                <w:webHidden/>
-              </w:rPr>
-              <w:instrText xml:space="preserve"> PAGEREF _Toc230609822 \h </w:instrText>
-            </w:r>
-            <w:r>
-              <w:rPr>
-                <w:rFonts w:ascii="Times New Roman" w:hAnsi="Times New Roman" w:cs="Times New Roman"/>
-                <w:noProof/>
-                <w:webHidden/>
-              </w:rPr>
-            </w:r>
-            <w:r>
-              <w:rPr>
-                <w:rFonts w:ascii="Times New Roman" w:hAnsi="Times New Roman" w:cs="Times New Roman"/>
+                <w:noProof/>
+                <w:webHidden/>
+              </w:rPr>
+              <w:instrText xml:space="preserve"> PAGEREF _Toc231040761 \h </w:instrText>
+            </w:r>
+            <w:r>
+              <w:rPr>
+                <w:noProof/>
+                <w:webHidden/>
+              </w:rPr>
+            </w:r>
+            <w:r>
+              <w:rPr>
                 <w:noProof/>
                 <w:webHidden/>
               </w:rPr>
@@ -1013,7 +973,6 @@
             </w:r>
             <w:r>
               <w:rPr>
-                <w:rFonts w:ascii="Times New Roman" w:hAnsi="Times New Roman" w:cs="Times New Roman"/>
                 <w:noProof/>
                 <w:webHidden/>
               </w:rPr>
@@ -1021,7 +980,6 @@
             </w:r>
             <w:r>
               <w:rPr>
-                <w:rFonts w:ascii="Times New Roman" w:hAnsi="Times New Roman" w:cs="Times New Roman"/>
                 <w:noProof/>
                 <w:webHidden/>
               </w:rPr>
@@ -1036,14 +994,14 @@
               <w:tab w:val="right" w:leader="dot" w:pos="8828"/>
             </w:tabs>
             <w:rPr>
-              <w:rFonts w:ascii="Times New Roman" w:eastAsiaTheme="minorEastAsia" w:hAnsi="Times New Roman" w:cs="Times New Roman"/>
+              <w:rFonts w:eastAsiaTheme="minorEastAsia"/>
               <w:noProof/>
               <w:kern w:val="0"/>
               <w:lang w:val="en-US"/>
               <w14:ligatures w14:val="none"/>
             </w:rPr>
           </w:pPr>
-          <w:hyperlink w:anchor="_Toc230609823" w:history="1">
+          <w:hyperlink w:anchor="_Toc231040762" w:history="1">
             <w:r>
               <w:rPr>
                 <w:rStyle w:val="Hipervnculo"/>
@@ -1055,7 +1013,6 @@
             </w:r>
             <w:r>
               <w:rPr>
-                <w:rFonts w:ascii="Times New Roman" w:hAnsi="Times New Roman" w:cs="Times New Roman"/>
                 <w:noProof/>
                 <w:webHidden/>
               </w:rPr>
@@ -1063,7 +1020,6 @@
             </w:r>
             <w:r>
               <w:rPr>
-                <w:rFonts w:ascii="Times New Roman" w:hAnsi="Times New Roman" w:cs="Times New Roman"/>
                 <w:noProof/>
                 <w:webHidden/>
               </w:rPr>
@@ -1071,22 +1027,19 @@
             </w:r>
             <w:r>
               <w:rPr>
-                <w:rFonts w:ascii="Times New Roman" w:hAnsi="Times New Roman" w:cs="Times New Roman"/>
-                <w:noProof/>
-                <w:webHidden/>
-              </w:rPr>
-              <w:instrText xml:space="preserve"> PAGEREF _Toc230609823 \h </w:instrText>
-            </w:r>
-            <w:r>
-              <w:rPr>
-                <w:rFonts w:ascii="Times New Roman" w:hAnsi="Times New Roman" w:cs="Times New Roman"/>
-                <w:noProof/>
-                <w:webHidden/>
-              </w:rPr>
-            </w:r>
-            <w:r>
-              <w:rPr>
-                <w:rFonts w:ascii="Times New Roman" w:hAnsi="Times New Roman" w:cs="Times New Roman"/>
+                <w:noProof/>
+                <w:webHidden/>
+              </w:rPr>
+              <w:instrText xml:space="preserve"> PAGEREF _Toc231040762 \h </w:instrText>
+            </w:r>
+            <w:r>
+              <w:rPr>
+                <w:noProof/>
+                <w:webHidden/>
+              </w:rPr>
+            </w:r>
+            <w:r>
+              <w:rPr>
                 <w:noProof/>
                 <w:webHidden/>
               </w:rPr>
@@ -1094,7 +1047,6 @@
             </w:r>
             <w:r>
               <w:rPr>
-                <w:rFonts w:ascii="Times New Roman" w:hAnsi="Times New Roman" w:cs="Times New Roman"/>
                 <w:noProof/>
                 <w:webHidden/>
               </w:rPr>
@@ -1102,7 +1054,6 @@
             </w:r>
             <w:r>
               <w:rPr>
-                <w:rFonts w:ascii="Times New Roman" w:hAnsi="Times New Roman" w:cs="Times New Roman"/>
                 <w:noProof/>
                 <w:webHidden/>
               </w:rPr>
@@ -1117,14 +1068,14 @@
               <w:tab w:val="right" w:leader="dot" w:pos="8828"/>
             </w:tabs>
             <w:rPr>
-              <w:rFonts w:ascii="Times New Roman" w:eastAsiaTheme="minorEastAsia" w:hAnsi="Times New Roman" w:cs="Times New Roman"/>
+              <w:rFonts w:eastAsiaTheme="minorEastAsia"/>
               <w:noProof/>
               <w:kern w:val="0"/>
               <w:lang w:val="en-US"/>
               <w14:ligatures w14:val="none"/>
             </w:rPr>
           </w:pPr>
-          <w:hyperlink w:anchor="_Toc230609824" w:history="1">
+          <w:hyperlink w:anchor="_Toc231040763" w:history="1">
             <w:r>
               <w:rPr>
                 <w:rStyle w:val="Hipervnculo"/>
@@ -1136,7 +1087,6 @@
             </w:r>
             <w:r>
               <w:rPr>
-                <w:rFonts w:ascii="Times New Roman" w:hAnsi="Times New Roman" w:cs="Times New Roman"/>
                 <w:noProof/>
                 <w:webHidden/>
               </w:rPr>
@@ -1144,7 +1094,6 @@
             </w:r>
             <w:r>
               <w:rPr>
-                <w:rFonts w:ascii="Times New Roman" w:hAnsi="Times New Roman" w:cs="Times New Roman"/>
                 <w:noProof/>
                 <w:webHidden/>
               </w:rPr>
@@ -1152,22 +1101,19 @@
             </w:r>
             <w:r>
               <w:rPr>
-                <w:rFonts w:ascii="Times New Roman" w:hAnsi="Times New Roman" w:cs="Times New Roman"/>
-                <w:noProof/>
-                <w:webHidden/>
-              </w:rPr>
-              <w:instrText xml:space="preserve"> PAGEREF _Toc230609824 \h </w:instrText>
-            </w:r>
-            <w:r>
-              <w:rPr>
-                <w:rFonts w:ascii="Times New Roman" w:hAnsi="Times New Roman" w:cs="Times New Roman"/>
-                <w:noProof/>
-                <w:webHidden/>
-              </w:rPr>
-            </w:r>
-            <w:r>
-              <w:rPr>
-                <w:rFonts w:ascii="Times New Roman" w:hAnsi="Times New Roman" w:cs="Times New Roman"/>
+                <w:noProof/>
+                <w:webHidden/>
+              </w:rPr>
+              <w:instrText xml:space="preserve"> PAGEREF _Toc231040763 \h </w:instrText>
+            </w:r>
+            <w:r>
+              <w:rPr>
+                <w:noProof/>
+                <w:webHidden/>
+              </w:rPr>
+            </w:r>
+            <w:r>
+              <w:rPr>
                 <w:noProof/>
                 <w:webHidden/>
               </w:rPr>
@@ -1175,7 +1121,6 @@
             </w:r>
             <w:r>
               <w:rPr>
-                <w:rFonts w:ascii="Times New Roman" w:hAnsi="Times New Roman" w:cs="Times New Roman"/>
                 <w:noProof/>
                 <w:webHidden/>
               </w:rPr>
@@ -1183,7 +1128,6 @@
             </w:r>
             <w:r>
               <w:rPr>
-                <w:rFonts w:ascii="Times New Roman" w:hAnsi="Times New Roman" w:cs="Times New Roman"/>
                 <w:noProof/>
                 <w:webHidden/>
               </w:rPr>
@@ -1198,26 +1142,24 @@
               <w:tab w:val="right" w:leader="dot" w:pos="8828"/>
             </w:tabs>
             <w:rPr>
-              <w:rFonts w:ascii="Times New Roman" w:eastAsiaTheme="minorEastAsia" w:hAnsi="Times New Roman" w:cs="Times New Roman"/>
+              <w:rFonts w:eastAsiaTheme="minorEastAsia"/>
               <w:noProof/>
               <w:kern w:val="0"/>
               <w:lang w:val="en-US"/>
               <w14:ligatures w14:val="none"/>
             </w:rPr>
           </w:pPr>
-          <w:hyperlink w:anchor="_Toc230609825" w:history="1">
+          <w:hyperlink w:anchor="_Toc231040764" w:history="1">
             <w:r>
               <w:rPr>
                 <w:rStyle w:val="Hipervnculo"/>
                 <w:rFonts w:ascii="Times New Roman" w:hAnsi="Times New Roman" w:cs="Times New Roman"/>
                 <w:noProof/>
-                <w:lang w:val="es-US"/>
-              </w:rPr>
-              <w:t>Función auxiliar</w:t>
-            </w:r>
-            <w:r>
-              <w:rPr>
-                <w:rFonts w:ascii="Times New Roman" w:hAnsi="Times New Roman" w:cs="Times New Roman"/>
+              </w:rPr>
+              <w:t>Interfaz de Usuario (DCL)</w:t>
+            </w:r>
+            <w:r>
+              <w:rPr>
                 <w:noProof/>
                 <w:webHidden/>
               </w:rPr>
@@ -1225,7 +1167,6 @@
             </w:r>
             <w:r>
               <w:rPr>
-                <w:rFonts w:ascii="Times New Roman" w:hAnsi="Times New Roman" w:cs="Times New Roman"/>
                 <w:noProof/>
                 <w:webHidden/>
               </w:rPr>
@@ -1233,22 +1174,19 @@
             </w:r>
             <w:r>
               <w:rPr>
-                <w:rFonts w:ascii="Times New Roman" w:hAnsi="Times New Roman" w:cs="Times New Roman"/>
-                <w:noProof/>
-                <w:webHidden/>
-              </w:rPr>
-              <w:instrText xml:space="preserve"> PAGEREF _Toc230609825 \h </w:instrText>
-            </w:r>
-            <w:r>
-              <w:rPr>
-                <w:rFonts w:ascii="Times New Roman" w:hAnsi="Times New Roman" w:cs="Times New Roman"/>
-                <w:noProof/>
-                <w:webHidden/>
-              </w:rPr>
-            </w:r>
-            <w:r>
-              <w:rPr>
-                <w:rFonts w:ascii="Times New Roman" w:hAnsi="Times New Roman" w:cs="Times New Roman"/>
+                <w:noProof/>
+                <w:webHidden/>
+              </w:rPr>
+              <w:instrText xml:space="preserve"> PAGEREF _Toc231040764 \h </w:instrText>
+            </w:r>
+            <w:r>
+              <w:rPr>
+                <w:noProof/>
+                <w:webHidden/>
+              </w:rPr>
+            </w:r>
+            <w:r>
+              <w:rPr>
                 <w:noProof/>
                 <w:webHidden/>
               </w:rPr>
@@ -1256,7 +1194,6 @@
             </w:r>
             <w:r>
               <w:rPr>
-                <w:rFonts w:ascii="Times New Roman" w:hAnsi="Times New Roman" w:cs="Times New Roman"/>
                 <w:noProof/>
                 <w:webHidden/>
               </w:rPr>
@@ -1264,7 +1201,6 @@
             </w:r>
             <w:r>
               <w:rPr>
-                <w:rFonts w:ascii="Times New Roman" w:hAnsi="Times New Roman" w:cs="Times New Roman"/>
                 <w:noProof/>
                 <w:webHidden/>
               </w:rPr>
@@ -1279,26 +1215,24 @@
               <w:tab w:val="right" w:leader="dot" w:pos="8828"/>
             </w:tabs>
             <w:rPr>
-              <w:rFonts w:ascii="Times New Roman" w:eastAsiaTheme="minorEastAsia" w:hAnsi="Times New Roman" w:cs="Times New Roman"/>
+              <w:rFonts w:eastAsiaTheme="minorEastAsia"/>
               <w:noProof/>
               <w:kern w:val="0"/>
               <w:lang w:val="en-US"/>
               <w14:ligatures w14:val="none"/>
             </w:rPr>
           </w:pPr>
-          <w:hyperlink w:anchor="_Toc230609826" w:history="1">
+          <w:hyperlink w:anchor="_Toc231040765" w:history="1">
             <w:r>
               <w:rPr>
                 <w:rStyle w:val="Hipervnculo"/>
-                <w:rFonts w:ascii="Times New Roman" w:hAnsi="Times New Roman" w:cs="Times New Roman"/>
-                <w:noProof/>
-                <w:lang w:val="es-US"/>
-              </w:rPr>
-              <w:t>Editar datos</w:t>
-            </w:r>
-            <w:r>
-              <w:rPr>
-                <w:rFonts w:ascii="Times New Roman" w:hAnsi="Times New Roman" w:cs="Times New Roman"/>
+                <w:rFonts w:ascii="Times New Roman" w:eastAsia="Times New Roman" w:hAnsi="Times New Roman" w:cs="Times New Roman"/>
+                <w:noProof/>
+              </w:rPr>
+              <w:t>Lógica de Persistencia (XData)</w:t>
+            </w:r>
+            <w:r>
+              <w:rPr>
                 <w:noProof/>
                 <w:webHidden/>
               </w:rPr>
@@ -1306,7 +1240,6 @@
             </w:r>
             <w:r>
               <w:rPr>
-                <w:rFonts w:ascii="Times New Roman" w:hAnsi="Times New Roman" w:cs="Times New Roman"/>
                 <w:noProof/>
                 <w:webHidden/>
               </w:rPr>
@@ -1314,22 +1247,19 @@
             </w:r>
             <w:r>
               <w:rPr>
-                <w:rFonts w:ascii="Times New Roman" w:hAnsi="Times New Roman" w:cs="Times New Roman"/>
-                <w:noProof/>
-                <w:webHidden/>
-              </w:rPr>
-              <w:instrText xml:space="preserve"> PAGEREF _Toc230609826 \h </w:instrText>
-            </w:r>
-            <w:r>
-              <w:rPr>
-                <w:rFonts w:ascii="Times New Roman" w:hAnsi="Times New Roman" w:cs="Times New Roman"/>
-                <w:noProof/>
-                <w:webHidden/>
-              </w:rPr>
-            </w:r>
-            <w:r>
-              <w:rPr>
-                <w:rFonts w:ascii="Times New Roman" w:hAnsi="Times New Roman" w:cs="Times New Roman"/>
+                <w:noProof/>
+                <w:webHidden/>
+              </w:rPr>
+              <w:instrText xml:space="preserve"> PAGEREF _Toc231040765 \h </w:instrText>
+            </w:r>
+            <w:r>
+              <w:rPr>
+                <w:noProof/>
+                <w:webHidden/>
+              </w:rPr>
+            </w:r>
+            <w:r>
+              <w:rPr>
                 <w:noProof/>
                 <w:webHidden/>
               </w:rPr>
@@ -1337,7 +1267,6 @@
             </w:r>
             <w:r>
               <w:rPr>
-                <w:rFonts w:ascii="Times New Roman" w:hAnsi="Times New Roman" w:cs="Times New Roman"/>
                 <w:noProof/>
                 <w:webHidden/>
               </w:rPr>
@@ -1345,7 +1274,6 @@
             </w:r>
             <w:r>
               <w:rPr>
-                <w:rFonts w:ascii="Times New Roman" w:hAnsi="Times New Roman" w:cs="Times New Roman"/>
                 <w:noProof/>
                 <w:webHidden/>
               </w:rPr>
@@ -1360,14 +1288,87 @@
               <w:tab w:val="right" w:leader="dot" w:pos="8828"/>
             </w:tabs>
             <w:rPr>
-              <w:rFonts w:ascii="Times New Roman" w:eastAsiaTheme="minorEastAsia" w:hAnsi="Times New Roman" w:cs="Times New Roman"/>
+              <w:rFonts w:eastAsiaTheme="minorEastAsia"/>
               <w:noProof/>
               <w:kern w:val="0"/>
               <w:lang w:val="en-US"/>
               <w14:ligatures w14:val="none"/>
             </w:rPr>
           </w:pPr>
-          <w:hyperlink w:anchor="_Toc230609827" w:history="1">
+          <w:hyperlink w:anchor="_Toc231040766" w:history="1">
+            <w:r>
+              <w:rPr>
+                <w:rStyle w:val="Hipervnculo"/>
+                <w:rFonts w:ascii="Times New Roman" w:eastAsia="Times New Roman" w:hAnsi="Times New Roman" w:cs="Times New Roman"/>
+                <w:noProof/>
+              </w:rPr>
+              <w:t>Automatización y Análisis (Cálculo de Consumo)</w:t>
+            </w:r>
+            <w:r>
+              <w:rPr>
+                <w:noProof/>
+                <w:webHidden/>
+              </w:rPr>
+              <w:tab/>
+            </w:r>
+            <w:r>
+              <w:rPr>
+                <w:noProof/>
+                <w:webHidden/>
+              </w:rPr>
+              <w:fldChar w:fldCharType="begin"/>
+            </w:r>
+            <w:r>
+              <w:rPr>
+                <w:noProof/>
+                <w:webHidden/>
+              </w:rPr>
+              <w:instrText xml:space="preserve"> PAGEREF _Toc231040766 \h </w:instrText>
+            </w:r>
+            <w:r>
+              <w:rPr>
+                <w:noProof/>
+                <w:webHidden/>
+              </w:rPr>
+            </w:r>
+            <w:r>
+              <w:rPr>
+                <w:noProof/>
+                <w:webHidden/>
+              </w:rPr>
+              <w:fldChar w:fldCharType="separate"/>
+            </w:r>
+            <w:r>
+              <w:rPr>
+                <w:noProof/>
+                <w:webHidden/>
+              </w:rPr>
+              <w:t>10</w:t>
+            </w:r>
+            <w:r>
+              <w:rPr>
+                <w:noProof/>
+                <w:webHidden/>
+              </w:rPr>
+              <w:fldChar w:fldCharType="end"/>
+            </w:r>
+          </w:hyperlink>
+        </w:p>
+        <w:p>
+          <w:pPr>
+            <w:pStyle w:val="TDC2"/>
+            <w:tabs>
+              <w:tab w:val="right" w:leader="dot" w:pos="8828"/>
+            </w:tabs>
+            <w:rPr>
+              <w:rFonts w:eastAsiaTheme="minorEastAsia"/>
+              <w:noProof/>
+              <w:kern w:val="0"/>
+              <w:lang w:val="en-US"/>
+              <w14:ligatures w14:val="none"/>
+            </w:rPr>
+          </w:pPr>
+          <w:hyperlink w:anchor="_Toc231040767" w:history="1">
             <w:r>
               <w:rPr>
                 <w:rStyle w:val="Hipervnculo"/>
@@ -1375,11 +1376,158 @@
                 <w:noProof/>
                 <w:lang w:val="es-US"/>
               </w:rPr>
+              <w:t>Función auxiliar</w:t>
+            </w:r>
+            <w:r>
+              <w:rPr>
+                <w:noProof/>
+                <w:webHidden/>
+              </w:rPr>
+              <w:tab/>
+            </w:r>
+            <w:r>
+              <w:rPr>
+                <w:noProof/>
+                <w:webHidden/>
+              </w:rPr>
+              <w:fldChar w:fldCharType="begin"/>
+            </w:r>
+            <w:r>
+              <w:rPr>
+                <w:noProof/>
+                <w:webHidden/>
+              </w:rPr>
+              <w:instrText xml:space="preserve"> PAGEREF _Toc231040767 \h </w:instrText>
+            </w:r>
+            <w:r>
+              <w:rPr>
+                <w:noProof/>
+                <w:webHidden/>
+              </w:rPr>
+            </w:r>
+            <w:r>
+              <w:rPr>
+                <w:noProof/>
+                <w:webHidden/>
+              </w:rPr>
+              <w:fldChar w:fldCharType="separate"/>
+            </w:r>
+            <w:r>
+              <w:rPr>
+                <w:noProof/>
+                <w:webHidden/>
+              </w:rPr>
+              <w:t>11</w:t>
+            </w:r>
+            <w:r>
+              <w:rPr>
+                <w:noProof/>
+                <w:webHidden/>
+              </w:rPr>
+              <w:fldChar w:fldCharType="end"/>
+            </w:r>
+          </w:hyperlink>
+        </w:p>
+        <w:p>
+          <w:pPr>
+            <w:pStyle w:val="TDC2"/>
+            <w:tabs>
+              <w:tab w:val="right" w:leader="dot" w:pos="8828"/>
+            </w:tabs>
+            <w:rPr>
+              <w:rFonts w:eastAsiaTheme="minorEastAsia"/>
+              <w:noProof/>
+              <w:kern w:val="0"/>
+              <w:lang w:val="en-US"/>
+              <w14:ligatures w14:val="none"/>
+            </w:rPr>
+          </w:pPr>
+          <w:hyperlink w:anchor="_Toc231040768" w:history="1">
+            <w:r>
+              <w:rPr>
+                <w:rStyle w:val="Hipervnculo"/>
+                <w:rFonts w:ascii="Times New Roman" w:hAnsi="Times New Roman" w:cs="Times New Roman"/>
+                <w:noProof/>
+                <w:lang w:val="es-US"/>
+              </w:rPr>
+              <w:t>Editar datos</w:t>
+            </w:r>
+            <w:r>
+              <w:rPr>
+                <w:noProof/>
+                <w:webHidden/>
+              </w:rPr>
+              <w:tab/>
+            </w:r>
+            <w:r>
+              <w:rPr>
+                <w:noProof/>
+                <w:webHidden/>
+              </w:rPr>
+              <w:fldChar w:fldCharType="begin"/>
+            </w:r>
+            <w:r>
+              <w:rPr>
+                <w:noProof/>
+                <w:webHidden/>
+              </w:rPr>
+              <w:instrText xml:space="preserve"> PAGEREF _Toc231040768 \h </w:instrText>
+            </w:r>
+            <w:r>
+              <w:rPr>
+                <w:noProof/>
+                <w:webHidden/>
+              </w:rPr>
+            </w:r>
+            <w:r>
+              <w:rPr>
+                <w:noProof/>
+                <w:webHidden/>
+              </w:rPr>
+              <w:fldChar w:fldCharType="separate"/>
+            </w:r>
+            <w:r>
+              <w:rPr>
+                <w:noProof/>
+                <w:webHidden/>
+              </w:rPr>
+              <w:t>12</w:t>
+            </w:r>
+            <w:r>
+              <w:rPr>
+                <w:noProof/>
+                <w:webHidden/>
+              </w:rPr>
+              <w:fldChar w:fldCharType="end"/>
+            </w:r>
+          </w:hyperlink>
+        </w:p>
+        <w:p>
+          <w:pPr>
+            <w:pStyle w:val="TDC2"/>
+            <w:tabs>
+              <w:tab w:val="right" w:leader="dot" w:pos="8828"/>
+            </w:tabs>
+            <w:rPr>
+              <w:rFonts w:eastAsiaTheme="minorEastAsia"/>
+              <w:noProof/>
+              <w:kern w:val="0"/>
+              <w:lang w:val="en-US"/>
+              <w14:ligatures w14:val="none"/>
+            </w:rPr>
+          </w:pPr>
+          <w:hyperlink w:anchor="_Toc231040769" w:history="1">
+            <w:r>
+              <w:rPr>
+                <w:rStyle w:val="Hipervnculo"/>
+                <w:rFonts w:ascii="Times New Roman" w:hAnsi="Times New Roman" w:cs="Times New Roman"/>
+                <w:noProof/>
+                <w:lang w:val="es-US"/>
+              </w:rPr>
               <w:t>Calcular consumo</w:t>
             </w:r>
             <w:r>
               <w:rPr>
-                <w:rFonts w:ascii="Times New Roman" w:hAnsi="Times New Roman" w:cs="Times New Roman"/>
                 <w:noProof/>
                 <w:webHidden/>
               </w:rPr>
@@ -1387,7 +1535,6 @@
             </w:r>
             <w:r>
               <w:rPr>
-                <w:rFonts w:ascii="Times New Roman" w:hAnsi="Times New Roman" w:cs="Times New Roman"/>
                 <w:noProof/>
                 <w:webHidden/>
               </w:rPr>
@@ -1395,22 +1542,19 @@
             </w:r>
             <w:r>
               <w:rPr>
-                <w:rFonts w:ascii="Times New Roman" w:hAnsi="Times New Roman" w:cs="Times New Roman"/>
-                <w:noProof/>
-                <w:webHidden/>
-              </w:rPr>
-              <w:instrText xml:space="preserve"> PAGEREF _Toc230609827 \h </w:instrText>
-            </w:r>
-            <w:r>
-              <w:rPr>
-                <w:rFonts w:ascii="Times New Roman" w:hAnsi="Times New Roman" w:cs="Times New Roman"/>
-                <w:noProof/>
-                <w:webHidden/>
-              </w:rPr>
-            </w:r>
-            <w:r>
-              <w:rPr>
-                <w:rFonts w:ascii="Times New Roman" w:hAnsi="Times New Roman" w:cs="Times New Roman"/>
+                <w:noProof/>
+                <w:webHidden/>
+              </w:rPr>
+              <w:instrText xml:space="preserve"> PAGEREF _Toc231040769 \h </w:instrText>
+            </w:r>
+            <w:r>
+              <w:rPr>
+                <w:noProof/>
+                <w:webHidden/>
+              </w:rPr>
+            </w:r>
+            <w:r>
+              <w:rPr>
                 <w:noProof/>
                 <w:webHidden/>
               </w:rPr>
@@ -1418,15 +1562,13 @@
             </w:r>
             <w:r>
               <w:rPr>
-                <w:rFonts w:ascii="Times New Roman" w:hAnsi="Times New Roman" w:cs="Times New Roman"/>
-                <w:noProof/>
-                <w:webHidden/>
-              </w:rPr>
-              <w:t>10</w:t>
-            </w:r>
-            <w:r>
-              <w:rPr>
-                <w:rFonts w:ascii="Times New Roman" w:hAnsi="Times New Roman" w:cs="Times New Roman"/>
+                <w:noProof/>
+                <w:webHidden/>
+              </w:rPr>
+              <w:t>13</w:t>
+            </w:r>
+            <w:r>
+              <w:rPr>
                 <w:noProof/>
                 <w:webHidden/>
               </w:rPr>
@@ -1441,14 +1583,14 @@
               <w:tab w:val="right" w:leader="dot" w:pos="8828"/>
             </w:tabs>
             <w:rPr>
-              <w:rFonts w:ascii="Times New Roman" w:eastAsiaTheme="minorEastAsia" w:hAnsi="Times New Roman" w:cs="Times New Roman"/>
+              <w:rFonts w:eastAsiaTheme="minorEastAsia"/>
               <w:noProof/>
               <w:kern w:val="0"/>
               <w:lang w:val="en-US"/>
               <w14:ligatures w14:val="none"/>
             </w:rPr>
           </w:pPr>
-          <w:hyperlink w:anchor="_Toc230609828" w:history="1">
+          <w:hyperlink w:anchor="_Toc231040770" w:history="1">
             <w:r>
               <w:rPr>
                 <w:rStyle w:val="Hipervnculo"/>
@@ -1460,7 +1602,6 @@
             </w:r>
             <w:r>
               <w:rPr>
-                <w:rFonts w:ascii="Times New Roman" w:hAnsi="Times New Roman" w:cs="Times New Roman"/>
                 <w:noProof/>
                 <w:webHidden/>
               </w:rPr>
@@ -1468,7 +1609,6 @@
             </w:r>
             <w:r>
               <w:rPr>
-                <w:rFonts w:ascii="Times New Roman" w:hAnsi="Times New Roman" w:cs="Times New Roman"/>
                 <w:noProof/>
                 <w:webHidden/>
               </w:rPr>
@@ -1476,22 +1616,19 @@
             </w:r>
             <w:r>
               <w:rPr>
-                <w:rFonts w:ascii="Times New Roman" w:hAnsi="Times New Roman" w:cs="Times New Roman"/>
-                <w:noProof/>
-                <w:webHidden/>
-              </w:rPr>
-              <w:instrText xml:space="preserve"> PAGEREF _Toc230609828 \h </w:instrText>
-            </w:r>
-            <w:r>
-              <w:rPr>
-                <w:rFonts w:ascii="Times New Roman" w:hAnsi="Times New Roman" w:cs="Times New Roman"/>
-                <w:noProof/>
-                <w:webHidden/>
-              </w:rPr>
-            </w:r>
-            <w:r>
-              <w:rPr>
-                <w:rFonts w:ascii="Times New Roman" w:hAnsi="Times New Roman" w:cs="Times New Roman"/>
+                <w:noProof/>
+                <w:webHidden/>
+              </w:rPr>
+              <w:instrText xml:space="preserve"> PAGEREF _Toc231040770 \h </w:instrText>
+            </w:r>
+            <w:r>
+              <w:rPr>
+                <w:noProof/>
+                <w:webHidden/>
+              </w:rPr>
+            </w:r>
+            <w:r>
+              <w:rPr>
                 <w:noProof/>
                 <w:webHidden/>
               </w:rPr>
@@ -1499,15 +1636,13 @@
             </w:r>
             <w:r>
               <w:rPr>
-                <w:rFonts w:ascii="Times New Roman" w:hAnsi="Times New Roman" w:cs="Times New Roman"/>
-                <w:noProof/>
-                <w:webHidden/>
-              </w:rPr>
-              <w:t>11</w:t>
-            </w:r>
-            <w:r>
-              <w:rPr>
-                <w:rFonts w:ascii="Times New Roman" w:hAnsi="Times New Roman" w:cs="Times New Roman"/>
+                <w:noProof/>
+                <w:webHidden/>
+              </w:rPr>
+              <w:t>15</w:t>
+            </w:r>
+            <w:r>
+              <w:rPr>
                 <w:noProof/>
                 <w:webHidden/>
               </w:rPr>
@@ -1522,14 +1657,14 @@
               <w:tab w:val="right" w:leader="dot" w:pos="8828"/>
             </w:tabs>
             <w:rPr>
-              <w:rFonts w:ascii="Times New Roman" w:eastAsiaTheme="minorEastAsia" w:hAnsi="Times New Roman" w:cs="Times New Roman"/>
+              <w:rFonts w:eastAsiaTheme="minorEastAsia"/>
               <w:noProof/>
               <w:kern w:val="0"/>
               <w:lang w:val="en-US"/>
               <w14:ligatures w14:val="none"/>
             </w:rPr>
           </w:pPr>
-          <w:hyperlink w:anchor="_Toc230609829" w:history="1">
+          <w:hyperlink w:anchor="_Toc231040771" w:history="1">
             <w:r>
               <w:rPr>
                 <w:rStyle w:val="Hipervnculo"/>
@@ -1541,7 +1676,6 @@
             </w:r>
             <w:r>
               <w:rPr>
-                <w:rFonts w:ascii="Times New Roman" w:hAnsi="Times New Roman" w:cs="Times New Roman"/>
                 <w:noProof/>
                 <w:webHidden/>
               </w:rPr>
@@ -1549,7 +1683,6 @@
             </w:r>
             <w:r>
               <w:rPr>
-                <w:rFonts w:ascii="Times New Roman" w:hAnsi="Times New Roman" w:cs="Times New Roman"/>
                 <w:noProof/>
                 <w:webHidden/>
               </w:rPr>
@@ -1557,22 +1690,19 @@
             </w:r>
             <w:r>
               <w:rPr>
-                <w:rFonts w:ascii="Times New Roman" w:hAnsi="Times New Roman" w:cs="Times New Roman"/>
-                <w:noProof/>
-                <w:webHidden/>
-              </w:rPr>
-              <w:instrText xml:space="preserve"> PAGEREF _Toc230609829 \h </w:instrText>
-            </w:r>
-            <w:r>
-              <w:rPr>
-                <w:rFonts w:ascii="Times New Roman" w:hAnsi="Times New Roman" w:cs="Times New Roman"/>
-                <w:noProof/>
-                <w:webHidden/>
-              </w:rPr>
-            </w:r>
-            <w:r>
-              <w:rPr>
-                <w:rFonts w:ascii="Times New Roman" w:hAnsi="Times New Roman" w:cs="Times New Roman"/>
+                <w:noProof/>
+                <w:webHidden/>
+              </w:rPr>
+              <w:instrText xml:space="preserve"> PAGEREF _Toc231040771 \h </w:instrText>
+            </w:r>
+            <w:r>
+              <w:rPr>
+                <w:noProof/>
+                <w:webHidden/>
+              </w:rPr>
+            </w:r>
+            <w:r>
+              <w:rPr>
                 <w:noProof/>
                 <w:webHidden/>
               </w:rPr>
@@ -1580,15 +1710,13 @@
             </w:r>
             <w:r>
               <w:rPr>
-                <w:rFonts w:ascii="Times New Roman" w:hAnsi="Times New Roman" w:cs="Times New Roman"/>
-                <w:noProof/>
-                <w:webHidden/>
-              </w:rPr>
-              <w:t>12</w:t>
-            </w:r>
-            <w:r>
-              <w:rPr>
-                <w:rFonts w:ascii="Times New Roman" w:hAnsi="Times New Roman" w:cs="Times New Roman"/>
+                <w:noProof/>
+                <w:webHidden/>
+              </w:rPr>
+              <w:t>16</w:t>
+            </w:r>
+            <w:r>
+              <w:rPr>
                 <w:noProof/>
                 <w:webHidden/>
               </w:rPr>
@@ -1603,14 +1731,14 @@
               <w:tab w:val="right" w:leader="dot" w:pos="8828"/>
             </w:tabs>
             <w:rPr>
-              <w:rFonts w:ascii="Times New Roman" w:eastAsiaTheme="minorEastAsia" w:hAnsi="Times New Roman" w:cs="Times New Roman"/>
+              <w:rFonts w:eastAsiaTheme="minorEastAsia"/>
               <w:noProof/>
               <w:kern w:val="0"/>
               <w:lang w:val="en-US"/>
               <w14:ligatures w14:val="none"/>
             </w:rPr>
           </w:pPr>
-          <w:hyperlink w:anchor="_Toc230609830" w:history="1">
+          <w:hyperlink w:anchor="_Toc231040772" w:history="1">
             <w:r>
               <w:rPr>
                 <w:rStyle w:val="Hipervnculo"/>
@@ -1622,7 +1750,6 @@
             </w:r>
             <w:r>
               <w:rPr>
-                <w:rFonts w:ascii="Times New Roman" w:hAnsi="Times New Roman" w:cs="Times New Roman"/>
                 <w:noProof/>
                 <w:webHidden/>
               </w:rPr>
@@ -1630,7 +1757,6 @@
             </w:r>
             <w:r>
               <w:rPr>
-                <w:rFonts w:ascii="Times New Roman" w:hAnsi="Times New Roman" w:cs="Times New Roman"/>
                 <w:noProof/>
                 <w:webHidden/>
               </w:rPr>
@@ -1638,22 +1764,19 @@
             </w:r>
             <w:r>
               <w:rPr>
-                <w:rFonts w:ascii="Times New Roman" w:hAnsi="Times New Roman" w:cs="Times New Roman"/>
-                <w:noProof/>
-                <w:webHidden/>
-              </w:rPr>
-              <w:instrText xml:space="preserve"> PAGEREF _Toc230609830 \h </w:instrText>
-            </w:r>
-            <w:r>
-              <w:rPr>
-                <w:rFonts w:ascii="Times New Roman" w:hAnsi="Times New Roman" w:cs="Times New Roman"/>
-                <w:noProof/>
-                <w:webHidden/>
-              </w:rPr>
-            </w:r>
-            <w:r>
-              <w:rPr>
-                <w:rFonts w:ascii="Times New Roman" w:hAnsi="Times New Roman" w:cs="Times New Roman"/>
+                <w:noProof/>
+                <w:webHidden/>
+              </w:rPr>
+              <w:instrText xml:space="preserve"> PAGEREF _Toc231040772 \h </w:instrText>
+            </w:r>
+            <w:r>
+              <w:rPr>
+                <w:noProof/>
+                <w:webHidden/>
+              </w:rPr>
+            </w:r>
+            <w:r>
+              <w:rPr>
                 <w:noProof/>
                 <w:webHidden/>
               </w:rPr>
@@ -1661,15 +1784,13 @@
             </w:r>
             <w:r>
               <w:rPr>
-                <w:rFonts w:ascii="Times New Roman" w:hAnsi="Times New Roman" w:cs="Times New Roman"/>
-                <w:noProof/>
-                <w:webHidden/>
-              </w:rPr>
-              <w:t>13</w:t>
-            </w:r>
-            <w:r>
-              <w:rPr>
-                <w:rFonts w:ascii="Times New Roman" w:hAnsi="Times New Roman" w:cs="Times New Roman"/>
+                <w:noProof/>
+                <w:webHidden/>
+              </w:rPr>
+              <w:t>18</w:t>
+            </w:r>
+            <w:r>
+              <w:rPr>
                 <w:noProof/>
                 <w:webHidden/>
               </w:rPr>
@@ -1684,14 +1805,14 @@
               <w:tab w:val="right" w:leader="dot" w:pos="8828"/>
             </w:tabs>
             <w:rPr>
-              <w:rFonts w:ascii="Times New Roman" w:eastAsiaTheme="minorEastAsia" w:hAnsi="Times New Roman" w:cs="Times New Roman"/>
+              <w:rFonts w:eastAsiaTheme="minorEastAsia"/>
               <w:noProof/>
               <w:kern w:val="0"/>
               <w:lang w:val="en-US"/>
               <w14:ligatures w14:val="none"/>
             </w:rPr>
           </w:pPr>
-          <w:hyperlink w:anchor="_Toc230609831" w:history="1">
+          <w:hyperlink w:anchor="_Toc231040773" w:history="1">
             <w:r>
               <w:rPr>
                 <w:rStyle w:val="Hipervnculo"/>
@@ -1703,7 +1824,6 @@
             </w:r>
             <w:r>
               <w:rPr>
-                <w:rFonts w:ascii="Times New Roman" w:hAnsi="Times New Roman" w:cs="Times New Roman"/>
                 <w:noProof/>
                 <w:webHidden/>
               </w:rPr>
@@ -1711,7 +1831,6 @@
             </w:r>
             <w:r>
               <w:rPr>
-                <w:rFonts w:ascii="Times New Roman" w:hAnsi="Times New Roman" w:cs="Times New Roman"/>
                 <w:noProof/>
                 <w:webHidden/>
               </w:rPr>
@@ -1719,22 +1838,19 @@
             </w:r>
             <w:r>
               <w:rPr>
-                <w:rFonts w:ascii="Times New Roman" w:hAnsi="Times New Roman" w:cs="Times New Roman"/>
-                <w:noProof/>
-                <w:webHidden/>
-              </w:rPr>
-              <w:instrText xml:space="preserve"> PAGEREF _Toc230609831 \h </w:instrText>
-            </w:r>
-            <w:r>
-              <w:rPr>
-                <w:rFonts w:ascii="Times New Roman" w:hAnsi="Times New Roman" w:cs="Times New Roman"/>
-                <w:noProof/>
-                <w:webHidden/>
-              </w:rPr>
-            </w:r>
-            <w:r>
-              <w:rPr>
-                <w:rFonts w:ascii="Times New Roman" w:hAnsi="Times New Roman" w:cs="Times New Roman"/>
+                <w:noProof/>
+                <w:webHidden/>
+              </w:rPr>
+              <w:instrText xml:space="preserve"> PAGEREF _Toc231040773 \h </w:instrText>
+            </w:r>
+            <w:r>
+              <w:rPr>
+                <w:noProof/>
+                <w:webHidden/>
+              </w:rPr>
+            </w:r>
+            <w:r>
+              <w:rPr>
                 <w:noProof/>
                 <w:webHidden/>
               </w:rPr>
@@ -1742,15 +1858,13 @@
             </w:r>
             <w:r>
               <w:rPr>
-                <w:rFonts w:ascii="Times New Roman" w:hAnsi="Times New Roman" w:cs="Times New Roman"/>
-                <w:noProof/>
-                <w:webHidden/>
-              </w:rPr>
-              <w:t>14</w:t>
-            </w:r>
-            <w:r>
-              <w:rPr>
-                <w:rFonts w:ascii="Times New Roman" w:hAnsi="Times New Roman" w:cs="Times New Roman"/>
+                <w:noProof/>
+                <w:webHidden/>
+              </w:rPr>
+              <w:t>19</w:t>
+            </w:r>
+            <w:r>
+              <w:rPr>
                 <w:noProof/>
                 <w:webHidden/>
               </w:rPr>
@@ -1807,7 +1921,7 @@
           <w:lang w:val="es-US"/>
         </w:rPr>
       </w:pPr>
-      <w:bookmarkStart w:id="0" w:name="_Toc230609817"/>
+      <w:bookmarkStart w:id="0" w:name="_Toc231040756"/>
       <w:r>
         <w:rPr>
           <w:rFonts w:ascii="Times New Roman" w:hAnsi="Times New Roman" w:cs="Times New Roman"/>
@@ -2001,7 +2115,7 @@
           <w:lang w:val="es-US"/>
         </w:rPr>
       </w:pPr>
-      <w:bookmarkStart w:id="1" w:name="_Toc230609818"/>
+      <w:bookmarkStart w:id="1" w:name="_Toc231040757"/>
       <w:r>
         <w:rPr>
           <w:rFonts w:ascii="Times New Roman" w:hAnsi="Times New Roman" w:cs="Times New Roman"/>
@@ -2197,7 +2311,7 @@
           <w:lang w:val="es-US"/>
         </w:rPr>
       </w:pPr>
-      <w:bookmarkStart w:id="2" w:name="_Toc230609819"/>
+      <w:bookmarkStart w:id="2" w:name="_Toc231040758"/>
       <w:r>
         <w:rPr>
           <w:rFonts w:ascii="Times New Roman" w:hAnsi="Times New Roman" w:cs="Times New Roman"/>
@@ -2238,7 +2352,7 @@
           <w:lang w:val="es-US"/>
         </w:rPr>
       </w:pPr>
-      <w:bookmarkStart w:id="3" w:name="_Toc230609820"/>
+      <w:bookmarkStart w:id="3" w:name="_Toc231040759"/>
       <w:r>
         <w:rPr>
           <w:rFonts w:ascii="Times New Roman" w:hAnsi="Times New Roman" w:cs="Times New Roman"/>
@@ -2793,7 +2907,7 @@
           <w:lang w:val="es-US"/>
         </w:rPr>
       </w:pPr>
-      <w:bookmarkStart w:id="4" w:name="_Toc230609821"/>
+      <w:bookmarkStart w:id="4" w:name="_Toc231040760"/>
       <w:r>
         <w:rPr>
           <w:rFonts w:ascii="Times New Roman" w:hAnsi="Times New Roman" w:cs="Times New Roman"/>
@@ -2922,6 +3036,7 @@
         </w:rPr>
         <w:t xml:space="preserve"> nos agregara los datos extendidos a un objeto deseado, mientras que </w:t>
       </w:r>
+      <w:proofErr w:type="spellStart"/>
       <w:r>
         <w:rPr>
           <w:rFonts w:ascii="Times New Roman" w:hAnsi="Times New Roman" w:cs="Times New Roman"/>
@@ -2929,7 +3044,17 @@
           <w:iCs/>
           <w:lang w:val="es-US"/>
         </w:rPr>
-        <w:t xml:space="preserve">List </w:t>
+        <w:t>List</w:t>
+      </w:r>
+      <w:proofErr w:type="spellEnd"/>
+      <w:r>
+        <w:rPr>
+          <w:rFonts w:ascii="Times New Roman" w:hAnsi="Times New Roman" w:cs="Times New Roman"/>
+          <w:i/>
+          <w:iCs/>
+          <w:lang w:val="es-US"/>
+        </w:rPr>
+        <w:t xml:space="preserve"> </w:t>
       </w:r>
       <w:proofErr w:type="spellStart"/>
       <w:r>
@@ -2975,7 +3100,7 @@
           <w:lang w:val="es-US"/>
         </w:rPr>
       </w:pPr>
-      <w:bookmarkStart w:id="5" w:name="_Toc230609822"/>
+      <w:bookmarkStart w:id="5" w:name="_Toc231040761"/>
       <w:r>
         <w:rPr>
           <w:rFonts w:ascii="Times New Roman" w:hAnsi="Times New Roman" w:cs="Times New Roman"/>
@@ -3046,7 +3171,7 @@
           <w:lang w:val="es-US"/>
         </w:rPr>
       </w:pPr>
-      <w:bookmarkStart w:id="6" w:name="_Toc230609823"/>
+      <w:bookmarkStart w:id="6" w:name="_Toc231040762"/>
       <w:r>
         <w:rPr>
           <w:rFonts w:ascii="Times New Roman" w:hAnsi="Times New Roman" w:cs="Times New Roman"/>
@@ -3882,7 +4007,7 @@
           <w:lang w:val="es-US"/>
         </w:rPr>
       </w:pPr>
-      <w:bookmarkStart w:id="7" w:name="_Toc230609824"/>
+      <w:bookmarkStart w:id="7" w:name="_Toc231040763"/>
       <w:r>
         <w:rPr>
           <w:rFonts w:ascii="Times New Roman" w:hAnsi="Times New Roman" w:cs="Times New Roman"/>
@@ -4026,12 +4151,14 @@
           <w:rFonts w:ascii="Times New Roman" w:hAnsi="Times New Roman" w:cs="Times New Roman"/>
         </w:rPr>
       </w:pPr>
+      <w:bookmarkStart w:id="8" w:name="_Toc231040764"/>
       <w:r>
         <w:rPr>
           <w:rFonts w:ascii="Times New Roman" w:hAnsi="Times New Roman" w:cs="Times New Roman"/>
         </w:rPr>
         <w:t>Interfaz de Usuario (DCL)</w:t>
       </w:r>
+      <w:bookmarkEnd w:id="8"/>
     </w:p>
     <w:p>
       <w:pPr>
@@ -4130,6 +4257,7 @@
           <w:rFonts w:ascii="Times New Roman" w:eastAsia="Times New Roman" w:hAnsi="Times New Roman" w:cs="Times New Roman"/>
         </w:rPr>
       </w:pPr>
+      <w:bookmarkStart w:id="9" w:name="_Toc231040765"/>
       <w:r>
         <w:rPr>
           <w:rFonts w:ascii="Times New Roman" w:eastAsia="Times New Roman" w:hAnsi="Times New Roman" w:cs="Times New Roman"/>
@@ -4150,6 +4278,7 @@
         </w:rPr>
         <w:t>)</w:t>
       </w:r>
+      <w:bookmarkEnd w:id="9"/>
     </w:p>
     <w:p>
       <w:pPr>
@@ -4248,12 +4377,14 @@
           <w:rFonts w:ascii="Times New Roman" w:eastAsia="Times New Roman" w:hAnsi="Times New Roman" w:cs="Times New Roman"/>
         </w:rPr>
       </w:pPr>
+      <w:bookmarkStart w:id="10" w:name="_Toc231040766"/>
       <w:r>
         <w:rPr>
           <w:rFonts w:ascii="Times New Roman" w:eastAsia="Times New Roman" w:hAnsi="Times New Roman" w:cs="Times New Roman"/>
         </w:rPr>
         <w:t>Automatización y Análisis (Cálculo de Consumo)</w:t>
       </w:r>
+      <w:bookmarkEnd w:id="10"/>
     </w:p>
     <w:p>
       <w:pPr>
@@ -4360,7 +4491,7 @@
           <w:lang w:val="es-US"/>
         </w:rPr>
       </w:pPr>
-      <w:bookmarkStart w:id="8" w:name="_Toc230609825"/>
+      <w:bookmarkStart w:id="11" w:name="_Toc231040767"/>
       <w:r>
         <w:rPr>
           <w:rFonts w:ascii="Times New Roman" w:hAnsi="Times New Roman" w:cs="Times New Roman"/>
@@ -4369,7 +4500,7 @@
         <w:lastRenderedPageBreak/>
         <w:t>Función auxiliar</w:t>
       </w:r>
-      <w:bookmarkEnd w:id="8"/>
+      <w:bookmarkEnd w:id="11"/>
     </w:p>
     <w:p>
       <w:pPr>
@@ -4865,7 +4996,6 @@
           <w:lang w:val="es-US"/>
         </w:rPr>
       </w:pPr>
-      <w:bookmarkStart w:id="9" w:name="_Toc230609826"/>
       <w:r>
         <w:rPr>
           <w:rFonts w:ascii="Times New Roman" w:hAnsi="Times New Roman" w:cs="Times New Roman"/>
@@ -4882,6 +5012,7 @@
           <w:lang w:val="es-US"/>
         </w:rPr>
       </w:pPr>
+      <w:bookmarkStart w:id="12" w:name="_Toc231040768"/>
       <w:r>
         <w:rPr>
           <w:rFonts w:ascii="Times New Roman" w:hAnsi="Times New Roman" w:cs="Times New Roman"/>
@@ -4890,7 +5021,7 @@
         <w:lastRenderedPageBreak/>
         <w:t>Editar datos</w:t>
       </w:r>
-      <w:bookmarkEnd w:id="9"/>
+      <w:bookmarkEnd w:id="12"/>
     </w:p>
     <w:p>
       <w:pPr>
@@ -5313,7 +5444,27 @@
           <w:szCs w:val="24"/>
           <w:lang w:val="es-MX"/>
         </w:rPr>
-        <w:t xml:space="preserve"> Name, ID y Potencia no se encuentren vacíos.</w:t>
+        <w:t xml:space="preserve"> </w:t>
+      </w:r>
+      <w:proofErr w:type="spellStart"/>
+      <w:r>
+        <w:rPr>
+          <w:rFonts w:ascii="Times New Roman" w:hAnsi="Times New Roman" w:cs="Times New Roman"/>
+          <w:sz w:val="24"/>
+          <w:szCs w:val="24"/>
+          <w:lang w:val="es-MX"/>
+        </w:rPr>
+        <w:t>Name</w:t>
+      </w:r>
+      <w:proofErr w:type="spellEnd"/>
+      <w:r>
+        <w:rPr>
+          <w:rFonts w:ascii="Times New Roman" w:hAnsi="Times New Roman" w:cs="Times New Roman"/>
+          <w:sz w:val="24"/>
+          <w:szCs w:val="24"/>
+          <w:lang w:val="es-MX"/>
+        </w:rPr>
+        <w:t>, ID y Potencia no se encuentren vacíos.</w:t>
       </w:r>
     </w:p>
     <w:p>
@@ -5601,7 +5752,7 @@
           <w:lang w:val="es-US"/>
         </w:rPr>
       </w:pPr>
-      <w:bookmarkStart w:id="10" w:name="_Toc230609827"/>
+      <w:bookmarkStart w:id="13" w:name="_Toc231040769"/>
       <w:r>
         <w:rPr>
           <w:rFonts w:ascii="Times New Roman" w:hAnsi="Times New Roman" w:cs="Times New Roman"/>
@@ -5609,7 +5760,7 @@
         </w:rPr>
         <w:t>Calcular consumo</w:t>
       </w:r>
-      <w:bookmarkEnd w:id="10"/>
+      <w:bookmarkEnd w:id="13"/>
     </w:p>
     <w:p>
       <w:pPr>
@@ -6359,7 +6510,7 @@
           <w:lang w:val="es-US"/>
         </w:rPr>
       </w:pPr>
-      <w:bookmarkStart w:id="11" w:name="_Toc230609828"/>
+      <w:bookmarkStart w:id="14" w:name="_Toc231040770"/>
       <w:r>
         <w:rPr>
           <w:rFonts w:ascii="Times New Roman" w:hAnsi="Times New Roman" w:cs="Times New Roman"/>
@@ -6368,13 +6519,720 @@
         <w:lastRenderedPageBreak/>
         <w:t>Ejecución del programa</w:t>
       </w:r>
-      <w:bookmarkEnd w:id="11"/>
-    </w:p>
-    <w:p>
-      <w:pPr>
-        <w:rPr>
-          <w:rFonts w:ascii="Times New Roman" w:eastAsiaTheme="majorEastAsia" w:hAnsi="Times New Roman" w:cs="Times New Roman"/>
-          <w:color w:val="0F4761" w:themeColor="accent1" w:themeShade="BF"/>
+      <w:bookmarkEnd w:id="14"/>
+    </w:p>
+    <w:p>
+      <w:pPr>
+        <w:pStyle w:val="Prrafodelista"/>
+        <w:numPr>
+          <w:ilvl w:val="0"/>
+          <w:numId w:val="16"/>
+        </w:numPr>
+        <w:rPr>
+          <w:rFonts w:ascii="Times New Roman" w:hAnsi="Times New Roman" w:cs="Times New Roman"/>
+          <w:sz w:val="36"/>
+          <w:szCs w:val="36"/>
+          <w:lang w:val="es-US"/>
+        </w:rPr>
+      </w:pPr>
+      <w:r>
+        <w:rPr>
+          <w:rFonts w:ascii="Times New Roman" w:hAnsi="Times New Roman" w:cs="Times New Roman"/>
+          <w:sz w:val="24"/>
+          <w:szCs w:val="24"/>
+          <w:lang w:val="es-US"/>
+        </w:rPr>
+        <w:t>Abrir el plano “</w:t>
+      </w:r>
+      <w:proofErr w:type="spellStart"/>
+      <w:r>
+        <w:rPr>
+          <w:rFonts w:ascii="Times New Roman" w:hAnsi="Times New Roman" w:cs="Times New Roman"/>
+          <w:sz w:val="24"/>
+          <w:szCs w:val="24"/>
+          <w:lang w:val="es-US"/>
+        </w:rPr>
+        <w:t>PlanoPrueba_JGuadarrama</w:t>
+      </w:r>
+      <w:r>
+        <w:rPr>
+          <w:rFonts w:ascii="Times New Roman" w:hAnsi="Times New Roman" w:cs="Times New Roman"/>
+          <w:sz w:val="24"/>
+          <w:szCs w:val="24"/>
+          <w:lang w:val="es-US"/>
+        </w:rPr>
+        <w:t>.dwg</w:t>
+      </w:r>
+      <w:proofErr w:type="spellEnd"/>
+      <w:r>
+        <w:rPr>
+          <w:rFonts w:ascii="Times New Roman" w:hAnsi="Times New Roman" w:cs="Times New Roman"/>
+          <w:sz w:val="24"/>
+          <w:szCs w:val="24"/>
+          <w:lang w:val="es-US"/>
+        </w:rPr>
+        <w:t>” en AutoCAD, el cual ya cuenta con bloques que pueden ser analizados.</w:t>
+      </w:r>
+    </w:p>
+    <w:p>
+      <w:pPr>
+        <w:pStyle w:val="Prrafodelista"/>
+        <w:numPr>
+          <w:ilvl w:val="0"/>
+          <w:numId w:val="16"/>
+        </w:numPr>
+        <w:rPr>
+          <w:rFonts w:ascii="Times New Roman" w:hAnsi="Times New Roman" w:cs="Times New Roman"/>
+          <w:sz w:val="36"/>
+          <w:szCs w:val="36"/>
+          <w:lang w:val="es-US"/>
+        </w:rPr>
+      </w:pPr>
+      <w:r>
+        <w:rPr>
+          <w:rFonts w:ascii="Times New Roman" w:hAnsi="Times New Roman" w:cs="Times New Roman"/>
+          <w:sz w:val="24"/>
+          <w:szCs w:val="24"/>
+          <w:lang w:val="es-US"/>
+        </w:rPr>
+        <w:t>En la cinta de opciones “</w:t>
+      </w:r>
+      <w:proofErr w:type="spellStart"/>
+      <w:r>
+        <w:rPr>
+          <w:rFonts w:ascii="Times New Roman" w:hAnsi="Times New Roman" w:cs="Times New Roman"/>
+          <w:sz w:val="24"/>
+          <w:szCs w:val="24"/>
+          <w:lang w:val="es-US"/>
+        </w:rPr>
+        <w:t>Manage</w:t>
+      </w:r>
+      <w:proofErr w:type="spellEnd"/>
+      <w:r>
+        <w:rPr>
+          <w:rFonts w:ascii="Times New Roman" w:hAnsi="Times New Roman" w:cs="Times New Roman"/>
+          <w:sz w:val="24"/>
+          <w:szCs w:val="24"/>
+          <w:lang w:val="es-US"/>
+        </w:rPr>
+        <w:t>” ejecutar el comando “Visual LISP Editor” para abrir la ventana de edición de LISP.</w:t>
+      </w:r>
+    </w:p>
+    <w:p>
+      <w:pPr>
+        <w:pStyle w:val="Prrafodelista"/>
+        <w:numPr>
+          <w:ilvl w:val="0"/>
+          <w:numId w:val="16"/>
+        </w:numPr>
+        <w:rPr>
+          <w:rFonts w:ascii="Times New Roman" w:hAnsi="Times New Roman" w:cs="Times New Roman"/>
+          <w:sz w:val="36"/>
+          <w:szCs w:val="36"/>
+          <w:lang w:val="es-US"/>
+        </w:rPr>
+      </w:pPr>
+      <w:r>
+        <w:rPr>
+          <w:rFonts w:ascii="Times New Roman" w:hAnsi="Times New Roman" w:cs="Times New Roman"/>
+          <w:sz w:val="24"/>
+          <w:szCs w:val="24"/>
+          <w:lang w:val="es-US"/>
+        </w:rPr>
+        <w:t>Cargar en el editor los archivos “</w:t>
+      </w:r>
+      <w:proofErr w:type="spellStart"/>
+      <w:r>
+        <w:rPr>
+          <w:rFonts w:ascii="Times New Roman" w:hAnsi="Times New Roman" w:cs="Times New Roman"/>
+          <w:sz w:val="24"/>
+          <w:szCs w:val="24"/>
+          <w:lang w:val="es-US"/>
+        </w:rPr>
+        <w:t>GestionDatos.lsp</w:t>
+      </w:r>
+      <w:proofErr w:type="spellEnd"/>
+      <w:r>
+        <w:rPr>
+          <w:rFonts w:ascii="Times New Roman" w:hAnsi="Times New Roman" w:cs="Times New Roman"/>
+          <w:sz w:val="24"/>
+          <w:szCs w:val="24"/>
+          <w:lang w:val="es-US"/>
+        </w:rPr>
+        <w:t>” y “</w:t>
+      </w:r>
+      <w:proofErr w:type="spellStart"/>
+      <w:r>
+        <w:rPr>
+          <w:rFonts w:ascii="Times New Roman" w:hAnsi="Times New Roman" w:cs="Times New Roman"/>
+          <w:sz w:val="24"/>
+          <w:szCs w:val="24"/>
+          <w:lang w:val="es-US"/>
+        </w:rPr>
+        <w:t>GestionDatos.</w:t>
+      </w:r>
+      <w:r>
+        <w:rPr>
+          <w:rFonts w:ascii="Times New Roman" w:hAnsi="Times New Roman" w:cs="Times New Roman"/>
+          <w:sz w:val="24"/>
+          <w:szCs w:val="24"/>
+          <w:lang w:val="es-US"/>
+        </w:rPr>
+        <w:t>dcl</w:t>
+      </w:r>
+      <w:proofErr w:type="spellEnd"/>
+      <w:r>
+        <w:rPr>
+          <w:rFonts w:ascii="Times New Roman" w:hAnsi="Times New Roman" w:cs="Times New Roman"/>
+          <w:sz w:val="24"/>
+          <w:szCs w:val="24"/>
+          <w:lang w:val="es-US"/>
+        </w:rPr>
+        <w:t>”.</w:t>
+      </w:r>
+    </w:p>
+    <w:p>
+      <w:pPr>
+        <w:pStyle w:val="Prrafodelista"/>
+        <w:numPr>
+          <w:ilvl w:val="0"/>
+          <w:numId w:val="16"/>
+        </w:numPr>
+        <w:rPr>
+          <w:rFonts w:ascii="Times New Roman" w:hAnsi="Times New Roman" w:cs="Times New Roman"/>
+          <w:sz w:val="36"/>
+          <w:szCs w:val="36"/>
+          <w:lang w:val="es-US"/>
+        </w:rPr>
+      </w:pPr>
+      <w:r>
+        <w:rPr>
+          <w:rFonts w:ascii="Times New Roman" w:hAnsi="Times New Roman" w:cs="Times New Roman"/>
+          <w:sz w:val="24"/>
+          <w:szCs w:val="24"/>
+          <w:lang w:val="es-US"/>
+        </w:rPr>
+        <w:t xml:space="preserve">Cargar los archivos abiertos en el editor con el comando “Load active </w:t>
+      </w:r>
+      <w:proofErr w:type="spellStart"/>
+      <w:r>
+        <w:rPr>
+          <w:rFonts w:ascii="Times New Roman" w:hAnsi="Times New Roman" w:cs="Times New Roman"/>
+          <w:sz w:val="24"/>
+          <w:szCs w:val="24"/>
+          <w:lang w:val="es-US"/>
+        </w:rPr>
+        <w:t>edit</w:t>
+      </w:r>
+      <w:proofErr w:type="spellEnd"/>
+      <w:r>
+        <w:rPr>
+          <w:rFonts w:ascii="Times New Roman" w:hAnsi="Times New Roman" w:cs="Times New Roman"/>
+          <w:sz w:val="24"/>
+          <w:szCs w:val="24"/>
+          <w:lang w:val="es-US"/>
+        </w:rPr>
+        <w:t xml:space="preserve"> </w:t>
+      </w:r>
+      <w:proofErr w:type="spellStart"/>
+      <w:r>
+        <w:rPr>
+          <w:rFonts w:ascii="Times New Roman" w:hAnsi="Times New Roman" w:cs="Times New Roman"/>
+          <w:sz w:val="24"/>
+          <w:szCs w:val="24"/>
+          <w:lang w:val="es-US"/>
+        </w:rPr>
+        <w:t>window</w:t>
+      </w:r>
+      <w:proofErr w:type="spellEnd"/>
+      <w:r>
+        <w:rPr>
+          <w:rFonts w:ascii="Times New Roman" w:hAnsi="Times New Roman" w:cs="Times New Roman"/>
+          <w:sz w:val="24"/>
+          <w:szCs w:val="24"/>
+          <w:lang w:val="es-US"/>
+        </w:rPr>
+        <w:t>”, para cada ventana de edición por separado.</w:t>
+      </w:r>
+    </w:p>
+    <w:p>
+      <w:pPr>
+        <w:pStyle w:val="Prrafodelista"/>
+        <w:numPr>
+          <w:ilvl w:val="0"/>
+          <w:numId w:val="16"/>
+        </w:numPr>
+        <w:rPr>
+          <w:rFonts w:ascii="Times New Roman" w:hAnsi="Times New Roman" w:cs="Times New Roman"/>
+          <w:sz w:val="36"/>
+          <w:szCs w:val="36"/>
+          <w:lang w:val="es-US"/>
+        </w:rPr>
+      </w:pPr>
+      <w:r>
+        <w:rPr>
+          <w:rFonts w:ascii="Times New Roman" w:hAnsi="Times New Roman" w:cs="Times New Roman"/>
+          <w:sz w:val="24"/>
+          <w:szCs w:val="24"/>
+          <w:lang w:val="es-US"/>
+        </w:rPr>
+        <w:t>Volviendo a la ventana de AutoCAD con el plano abierto, se podrán ejecutar los siguientes comandos:</w:t>
+      </w:r>
+    </w:p>
+    <w:p>
+      <w:pPr>
+        <w:pStyle w:val="Prrafodelista"/>
+        <w:numPr>
+          <w:ilvl w:val="1"/>
+          <w:numId w:val="16"/>
+        </w:numPr>
+        <w:rPr>
+          <w:rFonts w:ascii="Times New Roman" w:hAnsi="Times New Roman" w:cs="Times New Roman"/>
+          <w:b/>
+          <w:bCs/>
+          <w:sz w:val="36"/>
+          <w:szCs w:val="36"/>
+          <w:lang w:val="es-US"/>
+        </w:rPr>
+      </w:pPr>
+      <w:r>
+        <w:rPr>
+          <w:rFonts w:ascii="Times New Roman" w:hAnsi="Times New Roman" w:cs="Times New Roman"/>
+          <w:b/>
+          <w:bCs/>
+          <w:sz w:val="24"/>
+          <w:szCs w:val="24"/>
+          <w:lang w:val="es-US"/>
+        </w:rPr>
+        <w:t xml:space="preserve">Editar datos </w:t>
+      </w:r>
+      <w:r>
+        <w:rPr>
+          <w:rFonts w:ascii="Times New Roman" w:hAnsi="Times New Roman" w:cs="Times New Roman"/>
+          <w:sz w:val="24"/>
+          <w:szCs w:val="24"/>
+          <w:lang w:val="es-US"/>
+        </w:rPr>
+        <w:t>(</w:t>
+      </w:r>
+      <w:proofErr w:type="spellStart"/>
+      <w:r>
+        <w:rPr>
+          <w:rFonts w:ascii="Times New Roman" w:hAnsi="Times New Roman" w:cs="Times New Roman"/>
+          <w:sz w:val="24"/>
+          <w:szCs w:val="24"/>
+          <w:lang w:val="es-US"/>
+        </w:rPr>
+        <w:t>EditarDatos</w:t>
+      </w:r>
+      <w:proofErr w:type="spellEnd"/>
+      <w:r>
+        <w:rPr>
+          <w:rFonts w:ascii="Times New Roman" w:hAnsi="Times New Roman" w:cs="Times New Roman"/>
+          <w:sz w:val="24"/>
+          <w:szCs w:val="24"/>
+          <w:lang w:val="es-US"/>
+        </w:rPr>
+        <w:t xml:space="preserve">): </w:t>
+      </w:r>
+      <w:r>
+        <w:rPr>
+          <w:rFonts w:ascii="Times New Roman" w:hAnsi="Times New Roman" w:cs="Times New Roman"/>
+          <w:sz w:val="24"/>
+          <w:szCs w:val="24"/>
+          <w:lang w:val="es-US"/>
+        </w:rPr>
+        <w:t xml:space="preserve">Espera la selección </w:t>
+      </w:r>
+      <w:r>
+        <w:rPr>
+          <w:rFonts w:ascii="Times New Roman" w:hAnsi="Times New Roman" w:cs="Times New Roman"/>
+          <w:sz w:val="24"/>
+          <w:szCs w:val="24"/>
+          <w:lang w:val="es-US"/>
+        </w:rPr>
+        <w:t xml:space="preserve">por parte </w:t>
+      </w:r>
+      <w:r>
+        <w:rPr>
+          <w:rFonts w:ascii="Times New Roman" w:hAnsi="Times New Roman" w:cs="Times New Roman"/>
+          <w:sz w:val="24"/>
+          <w:szCs w:val="24"/>
+          <w:lang w:val="es-US"/>
+        </w:rPr>
+        <w:t>del usuario de un bloque en el plano abierto en AutoCAD</w:t>
+      </w:r>
+      <w:r>
+        <w:rPr>
+          <w:rFonts w:ascii="Times New Roman" w:hAnsi="Times New Roman" w:cs="Times New Roman"/>
+          <w:sz w:val="24"/>
+          <w:szCs w:val="24"/>
+          <w:lang w:val="es-US"/>
+        </w:rPr>
+        <w:t xml:space="preserve">, para posteriormente abrir una </w:t>
+      </w:r>
+      <w:r>
+        <w:rPr>
+          <w:rFonts w:ascii="Times New Roman" w:hAnsi="Times New Roman" w:cs="Times New Roman"/>
+          <w:sz w:val="24"/>
+          <w:szCs w:val="24"/>
+          <w:lang w:val="es-US"/>
+        </w:rPr>
+        <w:t>ventana de diálogo que permite asignar datos extendidos a</w:t>
+      </w:r>
+      <w:r>
+        <w:rPr>
+          <w:rFonts w:ascii="Times New Roman" w:hAnsi="Times New Roman" w:cs="Times New Roman"/>
+          <w:sz w:val="24"/>
+          <w:szCs w:val="24"/>
+          <w:lang w:val="es-US"/>
+        </w:rPr>
+        <w:t xml:space="preserve">l </w:t>
+      </w:r>
+      <w:r>
+        <w:rPr>
+          <w:rFonts w:ascii="Times New Roman" w:hAnsi="Times New Roman" w:cs="Times New Roman"/>
+          <w:sz w:val="24"/>
+          <w:szCs w:val="24"/>
+          <w:lang w:val="es-US"/>
+        </w:rPr>
+        <w:t xml:space="preserve">bloque </w:t>
+      </w:r>
+      <w:r>
+        <w:rPr>
+          <w:rFonts w:ascii="Times New Roman" w:hAnsi="Times New Roman" w:cs="Times New Roman"/>
+          <w:sz w:val="24"/>
+          <w:szCs w:val="24"/>
+          <w:lang w:val="es-US"/>
+        </w:rPr>
+        <w:t>seleccionado</w:t>
+      </w:r>
+      <w:r>
+        <w:rPr>
+          <w:rFonts w:ascii="Times New Roman" w:hAnsi="Times New Roman" w:cs="Times New Roman"/>
+          <w:sz w:val="24"/>
+          <w:szCs w:val="24"/>
+          <w:lang w:val="es-US"/>
+        </w:rPr>
+        <w:t>.</w:t>
+      </w:r>
+    </w:p>
+    <w:p>
+      <w:pPr>
+        <w:pStyle w:val="Prrafodelista"/>
+        <w:ind w:left="1440"/>
+        <w:rPr>
+          <w:rFonts w:ascii="Times New Roman" w:hAnsi="Times New Roman" w:cs="Times New Roman"/>
+          <w:b/>
+          <w:bCs/>
+          <w:sz w:val="36"/>
+          <w:szCs w:val="36"/>
+          <w:lang w:val="es-US"/>
+        </w:rPr>
+      </w:pPr>
+      <w:r>
+        <w:rPr>
+          <w:rFonts w:ascii="Times New Roman" w:hAnsi="Times New Roman" w:cs="Times New Roman"/>
+          <w:b/>
+          <w:bCs/>
+          <w:sz w:val="36"/>
+          <w:szCs w:val="36"/>
+          <w:lang w:val="es-US"/>
+        </w:rPr>
+        <w:drawing>
+          <wp:inline distT="0" distB="0" distL="0" distR="0" wp14:anchorId="1A4959DC" wp14:editId="0B0916BB">
+            <wp:extent cx="3915321" cy="2419688"/>
+            <wp:effectExtent l="0" t="0" r="0" b="0"/>
+            <wp:docPr id="1" name="Imagen 1"/>
+            <wp:cNvGraphicFramePr>
+              <a:graphicFrameLocks xmlns:a="http://schemas.openxmlformats.org/drawingml/2006/main" noChangeAspect="1"/>
+            </wp:cNvGraphicFramePr>
+            <a:graphic xmlns:a="http://schemas.openxmlformats.org/drawingml/2006/main">
+              <a:graphicData uri="http://schemas.openxmlformats.org/drawingml/2006/picture">
+                <pic:pic xmlns:pic="http://schemas.openxmlformats.org/drawingml/2006/picture">
+                  <pic:nvPicPr>
+                    <pic:cNvPr id="1" name=""/>
+                    <pic:cNvPicPr/>
+                  </pic:nvPicPr>
+                  <pic:blipFill>
+                    <a:blip r:embed="rId16"/>
+                    <a:stretch>
+                      <a:fillRect/>
+                    </a:stretch>
+                  </pic:blipFill>
+                  <pic:spPr>
+                    <a:xfrm>
+                      <a:off x="0" y="0"/>
+                      <a:ext cx="3915321" cy="2419688"/>
+                    </a:xfrm>
+                    <a:prstGeom prst="rect">
+                      <a:avLst/>
+                    </a:prstGeom>
+                  </pic:spPr>
+                </pic:pic>
+              </a:graphicData>
+            </a:graphic>
+          </wp:inline>
+        </w:drawing>
+      </w:r>
+    </w:p>
+    <w:p>
+      <w:pPr>
+        <w:pStyle w:val="Prrafodelista"/>
+        <w:numPr>
+          <w:ilvl w:val="1"/>
+          <w:numId w:val="16"/>
+        </w:numPr>
+        <w:rPr>
+          <w:rFonts w:ascii="Times New Roman" w:hAnsi="Times New Roman" w:cs="Times New Roman"/>
+          <w:b/>
+          <w:bCs/>
+          <w:sz w:val="36"/>
+          <w:szCs w:val="36"/>
+          <w:lang w:val="es-US"/>
+        </w:rPr>
+      </w:pPr>
+      <w:r>
+        <w:rPr>
+          <w:rFonts w:ascii="Times New Roman" w:hAnsi="Times New Roman" w:cs="Times New Roman"/>
+          <w:b/>
+          <w:bCs/>
+          <w:sz w:val="24"/>
+          <w:szCs w:val="24"/>
+          <w:lang w:val="es-US"/>
+        </w:rPr>
+        <w:t xml:space="preserve">Calcular consumo </w:t>
+      </w:r>
+      <w:r>
+        <w:rPr>
+          <w:rFonts w:ascii="Times New Roman" w:hAnsi="Times New Roman" w:cs="Times New Roman"/>
+          <w:sz w:val="24"/>
+          <w:szCs w:val="24"/>
+          <w:lang w:val="es-US"/>
+        </w:rPr>
+        <w:t>(</w:t>
+      </w:r>
+      <w:proofErr w:type="spellStart"/>
+      <w:r>
+        <w:rPr>
+          <w:rFonts w:ascii="Times New Roman" w:hAnsi="Times New Roman" w:cs="Times New Roman"/>
+          <w:sz w:val="24"/>
+          <w:szCs w:val="24"/>
+          <w:lang w:val="es-US"/>
+        </w:rPr>
+        <w:t>CalcularConsumo</w:t>
+      </w:r>
+      <w:proofErr w:type="spellEnd"/>
+      <w:r>
+        <w:rPr>
+          <w:rFonts w:ascii="Times New Roman" w:hAnsi="Times New Roman" w:cs="Times New Roman"/>
+          <w:sz w:val="24"/>
+          <w:szCs w:val="24"/>
+          <w:lang w:val="es-US"/>
+        </w:rPr>
+        <w:t xml:space="preserve">): </w:t>
+      </w:r>
+      <w:r>
+        <w:rPr>
+          <w:rFonts w:ascii="Times New Roman" w:hAnsi="Times New Roman" w:cs="Times New Roman"/>
+          <w:sz w:val="24"/>
+          <w:szCs w:val="24"/>
+          <w:lang w:val="es-US"/>
+        </w:rPr>
+        <w:t xml:space="preserve">Abre una ventana de diálogo con la información de consumo de energía del lugar mostrado en el plano, haciendo uso de los datos extendidos </w:t>
+      </w:r>
+      <w:proofErr w:type="spellStart"/>
+      <w:r>
+        <w:rPr>
+          <w:rFonts w:ascii="Times New Roman" w:hAnsi="Times New Roman" w:cs="Times New Roman"/>
+          <w:sz w:val="24"/>
+          <w:szCs w:val="24"/>
+          <w:lang w:val="es-US"/>
+        </w:rPr>
+        <w:t>correspontientes</w:t>
+      </w:r>
+      <w:proofErr w:type="spellEnd"/>
+      <w:r>
+        <w:rPr>
+          <w:rFonts w:ascii="Times New Roman" w:hAnsi="Times New Roman" w:cs="Times New Roman"/>
+          <w:sz w:val="24"/>
+          <w:szCs w:val="24"/>
+          <w:lang w:val="es-US"/>
+        </w:rPr>
+        <w:t xml:space="preserve"> a elementos eléctricos, además de dar un estimado del costo mensual de dicho consumo</w:t>
+      </w:r>
+      <w:r>
+        <w:rPr>
+          <w:rFonts w:ascii="Times New Roman" w:hAnsi="Times New Roman" w:cs="Times New Roman"/>
+          <w:sz w:val="24"/>
+          <w:szCs w:val="24"/>
+          <w:lang w:val="es-US"/>
+        </w:rPr>
+        <w:t>, tanto en la ventana de diálogo, como en la consola de AutoCAD</w:t>
+      </w:r>
+      <w:r>
+        <w:rPr>
+          <w:rFonts w:ascii="Times New Roman" w:hAnsi="Times New Roman" w:cs="Times New Roman"/>
+          <w:sz w:val="24"/>
+          <w:szCs w:val="24"/>
+          <w:lang w:val="es-US"/>
+        </w:rPr>
+        <w:t>.</w:t>
+      </w:r>
+      <w:r>
+        <w:rPr>
+          <w:rFonts w:ascii="Times New Roman" w:hAnsi="Times New Roman" w:cs="Times New Roman"/>
+          <w:sz w:val="24"/>
+          <w:szCs w:val="24"/>
+          <w:lang w:val="es-US"/>
+        </w:rPr>
+        <w:t xml:space="preserve"> Para la configuración predeterminada en el código se define una tarifa de $850 pesos colombianos, y un consumo de 240 h/mes (8 h/día).</w:t>
+      </w:r>
+    </w:p>
+    <w:p>
+      <w:pPr>
+        <w:pStyle w:val="Prrafodelista"/>
+        <w:ind w:left="1440"/>
+        <w:rPr>
+          <w:rFonts w:ascii="Times New Roman" w:hAnsi="Times New Roman" w:cs="Times New Roman"/>
+          <w:b/>
+          <w:bCs/>
+          <w:sz w:val="36"/>
+          <w:szCs w:val="36"/>
+          <w:lang w:val="es-US"/>
+        </w:rPr>
+      </w:pPr>
+      <w:r>
+        <w:rPr>
+          <w:rFonts w:ascii="Times New Roman" w:hAnsi="Times New Roman" w:cs="Times New Roman"/>
+          <w:b/>
+          <w:bCs/>
+          <w:sz w:val="36"/>
+          <w:szCs w:val="36"/>
+          <w:lang w:val="es-US"/>
+        </w:rPr>
+        <w:lastRenderedPageBreak/>
+        <w:drawing>
+          <wp:inline distT="0" distB="0" distL="0" distR="0" wp14:anchorId="3757CC44" wp14:editId="3E442C3D">
+            <wp:extent cx="3543795" cy="3429479"/>
+            <wp:effectExtent l="0" t="0" r="0" b="0"/>
+            <wp:docPr id="2" name="Imagen 2"/>
+            <wp:cNvGraphicFramePr>
+              <a:graphicFrameLocks xmlns:a="http://schemas.openxmlformats.org/drawingml/2006/main" noChangeAspect="1"/>
+            </wp:cNvGraphicFramePr>
+            <a:graphic xmlns:a="http://schemas.openxmlformats.org/drawingml/2006/main">
+              <a:graphicData uri="http://schemas.openxmlformats.org/drawingml/2006/picture">
+                <pic:pic xmlns:pic="http://schemas.openxmlformats.org/drawingml/2006/picture">
+                  <pic:nvPicPr>
+                    <pic:cNvPr id="1" name=""/>
+                    <pic:cNvPicPr/>
+                  </pic:nvPicPr>
+                  <pic:blipFill>
+                    <a:blip r:embed="rId17"/>
+                    <a:stretch>
+                      <a:fillRect/>
+                    </a:stretch>
+                  </pic:blipFill>
+                  <pic:spPr>
+                    <a:xfrm>
+                      <a:off x="0" y="0"/>
+                      <a:ext cx="3543795" cy="3429479"/>
+                    </a:xfrm>
+                    <a:prstGeom prst="rect">
+                      <a:avLst/>
+                    </a:prstGeom>
+                  </pic:spPr>
+                </pic:pic>
+              </a:graphicData>
+            </a:graphic>
+          </wp:inline>
+        </w:drawing>
+      </w:r>
+    </w:p>
+    <w:p>
+      <w:pPr>
+        <w:pStyle w:val="Prrafodelista"/>
+        <w:numPr>
+          <w:ilvl w:val="1"/>
+          <w:numId w:val="16"/>
+        </w:numPr>
+        <w:rPr>
+          <w:rFonts w:ascii="Times New Roman" w:hAnsi="Times New Roman" w:cs="Times New Roman"/>
+          <w:b/>
+          <w:bCs/>
+          <w:sz w:val="36"/>
+          <w:szCs w:val="36"/>
+          <w:lang w:val="es-US"/>
+        </w:rPr>
+      </w:pPr>
+      <w:r>
+        <w:rPr>
+          <w:rFonts w:ascii="Times New Roman" w:hAnsi="Times New Roman" w:cs="Times New Roman"/>
+          <w:b/>
+          <w:bCs/>
+          <w:sz w:val="24"/>
+          <w:szCs w:val="24"/>
+          <w:lang w:val="es-US"/>
+        </w:rPr>
+        <w:t xml:space="preserve">Ver XDATA </w:t>
+      </w:r>
+      <w:r>
+        <w:rPr>
+          <w:rFonts w:ascii="Times New Roman" w:hAnsi="Times New Roman" w:cs="Times New Roman"/>
+          <w:sz w:val="24"/>
+          <w:szCs w:val="24"/>
+          <w:lang w:val="es-US"/>
+        </w:rPr>
+        <w:t>(</w:t>
+      </w:r>
+      <w:proofErr w:type="spellStart"/>
+      <w:r>
+        <w:rPr>
+          <w:rFonts w:ascii="Times New Roman" w:hAnsi="Times New Roman" w:cs="Times New Roman"/>
+          <w:sz w:val="24"/>
+          <w:szCs w:val="24"/>
+          <w:lang w:val="es-US"/>
+        </w:rPr>
+        <w:t>VerXData</w:t>
+      </w:r>
+      <w:proofErr w:type="spellEnd"/>
+      <w:r>
+        <w:rPr>
+          <w:rFonts w:ascii="Times New Roman" w:hAnsi="Times New Roman" w:cs="Times New Roman"/>
+          <w:sz w:val="24"/>
+          <w:szCs w:val="24"/>
+          <w:lang w:val="es-US"/>
+        </w:rPr>
+        <w:t xml:space="preserve">): </w:t>
+      </w:r>
+      <w:r>
+        <w:rPr>
+          <w:rFonts w:ascii="Times New Roman" w:hAnsi="Times New Roman" w:cs="Times New Roman"/>
+          <w:sz w:val="24"/>
+          <w:szCs w:val="24"/>
+          <w:lang w:val="es-US"/>
+        </w:rPr>
+        <w:t>Comando para depuración de datos extendidos, el cual muestra en consola los datos extendidos guardados del bloque que el usuario seleccione.</w:t>
+      </w:r>
+    </w:p>
+    <w:p>
+      <w:pPr>
+        <w:pStyle w:val="Prrafodelista"/>
+        <w:ind w:left="1440"/>
+        <w:rPr>
+          <w:b/>
+          <w:bCs/>
+          <w:lang w:val="es-US"/>
+        </w:rPr>
+      </w:pPr>
+    </w:p>
+    <w:p>
+      <w:pPr>
+        <w:pStyle w:val="Prrafodelista"/>
+        <w:ind w:left="1440"/>
+        <w:rPr>
+          <w:b/>
+          <w:bCs/>
           <w:sz w:val="32"/>
           <w:szCs w:val="32"/>
           <w:lang w:val="es-US"/>
@@ -6382,7 +7240,65 @@
       </w:pPr>
       <w:r>
         <w:rPr>
-          <w:rFonts w:ascii="Times New Roman" w:hAnsi="Times New Roman" w:cs="Times New Roman"/>
+          <w:b/>
+          <w:bCs/>
+          <w:lang w:val="es-US"/>
+        </w:rPr>
+        <w:drawing>
+          <wp:inline distT="0" distB="0" distL="0" distR="0" wp14:anchorId="7A35BFD4" wp14:editId="7192A5DD">
+            <wp:extent cx="4600109" cy="920750"/>
+            <wp:effectExtent l="0" t="0" r="0" b="0"/>
+            <wp:docPr id="3" name="Imagen 3"/>
+            <wp:cNvGraphicFramePr>
+              <a:graphicFrameLocks xmlns:a="http://schemas.openxmlformats.org/drawingml/2006/main" noChangeAspect="1"/>
+            </wp:cNvGraphicFramePr>
+            <a:graphic xmlns:a="http://schemas.openxmlformats.org/drawingml/2006/main">
+              <a:graphicData uri="http://schemas.openxmlformats.org/drawingml/2006/picture">
+                <pic:pic xmlns:pic="http://schemas.openxmlformats.org/drawingml/2006/picture">
+                  <pic:nvPicPr>
+                    <pic:cNvPr id="1" name=""/>
+                    <pic:cNvPicPr/>
+                  </pic:nvPicPr>
+                  <pic:blipFill rotWithShape="1">
+                    <a:blip r:embed="rId18"/>
+                    <a:srcRect t="53064"/>
+                    <a:stretch/>
+                  </pic:blipFill>
+                  <pic:spPr bwMode="auto">
+                    <a:xfrm>
+                      <a:off x="0" y="0"/>
+                      <a:ext cx="4620454" cy="924822"/>
+                    </a:xfrm>
+                    <a:prstGeom prst="rect">
+                      <a:avLst/>
+                    </a:prstGeom>
+                    <a:ln>
+                      <a:noFill/>
+                    </a:ln>
+                    <a:extLst>
+                      <a:ext uri="{53640926-AAD7-44D8-BBD7-CCE9431645EC}">
+                        <a14:shadowObscured xmlns:a14="http://schemas.microsoft.com/office/drawing/2010/main"/>
+                      </a:ext>
+                    </a:extLst>
+                  </pic:spPr>
+                </pic:pic>
+              </a:graphicData>
+            </a:graphic>
+          </wp:inline>
+        </w:drawing>
+      </w:r>
+      <w:r>
+        <w:rPr>
+          <w:b/>
+          <w:bCs/>
+          <w:lang w:val="es-US"/>
+        </w:rPr>
+        <w:t xml:space="preserve"> </w:t>
+      </w:r>
+      <w:r>
+        <w:rPr>
+          <w:b/>
+          <w:bCs/>
           <w:lang w:val="es-US"/>
         </w:rPr>
         <w:br w:type="page"/>
@@ -6396,7 +7312,7 @@
           <w:lang w:val="es-US"/>
         </w:rPr>
       </w:pPr>
-      <w:bookmarkStart w:id="12" w:name="_Toc230609829"/>
+      <w:bookmarkStart w:id="15" w:name="_Toc231040771"/>
       <w:r>
         <w:rPr>
           <w:rFonts w:ascii="Times New Roman" w:hAnsi="Times New Roman" w:cs="Times New Roman"/>
@@ -6405,7 +7321,7 @@
         <w:lastRenderedPageBreak/>
         <w:t>Muestra y análisis de resultados</w:t>
       </w:r>
-      <w:bookmarkEnd w:id="12"/>
+      <w:bookmarkEnd w:id="15"/>
     </w:p>
     <w:p>
       <w:pPr>
@@ -7374,7 +8290,7 @@
           <w:lang w:val="es-US"/>
         </w:rPr>
       </w:pPr>
-      <w:bookmarkStart w:id="13" w:name="_Toc230609830"/>
+      <w:bookmarkStart w:id="16" w:name="_Toc231040772"/>
       <w:r>
         <w:rPr>
           <w:rFonts w:ascii="Times New Roman" w:hAnsi="Times New Roman" w:cs="Times New Roman"/>
@@ -7383,7 +8299,7 @@
         <w:lastRenderedPageBreak/>
         <w:t>Conclusiones</w:t>
       </w:r>
-      <w:bookmarkEnd w:id="13"/>
+      <w:bookmarkEnd w:id="16"/>
     </w:p>
     <w:p>
       <w:pPr>
@@ -7690,7 +8606,7 @@
           <w:lang w:val="es-US"/>
         </w:rPr>
       </w:pPr>
-      <w:bookmarkStart w:id="14" w:name="_Toc230609831"/>
+      <w:bookmarkStart w:id="17" w:name="_Toc231040773"/>
       <w:r>
         <w:rPr>
           <w:rFonts w:ascii="Times New Roman" w:hAnsi="Times New Roman" w:cs="Times New Roman"/>
@@ -7699,7 +8615,7 @@
         <w:lastRenderedPageBreak/>
         <w:t>Bibliografía</w:t>
       </w:r>
-      <w:bookmarkEnd w:id="14"/>
+      <w:bookmarkEnd w:id="17"/>
     </w:p>
     <w:p>
       <w:pPr>
@@ -7879,7 +8795,7 @@
         </w:rPr>
         <w:t xml:space="preserve">(5), 04016125. </w:t>
       </w:r>
-      <w:hyperlink r:id="rId16" w:history="1">
+      <w:hyperlink r:id="rId19" w:history="1">
         <w:r>
           <w:rPr>
             <w:rStyle w:val="Hipervnculo"/>
@@ -7978,7 +8894,7 @@
         </w:rPr>
         <w:t xml:space="preserve">, (8). </w:t>
       </w:r>
-      <w:hyperlink r:id="rId17" w:history="1">
+      <w:hyperlink r:id="rId20" w:history="1">
         <w:r>
           <w:rPr>
             <w:rStyle w:val="Hipervnculo"/>
@@ -8072,7 +8988,7 @@
         </w:rPr>
         <w:t xml:space="preserve">. Autodesk Knowledge Network. </w:t>
       </w:r>
-      <w:hyperlink r:id="rId18" w:history="1">
+      <w:hyperlink r:id="rId21" w:history="1">
         <w:r>
           <w:rPr>
             <w:rStyle w:val="Hipervnculo"/>
@@ -8113,7 +9029,7 @@
         </w:rPr>
         <w:t xml:space="preserve">. Autodesk Knowledge Network. </w:t>
       </w:r>
-      <w:hyperlink r:id="rId19" w:history="1">
+      <w:hyperlink r:id="rId22" w:history="1">
         <w:r>
           <w:rPr>
             <w:rStyle w:val="Hipervnculo"/>
@@ -8185,7 +9101,7 @@
         </w:rPr>
         <w:t xml:space="preserve">. Autodesk Knowledge Network. </w:t>
       </w:r>
-      <w:hyperlink r:id="rId20" w:history="1">
+      <w:hyperlink r:id="rId23" w:history="1">
         <w:r>
           <w:rPr>
             <w:rStyle w:val="Hipervnculo"/>
@@ -8246,7 +9162,7 @@
         </w:rPr>
         <w:t xml:space="preserve"> [Sitio web]. </w:t>
       </w:r>
-      <w:hyperlink r:id="rId21" w:history="1">
+      <w:hyperlink r:id="rId24" w:history="1">
         <w:r>
           <w:rPr>
             <w:rStyle w:val="Hipervnculo"/>
@@ -8296,7 +9212,7 @@
         </w:rPr>
         <w:t xml:space="preserve"> (claude-sonnet-4-5) [Modelo de lenguaje de gran escala]. </w:t>
       </w:r>
-      <w:hyperlink r:id="rId22" w:history="1">
+      <w:hyperlink r:id="rId25" w:history="1">
         <w:r>
           <w:rPr>
             <w:rStyle w:val="Hipervnculo"/>
@@ -8348,7 +9264,7 @@
         </w:rPr>
         <w:t xml:space="preserve"> (GPT-4o) [Modelo de lenguaje de gran escala]. </w:t>
       </w:r>
-      <w:hyperlink r:id="rId23" w:history="1">
+      <w:hyperlink r:id="rId26" w:history="1">
         <w:r>
           <w:rPr>
             <w:rStyle w:val="Hipervnculo"/>
@@ -8370,7 +9286,7 @@
 </file>
 
 <file path=word/numbering.xml><?xml version="1.0" encoding="utf-8"?>
-<w:numbering xmlns:wpc="http://schemas.microsoft.com/office/word/2010/wordprocessingCanvas" xmlns:cx="http://schemas.microsoft.com/office/drawing/2014/chartex" xmlns:cx1="http://schemas.microsoft.com/office/drawing/2015/9/8/chartex" xmlns:cx2="http://schemas.microsoft.com/office/drawing/2015/10/21/chartex" xmlns:cx3="http://schemas.microsoft.com/office/drawing/2016/5/9/chartex" xmlns:cx4="http://schemas.microsoft.com/office/drawing/2016/5/10/chartex" xmlns:cx5="http://schemas.microsoft.com/office/drawing/2016/5/11/chartex" xmlns:cx6="http://schemas.microsoft.com/office/drawing/2016/5/12/chartex" xmlns:cx7="http://schemas.microsoft.com/office/drawing/2016/5/13/chartex" xmlns:cx8="http://schemas.microsoft.com/office/drawing/2016/5/14/chartex" xmlns:mc="http://schemas.openxmlformats.org/markup-compatibility/2006" xmlns:aink="http://schemas.microsoft.com/office/drawing/2016/ink" xmlns:am3d="http://schemas.microsoft.com/office/drawing/2017/model3d" xmlns:o="urn:schemas-microsoft-com:office:office" xmlns:oel="http://schemas.microsoft.com/office/2019/extlst" xmlns:r="http://schemas.openxmlformats.org/officeDocument/2006/relationships" xmlns:m="http://schemas.openxmlformats.org/officeDocument/2006/math" xmlns:v="urn:schemas-microsoft-com:vml" xmlns:wp14="http://schemas.microsoft.com/office/word/2010/wordprocessingDrawing" xmlns:wp="http://schemas.openxmlformats.org/drawingml/2006/wordprocessingDrawing" xmlns:w10="urn:schemas-microsoft-com:office:word" xmlns:w="http://schemas.openxmlformats.org/wordprocessingml/2006/main" xmlns:w14="http://schemas.microsoft.com/office/word/2010/wordml" xmlns:w15="http://schemas.microsoft.com/office/word/2012/wordml" xmlns:w16cex="http://schemas.microsoft.com/office/word/2018/wordml/cex" xmlns:w16cid="http://schemas.microsoft.com/office/word/2016/wordml/cid" xmlns:w16="http://schemas.microsoft.com/office/word/2018/wordml" xmlns:w16du="http://schemas.microsoft.com/office/word/2023/wordml/word16du" xmlns:w16sdtdh="http://schemas.microsoft.com/office/word/2020/wordml/sdtdatahash" xmlns:w16sdtfl="http://schemas.microsoft.com/office/word/2024/wordml/sdtformatlock" xmlns:w16se="http://schemas.microsoft.com/office/word/2015/wordml/symex" xmlns:wpg="http://schemas.microsoft.com/office/word/2010/wordprocessingGroup" xmlns:wpi="http://schemas.microsoft.com/office/word/2010/wordprocessingInk" xmlns:wne="http://schemas.microsoft.com/office/word/2006/wordml" xmlns:wps="http://schemas.microsoft.com/office/word/2010/wordprocessingShape" mc:Ignorable="w14 w15 w16se w16cid w16 w16cex w16sdtdh w16sdtfl w16du wp14">
+<w:numbering xmlns:wpc="http://schemas.microsoft.com/office/word/2010/wordprocessingCanvas" xmlns:cx="http://schemas.microsoft.com/office/drawing/2014/chartex" xmlns:cx1="http://schemas.microsoft.com/office/drawing/2015/9/8/chartex" xmlns:cx2="http://schemas.microsoft.com/office/drawing/2015/10/21/chartex" xmlns:cx3="http://schemas.microsoft.com/office/drawing/2016/5/9/chartex" xmlns:cx4="http://schemas.microsoft.com/office/drawing/2016/5/10/chartex" xmlns:cx5="http://schemas.microsoft.com/office/drawing/2016/5/11/chartex" xmlns:cx6="http://schemas.microsoft.com/office/drawing/2016/5/12/chartex" xmlns:cx7="http://schemas.microsoft.com/office/drawing/2016/5/13/chartex" xmlns:cx8="http://schemas.microsoft.com/office/drawing/2016/5/14/chartex" xmlns:mc="http://schemas.openxmlformats.org/markup-compatibility/2006" xmlns:aink="http://schemas.microsoft.com/office/drawing/2016/ink" xmlns:am3d="http://schemas.microsoft.com/office/drawing/2017/model3d" xmlns:o="urn:schemas-microsoft-com:office:office" xmlns:r="http://schemas.openxmlformats.org/officeDocument/2006/relationships" xmlns:m="http://schemas.openxmlformats.org/officeDocument/2006/math" xmlns:v="urn:schemas-microsoft-com:vml" xmlns:wp14="http://schemas.microsoft.com/office/word/2010/wordprocessingDrawing" xmlns:wp="http://schemas.openxmlformats.org/drawingml/2006/wordprocessingDrawing" xmlns:w10="urn:schemas-microsoft-com:office:word" xmlns:w="http://schemas.openxmlformats.org/wordprocessingml/2006/main" xmlns:w14="http://schemas.microsoft.com/office/word/2010/wordml" xmlns:w15="http://schemas.microsoft.com/office/word/2012/wordml" xmlns:w16cex="http://schemas.microsoft.com/office/word/2018/wordml/cex" xmlns:w16cid="http://schemas.microsoft.com/office/word/2016/wordml/cid" xmlns:w16="http://schemas.microsoft.com/office/word/2018/wordml" xmlns:w16sdtdh="http://schemas.microsoft.com/office/word/2020/wordml/sdtdatahash" xmlns:w16se="http://schemas.microsoft.com/office/word/2015/wordml/symex" xmlns:wpg="http://schemas.microsoft.com/office/word/2010/wordprocessingGroup" xmlns:wpi="http://schemas.microsoft.com/office/word/2010/wordprocessingInk" xmlns:wne="http://schemas.microsoft.com/office/word/2006/wordml" xmlns:wps="http://schemas.microsoft.com/office/word/2010/wordprocessingShape" mc:Ignorable="w14 w15 w16se w16cid w16 w16cex w16sdtdh wp14">
   <w:abstractNum w:abstractNumId="0" w15:restartNumberingAfterBreak="0">
     <w:nsid w:val="06B3287D"/>
     <w:multiLevelType w:val="multilevel"/>
@@ -10352,56 +11268,149 @@
       </w:rPr>
     </w:lvl>
   </w:abstractNum>
-  <w:num w:numId="1" w16cid:durableId="2054770730">
+  <w:abstractNum w:abstractNumId="15" w15:restartNumberingAfterBreak="0">
+    <w:nsid w:val="7B1820F6"/>
+    <w:multiLevelType w:val="hybridMultilevel"/>
+    <w:tmpl w:val="3AF2A47C"/>
+    <w:lvl w:ilvl="0" w:tplc="3CD2CCEE">
+      <w:start w:val="1"/>
+      <w:numFmt w:val="decimal"/>
+      <w:lvlText w:val="%1."/>
+      <w:lvlJc w:val="left"/>
+      <w:pPr>
+        <w:ind w:left="720" w:hanging="360"/>
+      </w:pPr>
+      <w:rPr>
+        <w:rFonts w:hint="default"/>
+        <w:sz w:val="22"/>
+      </w:rPr>
+    </w:lvl>
+    <w:lvl w:ilvl="1" w:tplc="04090019">
+      <w:start w:val="1"/>
+      <w:numFmt w:val="lowerLetter"/>
+      <w:lvlText w:val="%2."/>
+      <w:lvlJc w:val="left"/>
+      <w:pPr>
+        <w:ind w:left="1440" w:hanging="360"/>
+      </w:pPr>
+    </w:lvl>
+    <w:lvl w:ilvl="2" w:tplc="0409001B" w:tentative="1">
+      <w:start w:val="1"/>
+      <w:numFmt w:val="lowerRoman"/>
+      <w:lvlText w:val="%3."/>
+      <w:lvlJc w:val="right"/>
+      <w:pPr>
+        <w:ind w:left="2160" w:hanging="180"/>
+      </w:pPr>
+    </w:lvl>
+    <w:lvl w:ilvl="3" w:tplc="0409000F" w:tentative="1">
+      <w:start w:val="1"/>
+      <w:numFmt w:val="decimal"/>
+      <w:lvlText w:val="%4."/>
+      <w:lvlJc w:val="left"/>
+      <w:pPr>
+        <w:ind w:left="2880" w:hanging="360"/>
+      </w:pPr>
+    </w:lvl>
+    <w:lvl w:ilvl="4" w:tplc="04090019" w:tentative="1">
+      <w:start w:val="1"/>
+      <w:numFmt w:val="lowerLetter"/>
+      <w:lvlText w:val="%5."/>
+      <w:lvlJc w:val="left"/>
+      <w:pPr>
+        <w:ind w:left="3600" w:hanging="360"/>
+      </w:pPr>
+    </w:lvl>
+    <w:lvl w:ilvl="5" w:tplc="0409001B" w:tentative="1">
+      <w:start w:val="1"/>
+      <w:numFmt w:val="lowerRoman"/>
+      <w:lvlText w:val="%6."/>
+      <w:lvlJc w:val="right"/>
+      <w:pPr>
+        <w:ind w:left="4320" w:hanging="180"/>
+      </w:pPr>
+    </w:lvl>
+    <w:lvl w:ilvl="6" w:tplc="0409000F" w:tentative="1">
+      <w:start w:val="1"/>
+      <w:numFmt w:val="decimal"/>
+      <w:lvlText w:val="%7."/>
+      <w:lvlJc w:val="left"/>
+      <w:pPr>
+        <w:ind w:left="5040" w:hanging="360"/>
+      </w:pPr>
+    </w:lvl>
+    <w:lvl w:ilvl="7" w:tplc="04090019" w:tentative="1">
+      <w:start w:val="1"/>
+      <w:numFmt w:val="lowerLetter"/>
+      <w:lvlText w:val="%8."/>
+      <w:lvlJc w:val="left"/>
+      <w:pPr>
+        <w:ind w:left="5760" w:hanging="360"/>
+      </w:pPr>
+    </w:lvl>
+    <w:lvl w:ilvl="8" w:tplc="0409001B" w:tentative="1">
+      <w:start w:val="1"/>
+      <w:numFmt w:val="lowerRoman"/>
+      <w:lvlText w:val="%9."/>
+      <w:lvlJc w:val="right"/>
+      <w:pPr>
+        <w:ind w:left="6480" w:hanging="180"/>
+      </w:pPr>
+    </w:lvl>
+  </w:abstractNum>
+  <w:num w:numId="1">
     <w:abstractNumId w:val="8"/>
   </w:num>
-  <w:num w:numId="2" w16cid:durableId="1794514996">
+  <w:num w:numId="2">
     <w:abstractNumId w:val="13"/>
   </w:num>
-  <w:num w:numId="3" w16cid:durableId="1475367550">
+  <w:num w:numId="3">
     <w:abstractNumId w:val="12"/>
   </w:num>
-  <w:num w:numId="4" w16cid:durableId="1394354414">
+  <w:num w:numId="4">
     <w:abstractNumId w:val="6"/>
   </w:num>
-  <w:num w:numId="5" w16cid:durableId="841508585">
+  <w:num w:numId="5">
     <w:abstractNumId w:val="2"/>
   </w:num>
-  <w:num w:numId="6" w16cid:durableId="1435706905">
+  <w:num w:numId="6">
     <w:abstractNumId w:val="11"/>
   </w:num>
-  <w:num w:numId="7" w16cid:durableId="1757048947">
+  <w:num w:numId="7">
     <w:abstractNumId w:val="0"/>
   </w:num>
-  <w:num w:numId="8" w16cid:durableId="242569008">
+  <w:num w:numId="8">
     <w:abstractNumId w:val="9"/>
   </w:num>
-  <w:num w:numId="9" w16cid:durableId="1890216468">
+  <w:num w:numId="9">
     <w:abstractNumId w:val="7"/>
   </w:num>
-  <w:num w:numId="10" w16cid:durableId="1980107996">
+  <w:num w:numId="10">
     <w:abstractNumId w:val="10"/>
   </w:num>
-  <w:num w:numId="11" w16cid:durableId="1574579350">
+  <w:num w:numId="11">
     <w:abstractNumId w:val="4"/>
   </w:num>
-  <w:num w:numId="12" w16cid:durableId="1362824560">
+  <w:num w:numId="12">
     <w:abstractNumId w:val="5"/>
   </w:num>
-  <w:num w:numId="13" w16cid:durableId="992565414">
+  <w:num w:numId="13">
     <w:abstractNumId w:val="3"/>
   </w:num>
-  <w:num w:numId="14" w16cid:durableId="838424703">
+  <w:num w:numId="14">
     <w:abstractNumId w:val="1"/>
   </w:num>
-  <w:num w:numId="15" w16cid:durableId="1944727174">
+  <w:num w:numId="15">
     <w:abstractNumId w:val="14"/>
+  </w:num>
+  <w:num w:numId="16">
+    <w:abstractNumId w:val="15"/>
   </w:num>
 </w:numbering>
 </file>
 
 <file path=word/styles.xml><?xml version="1.0" encoding="utf-8"?>
-<w:styles xmlns:mc="http://schemas.openxmlformats.org/markup-compatibility/2006" xmlns:r="http://schemas.openxmlformats.org/officeDocument/2006/relationships" xmlns:w="http://schemas.openxmlformats.org/wordprocessingml/2006/main" xmlns:w14="http://schemas.microsoft.com/office/word/2010/wordml" xmlns:w15="http://schemas.microsoft.com/office/word/2012/wordml" xmlns:w16cex="http://schemas.microsoft.com/office/word/2018/wordml/cex" xmlns:w16cid="http://schemas.microsoft.com/office/word/2016/wordml/cid" xmlns:w16="http://schemas.microsoft.com/office/word/2018/wordml" xmlns:w16du="http://schemas.microsoft.com/office/word/2023/wordml/word16du" xmlns:w16sdtdh="http://schemas.microsoft.com/office/word/2020/wordml/sdtdatahash" xmlns:w16sdtfl="http://schemas.microsoft.com/office/word/2024/wordml/sdtformatlock" xmlns:w16se="http://schemas.microsoft.com/office/word/2015/wordml/symex" mc:Ignorable="w14 w15 w16se w16cid w16 w16cex w16sdtdh w16sdtfl w16du">
+<w:styles xmlns:mc="http://schemas.openxmlformats.org/markup-compatibility/2006" xmlns:r="http://schemas.openxmlformats.org/officeDocument/2006/relationships" xmlns:w="http://schemas.openxmlformats.org/wordprocessingml/2006/main" xmlns:w14="http://schemas.microsoft.com/office/word/2010/wordml" xmlns:w15="http://schemas.microsoft.com/office/word/2012/wordml" xmlns:w16cex="http://schemas.microsoft.com/office/word/2018/wordml/cex" xmlns:w16cid="http://schemas.microsoft.com/office/word/2016/wordml/cid" xmlns:w16="http://schemas.microsoft.com/office/word/2018/wordml" xmlns:w16sdtdh="http://schemas.microsoft.com/office/word/2020/wordml/sdtdatahash" xmlns:w16se="http://schemas.microsoft.com/office/word/2015/wordml/symex" mc:Ignorable="w14 w15 w16se w16cid w16 w16cex w16sdtdh">
   <w:docDefaults>
     <w:rPrDefault>
       <w:rPr>
@@ -10894,6 +11903,7 @@
   <w:style w:type="character" w:default="1" w:styleId="Fuentedeprrafopredeter">
     <w:name w:val="Default Paragraph Font"/>
     <w:uiPriority w:val="1"/>
+    <w:semiHidden/>
     <w:unhideWhenUsed/>
   </w:style>
   <w:style w:type="table" w:default="1" w:styleId="Tablanormal">

</xml_diff>